<commit_message>
Update master to output generated at c8c62b6
</commit_message>
<xml_diff>
--- a/adc_sbb_within_100.docx
+++ b/adc_sbb_within_100.docx
@@ -11,7 +11,7 @@
           <w:rFonts w:ascii="Arial" w:hAnsi="Arial"/>
           <w:sz w:val="30"/>
         </w:rPr>
-        <w:t>2026-03-01 Sunday</w:t>
+        <w:t>2026-03-02 Monday</w:t>
       </w:r>
     </w:p>
     <w:tbl>
@@ -40,7 +40,7 @@
                 <w:rFonts w:ascii="TimeNewRoman" w:hAnsi="TimeNewRoman"/>
                 <w:sz w:val="30"/>
               </w:rPr>
-              <w:t>7+19=</w:t>
+              <w:t>80-34=</w:t>
             </w:r>
           </w:p>
         </w:tc>
@@ -57,7 +57,7 @@
                 <w:rFonts w:ascii="TimeNewRoman" w:hAnsi="TimeNewRoman"/>
                 <w:sz w:val="30"/>
               </w:rPr>
-              <w:t>47-39=</w:t>
+              <w:t>92-14=</w:t>
             </w:r>
           </w:p>
         </w:tc>
@@ -74,7 +74,7 @@
                 <w:rFonts w:ascii="TimeNewRoman" w:hAnsi="TimeNewRoman"/>
                 <w:sz w:val="30"/>
               </w:rPr>
-              <w:t>57-29=</w:t>
+              <w:t>19+26=</w:t>
             </w:r>
           </w:p>
         </w:tc>
@@ -91,7 +91,1138 @@
                 <w:rFonts w:ascii="TimeNewRoman" w:hAnsi="TimeNewRoman"/>
                 <w:sz w:val="30"/>
               </w:rPr>
-              <w:t>96-8=</w:t>
+              <w:t>8+5=</w:t>
+            </w:r>
+          </w:p>
+        </w:tc>
+        <w:tc>
+          <w:tcPr>
+            <w:tcW w:type="dxa" w:w="1987"/>
+          </w:tcPr>
+          <w:p>
+            <w:pPr>
+              <w:jc w:val="left"/>
+            </w:pPr>
+            <w:r>
+              <w:rPr>
+                <w:rFonts w:ascii="TimeNewRoman" w:hAnsi="TimeNewRoman"/>
+                <w:sz w:val="30"/>
+              </w:rPr>
+              <w:t>39+52=</w:t>
+            </w:r>
+          </w:p>
+        </w:tc>
+      </w:tr>
+      <w:tr>
+        <w:tc>
+          <w:tcPr>
+            <w:tcW w:type="dxa" w:w="1987"/>
+          </w:tcPr>
+          <w:p>
+            <w:pPr>
+              <w:jc w:val="left"/>
+            </w:pPr>
+            <w:r>
+              <w:rPr>
+                <w:rFonts w:ascii="TimeNewRoman" w:hAnsi="TimeNewRoman"/>
+                <w:sz w:val="30"/>
+              </w:rPr>
+              <w:t>58+5=</w:t>
+            </w:r>
+          </w:p>
+        </w:tc>
+        <w:tc>
+          <w:tcPr>
+            <w:tcW w:type="dxa" w:w="1987"/>
+          </w:tcPr>
+          <w:p>
+            <w:pPr>
+              <w:jc w:val="left"/>
+            </w:pPr>
+            <w:r>
+              <w:rPr>
+                <w:rFonts w:ascii="TimeNewRoman" w:hAnsi="TimeNewRoman"/>
+                <w:sz w:val="30"/>
+              </w:rPr>
+              <w:t>56-49=</w:t>
+            </w:r>
+          </w:p>
+        </w:tc>
+        <w:tc>
+          <w:tcPr>
+            <w:tcW w:type="dxa" w:w="1987"/>
+          </w:tcPr>
+          <w:p>
+            <w:pPr>
+              <w:jc w:val="left"/>
+            </w:pPr>
+            <w:r>
+              <w:rPr>
+                <w:rFonts w:ascii="TimeNewRoman" w:hAnsi="TimeNewRoman"/>
+                <w:sz w:val="30"/>
+              </w:rPr>
+              <w:t>73-14=</w:t>
+            </w:r>
+          </w:p>
+        </w:tc>
+        <w:tc>
+          <w:tcPr>
+            <w:tcW w:type="dxa" w:w="1987"/>
+          </w:tcPr>
+          <w:p>
+            <w:pPr>
+              <w:jc w:val="left"/>
+            </w:pPr>
+            <w:r>
+              <w:rPr>
+                <w:rFonts w:ascii="TimeNewRoman" w:hAnsi="TimeNewRoman"/>
+                <w:sz w:val="30"/>
+              </w:rPr>
+              <w:t>53-39=</w:t>
+            </w:r>
+          </w:p>
+        </w:tc>
+        <w:tc>
+          <w:tcPr>
+            <w:tcW w:type="dxa" w:w="1987"/>
+          </w:tcPr>
+          <w:p>
+            <w:pPr>
+              <w:jc w:val="left"/>
+            </w:pPr>
+            <w:r>
+              <w:rPr>
+                <w:rFonts w:ascii="TimeNewRoman" w:hAnsi="TimeNewRoman"/>
+                <w:sz w:val="30"/>
+              </w:rPr>
+              <w:t>95-56=</w:t>
+            </w:r>
+          </w:p>
+        </w:tc>
+      </w:tr>
+      <w:tr>
+        <w:tc>
+          <w:tcPr>
+            <w:tcW w:type="dxa" w:w="1987"/>
+          </w:tcPr>
+          <w:p>
+            <w:pPr>
+              <w:jc w:val="left"/>
+            </w:pPr>
+            <w:r>
+              <w:rPr>
+                <w:rFonts w:ascii="TimeNewRoman" w:hAnsi="TimeNewRoman"/>
+                <w:sz w:val="30"/>
+              </w:rPr>
+              <w:t>6+38=</w:t>
+            </w:r>
+          </w:p>
+        </w:tc>
+        <w:tc>
+          <w:tcPr>
+            <w:tcW w:type="dxa" w:w="1987"/>
+          </w:tcPr>
+          <w:p>
+            <w:pPr>
+              <w:jc w:val="left"/>
+            </w:pPr>
+            <w:r>
+              <w:rPr>
+                <w:rFonts w:ascii="TimeNewRoman" w:hAnsi="TimeNewRoman"/>
+                <w:sz w:val="30"/>
+              </w:rPr>
+              <w:t>84-7=</w:t>
+            </w:r>
+          </w:p>
+        </w:tc>
+        <w:tc>
+          <w:tcPr>
+            <w:tcW w:type="dxa" w:w="1987"/>
+          </w:tcPr>
+          <w:p>
+            <w:pPr>
+              <w:jc w:val="left"/>
+            </w:pPr>
+            <w:r>
+              <w:rPr>
+                <w:rFonts w:ascii="TimeNewRoman" w:hAnsi="TimeNewRoman"/>
+                <w:sz w:val="30"/>
+              </w:rPr>
+              <w:t>45+9=</w:t>
+            </w:r>
+          </w:p>
+        </w:tc>
+        <w:tc>
+          <w:tcPr>
+            <w:tcW w:type="dxa" w:w="1987"/>
+          </w:tcPr>
+          <w:p>
+            <w:pPr>
+              <w:jc w:val="left"/>
+            </w:pPr>
+            <w:r>
+              <w:rPr>
+                <w:rFonts w:ascii="TimeNewRoman" w:hAnsi="TimeNewRoman"/>
+                <w:sz w:val="30"/>
+              </w:rPr>
+              <w:t>82-6=</w:t>
+            </w:r>
+          </w:p>
+        </w:tc>
+        <w:tc>
+          <w:tcPr>
+            <w:tcW w:type="dxa" w:w="1987"/>
+          </w:tcPr>
+          <w:p>
+            <w:pPr>
+              <w:jc w:val="left"/>
+            </w:pPr>
+            <w:r>
+              <w:rPr>
+                <w:rFonts w:ascii="TimeNewRoman" w:hAnsi="TimeNewRoman"/>
+                <w:sz w:val="30"/>
+              </w:rPr>
+              <w:t>15+58=</w:t>
+            </w:r>
+          </w:p>
+        </w:tc>
+      </w:tr>
+      <w:tr>
+        <w:tc>
+          <w:tcPr>
+            <w:tcW w:type="dxa" w:w="1987"/>
+          </w:tcPr>
+          <w:p>
+            <w:pPr>
+              <w:jc w:val="left"/>
+            </w:pPr>
+            <w:r>
+              <w:rPr>
+                <w:rFonts w:ascii="TimeNewRoman" w:hAnsi="TimeNewRoman"/>
+                <w:sz w:val="30"/>
+              </w:rPr>
+              <w:t>85-77=</w:t>
+            </w:r>
+          </w:p>
+        </w:tc>
+        <w:tc>
+          <w:tcPr>
+            <w:tcW w:type="dxa" w:w="1987"/>
+          </w:tcPr>
+          <w:p>
+            <w:pPr>
+              <w:jc w:val="left"/>
+            </w:pPr>
+            <w:r>
+              <w:rPr>
+                <w:rFonts w:ascii="TimeNewRoman" w:hAnsi="TimeNewRoman"/>
+                <w:sz w:val="30"/>
+              </w:rPr>
+              <w:t>40-12=</w:t>
+            </w:r>
+          </w:p>
+        </w:tc>
+        <w:tc>
+          <w:tcPr>
+            <w:tcW w:type="dxa" w:w="1987"/>
+          </w:tcPr>
+          <w:p>
+            <w:pPr>
+              <w:jc w:val="left"/>
+            </w:pPr>
+            <w:r>
+              <w:rPr>
+                <w:rFonts w:ascii="TimeNewRoman" w:hAnsi="TimeNewRoman"/>
+                <w:sz w:val="30"/>
+              </w:rPr>
+              <w:t>38+24=</w:t>
+            </w:r>
+          </w:p>
+        </w:tc>
+        <w:tc>
+          <w:tcPr>
+            <w:tcW w:type="dxa" w:w="1987"/>
+          </w:tcPr>
+          <w:p>
+            <w:pPr>
+              <w:jc w:val="left"/>
+            </w:pPr>
+            <w:r>
+              <w:rPr>
+                <w:rFonts w:ascii="TimeNewRoman" w:hAnsi="TimeNewRoman"/>
+                <w:sz w:val="30"/>
+              </w:rPr>
+              <w:t>51-9=</w:t>
+            </w:r>
+          </w:p>
+        </w:tc>
+        <w:tc>
+          <w:tcPr>
+            <w:tcW w:type="dxa" w:w="1987"/>
+          </w:tcPr>
+          <w:p>
+            <w:pPr>
+              <w:jc w:val="left"/>
+            </w:pPr>
+            <w:r>
+              <w:rPr>
+                <w:rFonts w:ascii="TimeNewRoman" w:hAnsi="TimeNewRoman"/>
+                <w:sz w:val="30"/>
+              </w:rPr>
+              <w:t>28+26=</w:t>
+            </w:r>
+          </w:p>
+        </w:tc>
+      </w:tr>
+      <w:tr>
+        <w:tc>
+          <w:tcPr>
+            <w:tcW w:type="dxa" w:w="1987"/>
+          </w:tcPr>
+          <w:p>
+            <w:pPr>
+              <w:jc w:val="left"/>
+            </w:pPr>
+            <w:r>
+              <w:rPr>
+                <w:rFonts w:ascii="TimeNewRoman" w:hAnsi="TimeNewRoman"/>
+                <w:sz w:val="30"/>
+              </w:rPr>
+              <w:t>64-48=</w:t>
+            </w:r>
+          </w:p>
+        </w:tc>
+        <w:tc>
+          <w:tcPr>
+            <w:tcW w:type="dxa" w:w="1987"/>
+          </w:tcPr>
+          <w:p>
+            <w:pPr>
+              <w:jc w:val="left"/>
+            </w:pPr>
+            <w:r>
+              <w:rPr>
+                <w:rFonts w:ascii="TimeNewRoman" w:hAnsi="TimeNewRoman"/>
+                <w:sz w:val="30"/>
+              </w:rPr>
+              <w:t>15+76=</w:t>
+            </w:r>
+          </w:p>
+        </w:tc>
+        <w:tc>
+          <w:tcPr>
+            <w:tcW w:type="dxa" w:w="1987"/>
+          </w:tcPr>
+          <w:p>
+            <w:pPr>
+              <w:jc w:val="left"/>
+            </w:pPr>
+            <w:r>
+              <w:rPr>
+                <w:rFonts w:ascii="TimeNewRoman" w:hAnsi="TimeNewRoman"/>
+                <w:sz w:val="30"/>
+              </w:rPr>
+              <w:t>29+29=</w:t>
+            </w:r>
+          </w:p>
+        </w:tc>
+        <w:tc>
+          <w:tcPr>
+            <w:tcW w:type="dxa" w:w="1987"/>
+          </w:tcPr>
+          <w:p>
+            <w:pPr>
+              <w:jc w:val="left"/>
+            </w:pPr>
+            <w:r>
+              <w:rPr>
+                <w:rFonts w:ascii="TimeNewRoman" w:hAnsi="TimeNewRoman"/>
+                <w:sz w:val="30"/>
+              </w:rPr>
+              <w:t>55+19=</w:t>
+            </w:r>
+          </w:p>
+        </w:tc>
+        <w:tc>
+          <w:tcPr>
+            <w:tcW w:type="dxa" w:w="1987"/>
+          </w:tcPr>
+          <w:p>
+            <w:pPr>
+              <w:jc w:val="left"/>
+            </w:pPr>
+            <w:r>
+              <w:rPr>
+                <w:rFonts w:ascii="TimeNewRoman" w:hAnsi="TimeNewRoman"/>
+                <w:sz w:val="30"/>
+              </w:rPr>
+              <w:t>77-38=</w:t>
+            </w:r>
+          </w:p>
+        </w:tc>
+      </w:tr>
+      <w:tr>
+        <w:tc>
+          <w:tcPr>
+            <w:tcW w:type="dxa" w:w="1987"/>
+          </w:tcPr>
+          <w:p>
+            <w:pPr>
+              <w:jc w:val="left"/>
+            </w:pPr>
+            <w:r>
+              <w:rPr>
+                <w:rFonts w:ascii="TimeNewRoman" w:hAnsi="TimeNewRoman"/>
+                <w:sz w:val="30"/>
+              </w:rPr>
+              <w:t>14+39=</w:t>
+            </w:r>
+          </w:p>
+        </w:tc>
+        <w:tc>
+          <w:tcPr>
+            <w:tcW w:type="dxa" w:w="1987"/>
+          </w:tcPr>
+          <w:p>
+            <w:pPr>
+              <w:jc w:val="left"/>
+            </w:pPr>
+            <w:r>
+              <w:rPr>
+                <w:rFonts w:ascii="TimeNewRoman" w:hAnsi="TimeNewRoman"/>
+                <w:sz w:val="30"/>
+              </w:rPr>
+              <w:t>61-7=</w:t>
+            </w:r>
+          </w:p>
+        </w:tc>
+        <w:tc>
+          <w:tcPr>
+            <w:tcW w:type="dxa" w:w="1987"/>
+          </w:tcPr>
+          <w:p>
+            <w:pPr>
+              <w:jc w:val="left"/>
+            </w:pPr>
+            <w:r>
+              <w:rPr>
+                <w:rFonts w:ascii="TimeNewRoman" w:hAnsi="TimeNewRoman"/>
+                <w:sz w:val="30"/>
+              </w:rPr>
+              <w:t>73-34=</w:t>
+            </w:r>
+          </w:p>
+        </w:tc>
+        <w:tc>
+          <w:tcPr>
+            <w:tcW w:type="dxa" w:w="1987"/>
+          </w:tcPr>
+          <w:p>
+            <w:pPr>
+              <w:jc w:val="left"/>
+            </w:pPr>
+            <w:r>
+              <w:rPr>
+                <w:rFonts w:ascii="TimeNewRoman" w:hAnsi="TimeNewRoman"/>
+                <w:sz w:val="30"/>
+              </w:rPr>
+              <w:t>8+43=</w:t>
+            </w:r>
+          </w:p>
+        </w:tc>
+        <w:tc>
+          <w:tcPr>
+            <w:tcW w:type="dxa" w:w="1987"/>
+          </w:tcPr>
+          <w:p>
+            <w:pPr>
+              <w:jc w:val="left"/>
+            </w:pPr>
+            <w:r>
+              <w:rPr>
+                <w:rFonts w:ascii="TimeNewRoman" w:hAnsi="TimeNewRoman"/>
+                <w:sz w:val="30"/>
+              </w:rPr>
+              <w:t>29+63=</w:t>
+            </w:r>
+          </w:p>
+        </w:tc>
+      </w:tr>
+      <w:tr>
+        <w:tc>
+          <w:tcPr>
+            <w:tcW w:type="dxa" w:w="1987"/>
+          </w:tcPr>
+          <w:p>
+            <w:pPr>
+              <w:jc w:val="left"/>
+            </w:pPr>
+            <w:r>
+              <w:rPr>
+                <w:rFonts w:ascii="TimeNewRoman" w:hAnsi="TimeNewRoman"/>
+                <w:sz w:val="30"/>
+              </w:rPr>
+              <w:t>5+56=</w:t>
+            </w:r>
+          </w:p>
+        </w:tc>
+        <w:tc>
+          <w:tcPr>
+            <w:tcW w:type="dxa" w:w="1987"/>
+          </w:tcPr>
+          <w:p>
+            <w:pPr>
+              <w:jc w:val="left"/>
+            </w:pPr>
+            <w:r>
+              <w:rPr>
+                <w:rFonts w:ascii="TimeNewRoman" w:hAnsi="TimeNewRoman"/>
+                <w:sz w:val="30"/>
+              </w:rPr>
+              <w:t>28+17=</w:t>
+            </w:r>
+          </w:p>
+        </w:tc>
+        <w:tc>
+          <w:tcPr>
+            <w:tcW w:type="dxa" w:w="1987"/>
+          </w:tcPr>
+          <w:p>
+            <w:pPr>
+              <w:jc w:val="left"/>
+            </w:pPr>
+            <w:r>
+              <w:rPr>
+                <w:rFonts w:ascii="TimeNewRoman" w:hAnsi="TimeNewRoman"/>
+                <w:sz w:val="30"/>
+              </w:rPr>
+              <w:t>24+29=</w:t>
+            </w:r>
+          </w:p>
+        </w:tc>
+        <w:tc>
+          <w:tcPr>
+            <w:tcW w:type="dxa" w:w="1987"/>
+          </w:tcPr>
+          <w:p>
+            <w:pPr>
+              <w:jc w:val="left"/>
+            </w:pPr>
+            <w:r>
+              <w:rPr>
+                <w:rFonts w:ascii="TimeNewRoman" w:hAnsi="TimeNewRoman"/>
+                <w:sz w:val="30"/>
+              </w:rPr>
+              <w:t>60-1=</w:t>
+            </w:r>
+          </w:p>
+        </w:tc>
+        <w:tc>
+          <w:tcPr>
+            <w:tcW w:type="dxa" w:w="1987"/>
+          </w:tcPr>
+          <w:p>
+            <w:pPr>
+              <w:jc w:val="left"/>
+            </w:pPr>
+            <w:r>
+              <w:rPr>
+                <w:rFonts w:ascii="TimeNewRoman" w:hAnsi="TimeNewRoman"/>
+                <w:sz w:val="30"/>
+              </w:rPr>
+              <w:t>16+18=</w:t>
+            </w:r>
+          </w:p>
+        </w:tc>
+      </w:tr>
+      <w:tr>
+        <w:tc>
+          <w:tcPr>
+            <w:tcW w:type="dxa" w:w="1987"/>
+          </w:tcPr>
+          <w:p>
+            <w:pPr>
+              <w:jc w:val="left"/>
+            </w:pPr>
+            <w:r>
+              <w:rPr>
+                <w:rFonts w:ascii="TimeNewRoman" w:hAnsi="TimeNewRoman"/>
+                <w:sz w:val="30"/>
+              </w:rPr>
+              <w:t>60-25=</w:t>
+            </w:r>
+          </w:p>
+        </w:tc>
+        <w:tc>
+          <w:tcPr>
+            <w:tcW w:type="dxa" w:w="1987"/>
+          </w:tcPr>
+          <w:p>
+            <w:pPr>
+              <w:jc w:val="left"/>
+            </w:pPr>
+            <w:r>
+              <w:rPr>
+                <w:rFonts w:ascii="TimeNewRoman" w:hAnsi="TimeNewRoman"/>
+                <w:sz w:val="30"/>
+              </w:rPr>
+              <w:t>5+38=</w:t>
+            </w:r>
+          </w:p>
+        </w:tc>
+        <w:tc>
+          <w:tcPr>
+            <w:tcW w:type="dxa" w:w="1987"/>
+          </w:tcPr>
+          <w:p>
+            <w:pPr>
+              <w:jc w:val="left"/>
+            </w:pPr>
+            <w:r>
+              <w:rPr>
+                <w:rFonts w:ascii="TimeNewRoman" w:hAnsi="TimeNewRoman"/>
+                <w:sz w:val="30"/>
+              </w:rPr>
+              <w:t>45-19=</w:t>
+            </w:r>
+          </w:p>
+        </w:tc>
+        <w:tc>
+          <w:tcPr>
+            <w:tcW w:type="dxa" w:w="1987"/>
+          </w:tcPr>
+          <w:p>
+            <w:pPr>
+              <w:jc w:val="left"/>
+            </w:pPr>
+            <w:r>
+              <w:rPr>
+                <w:rFonts w:ascii="TimeNewRoman" w:hAnsi="TimeNewRoman"/>
+                <w:sz w:val="30"/>
+              </w:rPr>
+              <w:t>44+17=</w:t>
+            </w:r>
+          </w:p>
+        </w:tc>
+        <w:tc>
+          <w:tcPr>
+            <w:tcW w:type="dxa" w:w="1987"/>
+          </w:tcPr>
+          <w:p>
+            <w:pPr>
+              <w:jc w:val="left"/>
+            </w:pPr>
+            <w:r>
+              <w:rPr>
+                <w:rFonts w:ascii="TimeNewRoman" w:hAnsi="TimeNewRoman"/>
+                <w:sz w:val="30"/>
+              </w:rPr>
+              <w:t>61-18=</w:t>
+            </w:r>
+          </w:p>
+        </w:tc>
+      </w:tr>
+      <w:tr>
+        <w:tc>
+          <w:tcPr>
+            <w:tcW w:type="dxa" w:w="1987"/>
+          </w:tcPr>
+          <w:p>
+            <w:pPr>
+              <w:jc w:val="left"/>
+            </w:pPr>
+            <w:r>
+              <w:rPr>
+                <w:rFonts w:ascii="TimeNewRoman" w:hAnsi="TimeNewRoman"/>
+                <w:sz w:val="30"/>
+              </w:rPr>
+              <w:t>74-59=</w:t>
+            </w:r>
+          </w:p>
+        </w:tc>
+        <w:tc>
+          <w:tcPr>
+            <w:tcW w:type="dxa" w:w="1987"/>
+          </w:tcPr>
+          <w:p>
+            <w:pPr>
+              <w:jc w:val="left"/>
+            </w:pPr>
+            <w:r>
+              <w:rPr>
+                <w:rFonts w:ascii="TimeNewRoman" w:hAnsi="TimeNewRoman"/>
+                <w:sz w:val="30"/>
+              </w:rPr>
+              <w:t>53+28=</w:t>
+            </w:r>
+          </w:p>
+        </w:tc>
+        <w:tc>
+          <w:tcPr>
+            <w:tcW w:type="dxa" w:w="1987"/>
+          </w:tcPr>
+          <w:p>
+            <w:pPr>
+              <w:jc w:val="left"/>
+            </w:pPr>
+            <w:r>
+              <w:rPr>
+                <w:rFonts w:ascii="TimeNewRoman" w:hAnsi="TimeNewRoman"/>
+                <w:sz w:val="30"/>
+              </w:rPr>
+              <w:t>23-15=</w:t>
+            </w:r>
+          </w:p>
+        </w:tc>
+        <w:tc>
+          <w:tcPr>
+            <w:tcW w:type="dxa" w:w="1987"/>
+          </w:tcPr>
+          <w:p>
+            <w:pPr>
+              <w:jc w:val="left"/>
+            </w:pPr>
+            <w:r>
+              <w:rPr>
+                <w:rFonts w:ascii="TimeNewRoman" w:hAnsi="TimeNewRoman"/>
+                <w:sz w:val="30"/>
+              </w:rPr>
+              <w:t>81-28=</w:t>
+            </w:r>
+          </w:p>
+        </w:tc>
+        <w:tc>
+          <w:tcPr>
+            <w:tcW w:type="dxa" w:w="1987"/>
+          </w:tcPr>
+          <w:p>
+            <w:pPr>
+              <w:jc w:val="left"/>
+            </w:pPr>
+            <w:r>
+              <w:rPr>
+                <w:rFonts w:ascii="TimeNewRoman" w:hAnsi="TimeNewRoman"/>
+                <w:sz w:val="30"/>
+              </w:rPr>
+              <w:t>64+19=</w:t>
+            </w:r>
+          </w:p>
+        </w:tc>
+      </w:tr>
+      <w:tr>
+        <w:tc>
+          <w:tcPr>
+            <w:tcW w:type="dxa" w:w="1987"/>
+          </w:tcPr>
+          <w:p>
+            <w:pPr>
+              <w:jc w:val="left"/>
+            </w:pPr>
+            <w:r>
+              <w:rPr>
+                <w:rFonts w:ascii="TimeNewRoman" w:hAnsi="TimeNewRoman"/>
+                <w:sz w:val="30"/>
+              </w:rPr>
+              <w:t>34-15=</w:t>
+            </w:r>
+          </w:p>
+        </w:tc>
+        <w:tc>
+          <w:tcPr>
+            <w:tcW w:type="dxa" w:w="1987"/>
+          </w:tcPr>
+          <w:p>
+            <w:pPr>
+              <w:jc w:val="left"/>
+            </w:pPr>
+            <w:r>
+              <w:rPr>
+                <w:rFonts w:ascii="TimeNewRoman" w:hAnsi="TimeNewRoman"/>
+                <w:sz w:val="30"/>
+              </w:rPr>
+              <w:t>37+38=</w:t>
+            </w:r>
+          </w:p>
+        </w:tc>
+        <w:tc>
+          <w:tcPr>
+            <w:tcW w:type="dxa" w:w="1987"/>
+          </w:tcPr>
+          <w:p>
+            <w:pPr>
+              <w:jc w:val="left"/>
+            </w:pPr>
+            <w:r>
+              <w:rPr>
+                <w:rFonts w:ascii="TimeNewRoman" w:hAnsi="TimeNewRoman"/>
+                <w:sz w:val="30"/>
+              </w:rPr>
+              <w:t>22+59=</w:t>
+            </w:r>
+          </w:p>
+        </w:tc>
+        <w:tc>
+          <w:tcPr>
+            <w:tcW w:type="dxa" w:w="1987"/>
+          </w:tcPr>
+          <w:p>
+            <w:pPr>
+              <w:jc w:val="left"/>
+            </w:pPr>
+            <w:r>
+              <w:rPr>
+                <w:rFonts w:ascii="TimeNewRoman" w:hAnsi="TimeNewRoman"/>
+                <w:sz w:val="30"/>
+              </w:rPr>
+              <w:t>39+46=</w:t>
+            </w:r>
+          </w:p>
+        </w:tc>
+        <w:tc>
+          <w:tcPr>
+            <w:tcW w:type="dxa" w:w="1987"/>
+          </w:tcPr>
+          <w:p>
+            <w:pPr>
+              <w:jc w:val="left"/>
+            </w:pPr>
+            <w:r>
+              <w:rPr>
+                <w:rFonts w:ascii="TimeNewRoman" w:hAnsi="TimeNewRoman"/>
+                <w:sz w:val="30"/>
+              </w:rPr>
+              <w:t>75-39=</w:t>
+            </w:r>
+          </w:p>
+        </w:tc>
+      </w:tr>
+      <w:tr>
+        <w:tc>
+          <w:tcPr>
+            <w:tcW w:type="dxa" w:w="1987"/>
+          </w:tcPr>
+          <w:p>
+            <w:pPr>
+              <w:jc w:val="left"/>
+            </w:pPr>
+            <w:r>
+              <w:rPr>
+                <w:rFonts w:ascii="TimeNewRoman" w:hAnsi="TimeNewRoman"/>
+                <w:sz w:val="30"/>
+              </w:rPr>
+              <w:t>29+52=</w:t>
+            </w:r>
+          </w:p>
+        </w:tc>
+        <w:tc>
+          <w:tcPr>
+            <w:tcW w:type="dxa" w:w="1987"/>
+          </w:tcPr>
+          <w:p>
+            <w:pPr>
+              <w:jc w:val="left"/>
+            </w:pPr>
+            <w:r>
+              <w:rPr>
+                <w:rFonts w:ascii="TimeNewRoman" w:hAnsi="TimeNewRoman"/>
+                <w:sz w:val="30"/>
+              </w:rPr>
+              <w:t>17+26=</w:t>
+            </w:r>
+          </w:p>
+        </w:tc>
+        <w:tc>
+          <w:tcPr>
+            <w:tcW w:type="dxa" w:w="1987"/>
+          </w:tcPr>
+          <w:p>
+            <w:pPr>
+              <w:jc w:val="left"/>
+            </w:pPr>
+            <w:r>
+              <w:rPr>
+                <w:rFonts w:ascii="TimeNewRoman" w:hAnsi="TimeNewRoman"/>
+                <w:sz w:val="30"/>
+              </w:rPr>
+              <w:t>50-37=</w:t>
+            </w:r>
+          </w:p>
+        </w:tc>
+        <w:tc>
+          <w:tcPr>
+            <w:tcW w:type="dxa" w:w="1987"/>
+          </w:tcPr>
+          <w:p>
+            <w:pPr>
+              <w:jc w:val="left"/>
+            </w:pPr>
+            <w:r>
+              <w:rPr>
+                <w:rFonts w:ascii="TimeNewRoman" w:hAnsi="TimeNewRoman"/>
+                <w:sz w:val="30"/>
+              </w:rPr>
+              <w:t>14+49=</w:t>
+            </w:r>
+          </w:p>
+        </w:tc>
+        <w:tc>
+          <w:tcPr>
+            <w:tcW w:type="dxa" w:w="1987"/>
+          </w:tcPr>
+          <w:p>
+            <w:pPr>
+              <w:jc w:val="left"/>
+            </w:pPr>
+            <w:r>
+              <w:rPr>
+                <w:rFonts w:ascii="TimeNewRoman" w:hAnsi="TimeNewRoman"/>
+                <w:sz w:val="30"/>
+              </w:rPr>
+              <w:t>19+53=</w:t>
+            </w:r>
+          </w:p>
+        </w:tc>
+      </w:tr>
+      <w:tr>
+        <w:tc>
+          <w:tcPr>
+            <w:tcW w:type="dxa" w:w="1987"/>
+          </w:tcPr>
+          <w:p>
+            <w:pPr>
+              <w:jc w:val="left"/>
+            </w:pPr>
+            <w:r>
+              <w:rPr>
+                <w:rFonts w:ascii="TimeNewRoman" w:hAnsi="TimeNewRoman"/>
+                <w:sz w:val="30"/>
+              </w:rPr>
+              <w:t>45+7=</w:t>
+            </w:r>
+          </w:p>
+        </w:tc>
+        <w:tc>
+          <w:tcPr>
+            <w:tcW w:type="dxa" w:w="1987"/>
+          </w:tcPr>
+          <w:p>
+            <w:pPr>
+              <w:jc w:val="left"/>
+            </w:pPr>
+            <w:r>
+              <w:rPr>
+                <w:rFonts w:ascii="TimeNewRoman" w:hAnsi="TimeNewRoman"/>
+                <w:sz w:val="30"/>
+              </w:rPr>
+              <w:t>47+29=</w:t>
+            </w:r>
+          </w:p>
+        </w:tc>
+        <w:tc>
+          <w:tcPr>
+            <w:tcW w:type="dxa" w:w="1987"/>
+          </w:tcPr>
+          <w:p>
+            <w:pPr>
+              <w:jc w:val="left"/>
+            </w:pPr>
+            <w:r>
+              <w:rPr>
+                <w:rFonts w:ascii="TimeNewRoman" w:hAnsi="TimeNewRoman"/>
+                <w:sz w:val="30"/>
+              </w:rPr>
+              <w:t>7+84=</w:t>
+            </w:r>
+          </w:p>
+        </w:tc>
+        <w:tc>
+          <w:tcPr>
+            <w:tcW w:type="dxa" w:w="1987"/>
+          </w:tcPr>
+          <w:p>
+            <w:pPr>
+              <w:jc w:val="left"/>
+            </w:pPr>
+            <w:r>
+              <w:rPr>
+                <w:rFonts w:ascii="TimeNewRoman" w:hAnsi="TimeNewRoman"/>
+                <w:sz w:val="30"/>
+              </w:rPr>
+              <w:t>6+28=</w:t>
+            </w:r>
+          </w:p>
+        </w:tc>
+        <w:tc>
+          <w:tcPr>
+            <w:tcW w:type="dxa" w:w="1987"/>
+          </w:tcPr>
+          <w:p>
+            <w:pPr>
+              <w:jc w:val="left"/>
+            </w:pPr>
+            <w:r>
+              <w:rPr>
+                <w:rFonts w:ascii="TimeNewRoman" w:hAnsi="TimeNewRoman"/>
+                <w:sz w:val="30"/>
+              </w:rPr>
+              <w:t>81-67=</w:t>
+            </w:r>
+          </w:p>
+        </w:tc>
+      </w:tr>
+      <w:tr>
+        <w:tc>
+          <w:tcPr>
+            <w:tcW w:type="dxa" w:w="1987"/>
+          </w:tcPr>
+          <w:p>
+            <w:pPr>
+              <w:jc w:val="left"/>
+            </w:pPr>
+            <w:r>
+              <w:rPr>
+                <w:rFonts w:ascii="TimeNewRoman" w:hAnsi="TimeNewRoman"/>
+                <w:sz w:val="30"/>
+              </w:rPr>
+              <w:t>3+49=</w:t>
+            </w:r>
+          </w:p>
+        </w:tc>
+        <w:tc>
+          <w:tcPr>
+            <w:tcW w:type="dxa" w:w="1987"/>
+          </w:tcPr>
+          <w:p>
+            <w:pPr>
+              <w:jc w:val="left"/>
+            </w:pPr>
+            <w:r>
+              <w:rPr>
+                <w:rFonts w:ascii="TimeNewRoman" w:hAnsi="TimeNewRoman"/>
+                <w:sz w:val="30"/>
+              </w:rPr>
+              <w:t>92-48=</w:t>
+            </w:r>
+          </w:p>
+        </w:tc>
+        <w:tc>
+          <w:tcPr>
+            <w:tcW w:type="dxa" w:w="1987"/>
+          </w:tcPr>
+          <w:p>
+            <w:pPr>
+              <w:jc w:val="left"/>
+            </w:pPr>
+            <w:r>
+              <w:rPr>
+                <w:rFonts w:ascii="TimeNewRoman" w:hAnsi="TimeNewRoman"/>
+                <w:sz w:val="30"/>
+              </w:rPr>
+              <w:t>19+63=</w:t>
+            </w:r>
+          </w:p>
+        </w:tc>
+        <w:tc>
+          <w:tcPr>
+            <w:tcW w:type="dxa" w:w="1987"/>
+          </w:tcPr>
+          <w:p>
+            <w:pPr>
+              <w:jc w:val="left"/>
+            </w:pPr>
+            <w:r>
+              <w:rPr>
+                <w:rFonts w:ascii="TimeNewRoman" w:hAnsi="TimeNewRoman"/>
+                <w:sz w:val="30"/>
+              </w:rPr>
+              <w:t>64-18=</w:t>
+            </w:r>
+          </w:p>
+        </w:tc>
+        <w:tc>
+          <w:tcPr>
+            <w:tcW w:type="dxa" w:w="1987"/>
+          </w:tcPr>
+          <w:p>
+            <w:pPr>
+              <w:jc w:val="left"/>
+            </w:pPr>
+            <w:r>
+              <w:rPr>
+                <w:rFonts w:ascii="TimeNewRoman" w:hAnsi="TimeNewRoman"/>
+                <w:sz w:val="30"/>
+              </w:rPr>
+              <w:t>94-7=</w:t>
+            </w:r>
+          </w:p>
+        </w:tc>
+      </w:tr>
+      <w:tr>
+        <w:tc>
+          <w:tcPr>
+            <w:tcW w:type="dxa" w:w="1987"/>
+          </w:tcPr>
+          <w:p>
+            <w:pPr>
+              <w:jc w:val="left"/>
+            </w:pPr>
+            <w:r>
+              <w:rPr>
+                <w:rFonts w:ascii="TimeNewRoman" w:hAnsi="TimeNewRoman"/>
+                <w:sz w:val="30"/>
+              </w:rPr>
+              <w:t>93-89=</w:t>
+            </w:r>
+          </w:p>
+        </w:tc>
+        <w:tc>
+          <w:tcPr>
+            <w:tcW w:type="dxa" w:w="1987"/>
+          </w:tcPr>
+          <w:p>
+            <w:pPr>
+              <w:jc w:val="left"/>
+            </w:pPr>
+            <w:r>
+              <w:rPr>
+                <w:rFonts w:ascii="TimeNewRoman" w:hAnsi="TimeNewRoman"/>
+                <w:sz w:val="30"/>
+              </w:rPr>
+              <w:t>97-48=</w:t>
+            </w:r>
+          </w:p>
+        </w:tc>
+        <w:tc>
+          <w:tcPr>
+            <w:tcW w:type="dxa" w:w="1987"/>
+          </w:tcPr>
+          <w:p>
+            <w:pPr>
+              <w:jc w:val="left"/>
+            </w:pPr>
+            <w:r>
+              <w:rPr>
+                <w:rFonts w:ascii="TimeNewRoman" w:hAnsi="TimeNewRoman"/>
+                <w:sz w:val="30"/>
+              </w:rPr>
+              <w:t>9+34=</w:t>
+            </w:r>
+          </w:p>
+        </w:tc>
+        <w:tc>
+          <w:tcPr>
+            <w:tcW w:type="dxa" w:w="1987"/>
+          </w:tcPr>
+          <w:p>
+            <w:pPr>
+              <w:jc w:val="left"/>
+            </w:pPr>
+            <w:r>
+              <w:rPr>
+                <w:rFonts w:ascii="TimeNewRoman" w:hAnsi="TimeNewRoman"/>
+                <w:sz w:val="30"/>
+              </w:rPr>
+              <w:t>81-42=</w:t>
             </w:r>
           </w:p>
         </w:tc>
@@ -127,7 +1258,7 @@
                 <w:rFonts w:ascii="TimeNewRoman" w:hAnsi="TimeNewRoman"/>
                 <w:sz w:val="30"/>
               </w:rPr>
-              <w:t>52-5=</w:t>
+              <w:t>81-78=</w:t>
             </w:r>
           </w:p>
         </w:tc>
@@ -144,7 +1275,7 @@
                 <w:rFonts w:ascii="TimeNewRoman" w:hAnsi="TimeNewRoman"/>
                 <w:sz w:val="30"/>
               </w:rPr>
-              <w:t>39+24=</w:t>
+              <w:t>63-5=</w:t>
             </w:r>
           </w:p>
         </w:tc>
@@ -161,7 +1292,7 @@
                 <w:rFonts w:ascii="TimeNewRoman" w:hAnsi="TimeNewRoman"/>
                 <w:sz w:val="30"/>
               </w:rPr>
-              <w:t>9+38=</w:t>
+              <w:t>83-65=</w:t>
             </w:r>
           </w:p>
         </w:tc>
@@ -178,7 +1309,7 @@
                 <w:rFonts w:ascii="TimeNewRoman" w:hAnsi="TimeNewRoman"/>
                 <w:sz w:val="30"/>
               </w:rPr>
-              <w:t>43-8=</w:t>
+              <w:t>60-22=</w:t>
             </w:r>
           </w:p>
         </w:tc>
@@ -195,7 +1326,7 @@
                 <w:rFonts w:ascii="TimeNewRoman" w:hAnsi="TimeNewRoman"/>
                 <w:sz w:val="30"/>
               </w:rPr>
-              <w:t>53+29=</w:t>
+              <w:t>90-31=</w:t>
             </w:r>
           </w:p>
         </w:tc>
@@ -214,7 +1345,7 @@
                 <w:rFonts w:ascii="TimeNewRoman" w:hAnsi="TimeNewRoman"/>
                 <w:sz w:val="30"/>
               </w:rPr>
-              <w:t>41-2=</w:t>
+              <w:t>80-25=</w:t>
             </w:r>
           </w:p>
         </w:tc>
@@ -231,7 +1362,7 @@
                 <w:rFonts w:ascii="TimeNewRoman" w:hAnsi="TimeNewRoman"/>
                 <w:sz w:val="30"/>
               </w:rPr>
-              <w:t>32-16=</w:t>
+              <w:t>75+19=</w:t>
             </w:r>
           </w:p>
         </w:tc>
@@ -248,7 +1379,7 @@
                 <w:rFonts w:ascii="TimeNewRoman" w:hAnsi="TimeNewRoman"/>
                 <w:sz w:val="30"/>
               </w:rPr>
-              <w:t>62-18=</w:t>
+              <w:t>25+6=</w:t>
             </w:r>
           </w:p>
         </w:tc>
@@ -265,7 +1396,7 @@
                 <w:rFonts w:ascii="TimeNewRoman" w:hAnsi="TimeNewRoman"/>
                 <w:sz w:val="30"/>
               </w:rPr>
-              <w:t>16+29=</w:t>
+              <w:t>41-27=</w:t>
             </w:r>
           </w:p>
         </w:tc>
@@ -282,7 +1413,7 @@
                 <w:rFonts w:ascii="TimeNewRoman" w:hAnsi="TimeNewRoman"/>
                 <w:sz w:val="30"/>
               </w:rPr>
-              <w:t>6+69=</w:t>
+              <w:t>4+37=</w:t>
             </w:r>
           </w:p>
         </w:tc>
@@ -301,7 +1432,7 @@
                 <w:rFonts w:ascii="TimeNewRoman" w:hAnsi="TimeNewRoman"/>
                 <w:sz w:val="30"/>
               </w:rPr>
-              <w:t>65+7=</w:t>
+              <w:t>92-45=</w:t>
             </w:r>
           </w:p>
         </w:tc>
@@ -318,7 +1449,7 @@
                 <w:rFonts w:ascii="TimeNewRoman" w:hAnsi="TimeNewRoman"/>
                 <w:sz w:val="30"/>
               </w:rPr>
-              <w:t>75-58=</w:t>
+              <w:t>39+29=</w:t>
             </w:r>
           </w:p>
         </w:tc>
@@ -335,7 +1466,7 @@
                 <w:rFonts w:ascii="TimeNewRoman" w:hAnsi="TimeNewRoman"/>
                 <w:sz w:val="30"/>
               </w:rPr>
-              <w:t>12+79=</w:t>
+              <w:t>28+45=</w:t>
             </w:r>
           </w:p>
         </w:tc>
@@ -352,7 +1483,7 @@
                 <w:rFonts w:ascii="TimeNewRoman" w:hAnsi="TimeNewRoman"/>
                 <w:sz w:val="30"/>
               </w:rPr>
-              <w:t>26+17=</w:t>
+              <w:t>19+13=</w:t>
             </w:r>
           </w:p>
         </w:tc>
@@ -369,7 +1500,7 @@
                 <w:rFonts w:ascii="TimeNewRoman" w:hAnsi="TimeNewRoman"/>
                 <w:sz w:val="30"/>
               </w:rPr>
-              <w:t>9+27=</w:t>
+              <w:t>33-4=</w:t>
             </w:r>
           </w:p>
         </w:tc>
@@ -388,7 +1519,7 @@
                 <w:rFonts w:ascii="TimeNewRoman" w:hAnsi="TimeNewRoman"/>
                 <w:sz w:val="30"/>
               </w:rPr>
-              <w:t>54-7=</w:t>
+              <w:t>52-9=</w:t>
             </w:r>
           </w:p>
         </w:tc>
@@ -405,7 +1536,7 @@
                 <w:rFonts w:ascii="TimeNewRoman" w:hAnsi="TimeNewRoman"/>
                 <w:sz w:val="30"/>
               </w:rPr>
-              <w:t>28+35=</w:t>
+              <w:t>76+8=</w:t>
             </w:r>
           </w:p>
         </w:tc>
@@ -422,7 +1553,7 @@
                 <w:rFonts w:ascii="TimeNewRoman" w:hAnsi="TimeNewRoman"/>
                 <w:sz w:val="30"/>
               </w:rPr>
-              <w:t>74-25=</w:t>
+              <w:t>50-12=</w:t>
             </w:r>
           </w:p>
         </w:tc>
@@ -439,7 +1570,7 @@
                 <w:rFonts w:ascii="TimeNewRoman" w:hAnsi="TimeNewRoman"/>
                 <w:sz w:val="30"/>
               </w:rPr>
-              <w:t>28-19=</w:t>
+              <w:t>41-34=</w:t>
             </w:r>
           </w:p>
         </w:tc>
@@ -456,7 +1587,7 @@
                 <w:rFonts w:ascii="TimeNewRoman" w:hAnsi="TimeNewRoman"/>
                 <w:sz w:val="30"/>
               </w:rPr>
-              <w:t>44+48=</w:t>
+              <w:t>27+8=</w:t>
             </w:r>
           </w:p>
         </w:tc>
@@ -475,7 +1606,7 @@
                 <w:rFonts w:ascii="TimeNewRoman" w:hAnsi="TimeNewRoman"/>
                 <w:sz w:val="30"/>
               </w:rPr>
-              <w:t>13+68=</w:t>
+              <w:t>7+8=</w:t>
             </w:r>
           </w:p>
         </w:tc>
@@ -492,7 +1623,7 @@
                 <w:rFonts w:ascii="TimeNewRoman" w:hAnsi="TimeNewRoman"/>
                 <w:sz w:val="30"/>
               </w:rPr>
-              <w:t>55+27=</w:t>
+              <w:t>81-4=</w:t>
             </w:r>
           </w:p>
         </w:tc>
@@ -509,7 +1640,7 @@
                 <w:rFonts w:ascii="TimeNewRoman" w:hAnsi="TimeNewRoman"/>
                 <w:sz w:val="30"/>
               </w:rPr>
-              <w:t>66+29=</w:t>
+              <w:t>9+4=</w:t>
             </w:r>
           </w:p>
         </w:tc>
@@ -526,7 +1657,7 @@
                 <w:rFonts w:ascii="TimeNewRoman" w:hAnsi="TimeNewRoman"/>
                 <w:sz w:val="30"/>
               </w:rPr>
-              <w:t>73-64=</w:t>
+              <w:t>62-54=</w:t>
             </w:r>
           </w:p>
         </w:tc>
@@ -543,7 +1674,7 @@
                 <w:rFonts w:ascii="TimeNewRoman" w:hAnsi="TimeNewRoman"/>
                 <w:sz w:val="30"/>
               </w:rPr>
-              <w:t>67-59=</w:t>
+              <w:t>50-22=</w:t>
             </w:r>
           </w:p>
         </w:tc>
@@ -562,7 +1693,7 @@
                 <w:rFonts w:ascii="TimeNewRoman" w:hAnsi="TimeNewRoman"/>
                 <w:sz w:val="30"/>
               </w:rPr>
-              <w:t>29+23=</w:t>
+              <w:t>16+15=</w:t>
             </w:r>
           </w:p>
         </w:tc>
@@ -579,7 +1710,7 @@
                 <w:rFonts w:ascii="TimeNewRoman" w:hAnsi="TimeNewRoman"/>
                 <w:sz w:val="30"/>
               </w:rPr>
-              <w:t>38+53=</w:t>
+              <w:t>45+28=</w:t>
             </w:r>
           </w:p>
         </w:tc>
@@ -596,7 +1727,7 @@
                 <w:rFonts w:ascii="TimeNewRoman" w:hAnsi="TimeNewRoman"/>
                 <w:sz w:val="30"/>
               </w:rPr>
-              <w:t>15+27=</w:t>
+              <w:t>80-78=</w:t>
             </w:r>
           </w:p>
         </w:tc>
@@ -613,7 +1744,7 @@
                 <w:rFonts w:ascii="TimeNewRoman" w:hAnsi="TimeNewRoman"/>
                 <w:sz w:val="30"/>
               </w:rPr>
-              <w:t>18+49=</w:t>
+              <w:t>56-28=</w:t>
             </w:r>
           </w:p>
         </w:tc>
@@ -630,1138 +1761,7 @@
                 <w:rFonts w:ascii="TimeNewRoman" w:hAnsi="TimeNewRoman"/>
                 <w:sz w:val="30"/>
               </w:rPr>
-              <w:t>60-53=</w:t>
-            </w:r>
-          </w:p>
-        </w:tc>
-      </w:tr>
-      <w:tr>
-        <w:tc>
-          <w:tcPr>
-            <w:tcW w:type="dxa" w:w="1987"/>
-          </w:tcPr>
-          <w:p>
-            <w:pPr>
-              <w:jc w:val="left"/>
-            </w:pPr>
-            <w:r>
-              <w:rPr>
-                <w:rFonts w:ascii="TimeNewRoman" w:hAnsi="TimeNewRoman"/>
-                <w:sz w:val="30"/>
-              </w:rPr>
-              <w:t>59+5=</w:t>
-            </w:r>
-          </w:p>
-        </w:tc>
-        <w:tc>
-          <w:tcPr>
-            <w:tcW w:type="dxa" w:w="1987"/>
-          </w:tcPr>
-          <w:p>
-            <w:pPr>
-              <w:jc w:val="left"/>
-            </w:pPr>
-            <w:r>
-              <w:rPr>
-                <w:rFonts w:ascii="TimeNewRoman" w:hAnsi="TimeNewRoman"/>
-                <w:sz w:val="30"/>
-              </w:rPr>
-              <w:t>92-19=</w:t>
-            </w:r>
-          </w:p>
-        </w:tc>
-        <w:tc>
-          <w:tcPr>
-            <w:tcW w:type="dxa" w:w="1987"/>
-          </w:tcPr>
-          <w:p>
-            <w:pPr>
-              <w:jc w:val="left"/>
-            </w:pPr>
-            <w:r>
-              <w:rPr>
-                <w:rFonts w:ascii="TimeNewRoman" w:hAnsi="TimeNewRoman"/>
-                <w:sz w:val="30"/>
-              </w:rPr>
-              <w:t>72-24=</w:t>
-            </w:r>
-          </w:p>
-        </w:tc>
-        <w:tc>
-          <w:tcPr>
-            <w:tcW w:type="dxa" w:w="1987"/>
-          </w:tcPr>
-          <w:p>
-            <w:pPr>
-              <w:jc w:val="left"/>
-            </w:pPr>
-            <w:r>
-              <w:rPr>
-                <w:rFonts w:ascii="TimeNewRoman" w:hAnsi="TimeNewRoman"/>
-                <w:sz w:val="30"/>
-              </w:rPr>
-              <w:t>92-27=</w:t>
-            </w:r>
-          </w:p>
-        </w:tc>
-        <w:tc>
-          <w:tcPr>
-            <w:tcW w:type="dxa" w:w="1987"/>
-          </w:tcPr>
-          <w:p>
-            <w:pPr>
-              <w:jc w:val="left"/>
-            </w:pPr>
-            <w:r>
-              <w:rPr>
-                <w:rFonts w:ascii="TimeNewRoman" w:hAnsi="TimeNewRoman"/>
-                <w:sz w:val="30"/>
-              </w:rPr>
-              <w:t>7+87=</w:t>
-            </w:r>
-          </w:p>
-        </w:tc>
-      </w:tr>
-      <w:tr>
-        <w:tc>
-          <w:tcPr>
-            <w:tcW w:type="dxa" w:w="1987"/>
-          </w:tcPr>
-          <w:p>
-            <w:pPr>
-              <w:jc w:val="left"/>
-            </w:pPr>
-            <w:r>
-              <w:rPr>
-                <w:rFonts w:ascii="TimeNewRoman" w:hAnsi="TimeNewRoman"/>
-                <w:sz w:val="30"/>
-              </w:rPr>
-              <w:t>45-9=</w:t>
-            </w:r>
-          </w:p>
-        </w:tc>
-        <w:tc>
-          <w:tcPr>
-            <w:tcW w:type="dxa" w:w="1987"/>
-          </w:tcPr>
-          <w:p>
-            <w:pPr>
-              <w:jc w:val="left"/>
-            </w:pPr>
-            <w:r>
-              <w:rPr>
-                <w:rFonts w:ascii="TimeNewRoman" w:hAnsi="TimeNewRoman"/>
-                <w:sz w:val="30"/>
-              </w:rPr>
-              <w:t>92-5=</w:t>
-            </w:r>
-          </w:p>
-        </w:tc>
-        <w:tc>
-          <w:tcPr>
-            <w:tcW w:type="dxa" w:w="1987"/>
-          </w:tcPr>
-          <w:p>
-            <w:pPr>
-              <w:jc w:val="left"/>
-            </w:pPr>
-            <w:r>
-              <w:rPr>
-                <w:rFonts w:ascii="TimeNewRoman" w:hAnsi="TimeNewRoman"/>
-                <w:sz w:val="30"/>
-              </w:rPr>
-              <w:t>90-76=</w:t>
-            </w:r>
-          </w:p>
-        </w:tc>
-        <w:tc>
-          <w:tcPr>
-            <w:tcW w:type="dxa" w:w="1987"/>
-          </w:tcPr>
-          <w:p>
-            <w:pPr>
-              <w:jc w:val="left"/>
-            </w:pPr>
-            <w:r>
-              <w:rPr>
-                <w:rFonts w:ascii="TimeNewRoman" w:hAnsi="TimeNewRoman"/>
-                <w:sz w:val="30"/>
-              </w:rPr>
-              <w:t>78+15=</w:t>
-            </w:r>
-          </w:p>
-        </w:tc>
-        <w:tc>
-          <w:tcPr>
-            <w:tcW w:type="dxa" w:w="1987"/>
-          </w:tcPr>
-          <w:p>
-            <w:pPr>
-              <w:jc w:val="left"/>
-            </w:pPr>
-            <w:r>
-              <w:rPr>
-                <w:rFonts w:ascii="TimeNewRoman" w:hAnsi="TimeNewRoman"/>
-                <w:sz w:val="30"/>
-              </w:rPr>
-              <w:t>19+39=</w:t>
-            </w:r>
-          </w:p>
-        </w:tc>
-      </w:tr>
-      <w:tr>
-        <w:tc>
-          <w:tcPr>
-            <w:tcW w:type="dxa" w:w="1987"/>
-          </w:tcPr>
-          <w:p>
-            <w:pPr>
-              <w:jc w:val="left"/>
-            </w:pPr>
-            <w:r>
-              <w:rPr>
-                <w:rFonts w:ascii="TimeNewRoman" w:hAnsi="TimeNewRoman"/>
-                <w:sz w:val="30"/>
-              </w:rPr>
-              <w:t>57+7=</w:t>
-            </w:r>
-          </w:p>
-        </w:tc>
-        <w:tc>
-          <w:tcPr>
-            <w:tcW w:type="dxa" w:w="1987"/>
-          </w:tcPr>
-          <w:p>
-            <w:pPr>
-              <w:jc w:val="left"/>
-            </w:pPr>
-            <w:r>
-              <w:rPr>
-                <w:rFonts w:ascii="TimeNewRoman" w:hAnsi="TimeNewRoman"/>
-                <w:sz w:val="30"/>
-              </w:rPr>
-              <w:t>38+13=</w:t>
-            </w:r>
-          </w:p>
-        </w:tc>
-        <w:tc>
-          <w:tcPr>
-            <w:tcW w:type="dxa" w:w="1987"/>
-          </w:tcPr>
-          <w:p>
-            <w:pPr>
-              <w:jc w:val="left"/>
-            </w:pPr>
-            <w:r>
-              <w:rPr>
-                <w:rFonts w:ascii="TimeNewRoman" w:hAnsi="TimeNewRoman"/>
-                <w:sz w:val="30"/>
-              </w:rPr>
-              <w:t>19+69=</w:t>
-            </w:r>
-          </w:p>
-        </w:tc>
-        <w:tc>
-          <w:tcPr>
-            <w:tcW w:type="dxa" w:w="1987"/>
-          </w:tcPr>
-          <w:p>
-            <w:pPr>
-              <w:jc w:val="left"/>
-            </w:pPr>
-            <w:r>
-              <w:rPr>
-                <w:rFonts w:ascii="TimeNewRoman" w:hAnsi="TimeNewRoman"/>
-                <w:sz w:val="30"/>
-              </w:rPr>
-              <w:t>58-49=</w:t>
-            </w:r>
-          </w:p>
-        </w:tc>
-        <w:tc>
-          <w:tcPr>
-            <w:tcW w:type="dxa" w:w="1987"/>
-          </w:tcPr>
-          <w:p>
-            <w:pPr>
-              <w:jc w:val="left"/>
-            </w:pPr>
-            <w:r>
-              <w:rPr>
-                <w:rFonts w:ascii="TimeNewRoman" w:hAnsi="TimeNewRoman"/>
-                <w:sz w:val="30"/>
-              </w:rPr>
-              <w:t>37+37=</w:t>
-            </w:r>
-          </w:p>
-        </w:tc>
-      </w:tr>
-      <w:tr>
-        <w:tc>
-          <w:tcPr>
-            <w:tcW w:type="dxa" w:w="1987"/>
-          </w:tcPr>
-          <w:p>
-            <w:pPr>
-              <w:jc w:val="left"/>
-            </w:pPr>
-            <w:r>
-              <w:rPr>
-                <w:rFonts w:ascii="TimeNewRoman" w:hAnsi="TimeNewRoman"/>
-                <w:sz w:val="30"/>
-              </w:rPr>
-              <w:t>68+17=</w:t>
-            </w:r>
-          </w:p>
-        </w:tc>
-        <w:tc>
-          <w:tcPr>
-            <w:tcW w:type="dxa" w:w="1987"/>
-          </w:tcPr>
-          <w:p>
-            <w:pPr>
-              <w:jc w:val="left"/>
-            </w:pPr>
-            <w:r>
-              <w:rPr>
-                <w:rFonts w:ascii="TimeNewRoman" w:hAnsi="TimeNewRoman"/>
-                <w:sz w:val="30"/>
-              </w:rPr>
-              <w:t>81-55=</w:t>
-            </w:r>
-          </w:p>
-        </w:tc>
-        <w:tc>
-          <w:tcPr>
-            <w:tcW w:type="dxa" w:w="1987"/>
-          </w:tcPr>
-          <w:p>
-            <w:pPr>
-              <w:jc w:val="left"/>
-            </w:pPr>
-            <w:r>
-              <w:rPr>
-                <w:rFonts w:ascii="TimeNewRoman" w:hAnsi="TimeNewRoman"/>
-                <w:sz w:val="30"/>
-              </w:rPr>
-              <w:t>86-49=</w:t>
-            </w:r>
-          </w:p>
-        </w:tc>
-        <w:tc>
-          <w:tcPr>
-            <w:tcW w:type="dxa" w:w="1987"/>
-          </w:tcPr>
-          <w:p>
-            <w:pPr>
-              <w:jc w:val="left"/>
-            </w:pPr>
-            <w:r>
-              <w:rPr>
-                <w:rFonts w:ascii="TimeNewRoman" w:hAnsi="TimeNewRoman"/>
-                <w:sz w:val="30"/>
-              </w:rPr>
-              <w:t>72-58=</w:t>
-            </w:r>
-          </w:p>
-        </w:tc>
-        <w:tc>
-          <w:tcPr>
-            <w:tcW w:type="dxa" w:w="1987"/>
-          </w:tcPr>
-          <w:p>
-            <w:pPr>
-              <w:jc w:val="left"/>
-            </w:pPr>
-            <w:r>
-              <w:rPr>
-                <w:rFonts w:ascii="TimeNewRoman" w:hAnsi="TimeNewRoman"/>
-                <w:sz w:val="30"/>
-              </w:rPr>
-              <w:t>13+78=</w:t>
-            </w:r>
-          </w:p>
-        </w:tc>
-      </w:tr>
-      <w:tr>
-        <w:tc>
-          <w:tcPr>
-            <w:tcW w:type="dxa" w:w="1987"/>
-          </w:tcPr>
-          <w:p>
-            <w:pPr>
-              <w:jc w:val="left"/>
-            </w:pPr>
-            <w:r>
-              <w:rPr>
-                <w:rFonts w:ascii="TimeNewRoman" w:hAnsi="TimeNewRoman"/>
-                <w:sz w:val="30"/>
-              </w:rPr>
-              <w:t>68+13=</w:t>
-            </w:r>
-          </w:p>
-        </w:tc>
-        <w:tc>
-          <w:tcPr>
-            <w:tcW w:type="dxa" w:w="1987"/>
-          </w:tcPr>
-          <w:p>
-            <w:pPr>
-              <w:jc w:val="left"/>
-            </w:pPr>
-            <w:r>
-              <w:rPr>
-                <w:rFonts w:ascii="TimeNewRoman" w:hAnsi="TimeNewRoman"/>
-                <w:sz w:val="30"/>
-              </w:rPr>
-              <w:t>87+6=</w:t>
-            </w:r>
-          </w:p>
-        </w:tc>
-        <w:tc>
-          <w:tcPr>
-            <w:tcW w:type="dxa" w:w="1987"/>
-          </w:tcPr>
-          <w:p>
-            <w:pPr>
-              <w:jc w:val="left"/>
-            </w:pPr>
-            <w:r>
-              <w:rPr>
-                <w:rFonts w:ascii="TimeNewRoman" w:hAnsi="TimeNewRoman"/>
-                <w:sz w:val="30"/>
-              </w:rPr>
-              <w:t>80-15=</w:t>
-            </w:r>
-          </w:p>
-        </w:tc>
-        <w:tc>
-          <w:tcPr>
-            <w:tcW w:type="dxa" w:w="1987"/>
-          </w:tcPr>
-          <w:p>
-            <w:pPr>
-              <w:jc w:val="left"/>
-            </w:pPr>
-            <w:r>
-              <w:rPr>
-                <w:rFonts w:ascii="TimeNewRoman" w:hAnsi="TimeNewRoman"/>
-                <w:sz w:val="30"/>
-              </w:rPr>
-              <w:t>5+7=</w:t>
-            </w:r>
-          </w:p>
-        </w:tc>
-        <w:tc>
-          <w:tcPr>
-            <w:tcW w:type="dxa" w:w="1987"/>
-          </w:tcPr>
-          <w:p>
-            <w:pPr>
-              <w:jc w:val="left"/>
-            </w:pPr>
-            <w:r>
-              <w:rPr>
-                <w:rFonts w:ascii="TimeNewRoman" w:hAnsi="TimeNewRoman"/>
-                <w:sz w:val="30"/>
-              </w:rPr>
-              <w:t>18+28=</w:t>
-            </w:r>
-          </w:p>
-        </w:tc>
-      </w:tr>
-      <w:tr>
-        <w:tc>
-          <w:tcPr>
-            <w:tcW w:type="dxa" w:w="1987"/>
-          </w:tcPr>
-          <w:p>
-            <w:pPr>
-              <w:jc w:val="left"/>
-            </w:pPr>
-            <w:r>
-              <w:rPr>
-                <w:rFonts w:ascii="TimeNewRoman" w:hAnsi="TimeNewRoman"/>
-                <w:sz w:val="30"/>
-              </w:rPr>
-              <w:t>7+75=</w:t>
-            </w:r>
-          </w:p>
-        </w:tc>
-        <w:tc>
-          <w:tcPr>
-            <w:tcW w:type="dxa" w:w="1987"/>
-          </w:tcPr>
-          <w:p>
-            <w:pPr>
-              <w:jc w:val="left"/>
-            </w:pPr>
-            <w:r>
-              <w:rPr>
-                <w:rFonts w:ascii="TimeNewRoman" w:hAnsi="TimeNewRoman"/>
-                <w:sz w:val="30"/>
-              </w:rPr>
-              <w:t>7+36=</w:t>
-            </w:r>
-          </w:p>
-        </w:tc>
-        <w:tc>
-          <w:tcPr>
-            <w:tcW w:type="dxa" w:w="1987"/>
-          </w:tcPr>
-          <w:p>
-            <w:pPr>
-              <w:jc w:val="left"/>
-            </w:pPr>
-            <w:r>
-              <w:rPr>
-                <w:rFonts w:ascii="TimeNewRoman" w:hAnsi="TimeNewRoman"/>
-                <w:sz w:val="30"/>
-              </w:rPr>
-              <w:t>88+7=</w:t>
-            </w:r>
-          </w:p>
-        </w:tc>
-        <w:tc>
-          <w:tcPr>
-            <w:tcW w:type="dxa" w:w="1987"/>
-          </w:tcPr>
-          <w:p>
-            <w:pPr>
-              <w:jc w:val="left"/>
-            </w:pPr>
-            <w:r>
-              <w:rPr>
-                <w:rFonts w:ascii="TimeNewRoman" w:hAnsi="TimeNewRoman"/>
-                <w:sz w:val="30"/>
-              </w:rPr>
-              <w:t>54-27=</w:t>
-            </w:r>
-          </w:p>
-        </w:tc>
-        <w:tc>
-          <w:tcPr>
-            <w:tcW w:type="dxa" w:w="1987"/>
-          </w:tcPr>
-          <w:p>
-            <w:pPr>
-              <w:jc w:val="left"/>
-            </w:pPr>
-            <w:r>
-              <w:rPr>
-                <w:rFonts w:ascii="TimeNewRoman" w:hAnsi="TimeNewRoman"/>
-                <w:sz w:val="30"/>
-              </w:rPr>
-              <w:t>38+25=</w:t>
-            </w:r>
-          </w:p>
-        </w:tc>
-      </w:tr>
-      <w:tr>
-        <w:tc>
-          <w:tcPr>
-            <w:tcW w:type="dxa" w:w="1987"/>
-          </w:tcPr>
-          <w:p>
-            <w:pPr>
-              <w:jc w:val="left"/>
-            </w:pPr>
-            <w:r>
-              <w:rPr>
-                <w:rFonts w:ascii="TimeNewRoman" w:hAnsi="TimeNewRoman"/>
-                <w:sz w:val="30"/>
-              </w:rPr>
-              <w:t>54-8=</w:t>
-            </w:r>
-          </w:p>
-        </w:tc>
-        <w:tc>
-          <w:tcPr>
-            <w:tcW w:type="dxa" w:w="1987"/>
-          </w:tcPr>
-          <w:p>
-            <w:pPr>
-              <w:jc w:val="left"/>
-            </w:pPr>
-            <w:r>
-              <w:rPr>
-                <w:rFonts w:ascii="TimeNewRoman" w:hAnsi="TimeNewRoman"/>
-                <w:sz w:val="30"/>
-              </w:rPr>
-              <w:t>41-25=</w:t>
-            </w:r>
-          </w:p>
-        </w:tc>
-        <w:tc>
-          <w:tcPr>
-            <w:tcW w:type="dxa" w:w="1987"/>
-          </w:tcPr>
-          <w:p>
-            <w:pPr>
-              <w:jc w:val="left"/>
-            </w:pPr>
-            <w:r>
-              <w:rPr>
-                <w:rFonts w:ascii="TimeNewRoman" w:hAnsi="TimeNewRoman"/>
-                <w:sz w:val="30"/>
-              </w:rPr>
-              <w:t>36+57=</w:t>
-            </w:r>
-          </w:p>
-        </w:tc>
-        <w:tc>
-          <w:tcPr>
-            <w:tcW w:type="dxa" w:w="1987"/>
-          </w:tcPr>
-          <w:p>
-            <w:pPr>
-              <w:jc w:val="left"/>
-            </w:pPr>
-            <w:r>
-              <w:rPr>
-                <w:rFonts w:ascii="TimeNewRoman" w:hAnsi="TimeNewRoman"/>
-                <w:sz w:val="30"/>
-              </w:rPr>
-              <w:t>55-28=</w:t>
-            </w:r>
-          </w:p>
-        </w:tc>
-        <w:tc>
-          <w:tcPr>
-            <w:tcW w:type="dxa" w:w="1987"/>
-          </w:tcPr>
-          <w:p>
-            <w:pPr>
-              <w:jc w:val="left"/>
-            </w:pPr>
-            <w:r>
-              <w:rPr>
-                <w:rFonts w:ascii="TimeNewRoman" w:hAnsi="TimeNewRoman"/>
-                <w:sz w:val="30"/>
-              </w:rPr>
-              <w:t>25+9=</w:t>
-            </w:r>
-          </w:p>
-        </w:tc>
-      </w:tr>
-      <w:tr>
-        <w:tc>
-          <w:tcPr>
-            <w:tcW w:type="dxa" w:w="1987"/>
-          </w:tcPr>
-          <w:p>
-            <w:pPr>
-              <w:jc w:val="left"/>
-            </w:pPr>
-            <w:r>
-              <w:rPr>
-                <w:rFonts w:ascii="TimeNewRoman" w:hAnsi="TimeNewRoman"/>
-                <w:sz w:val="30"/>
-              </w:rPr>
-              <w:t>93-45=</w:t>
-            </w:r>
-          </w:p>
-        </w:tc>
-        <w:tc>
-          <w:tcPr>
-            <w:tcW w:type="dxa" w:w="1987"/>
-          </w:tcPr>
-          <w:p>
-            <w:pPr>
-              <w:jc w:val="left"/>
-            </w:pPr>
-            <w:r>
-              <w:rPr>
-                <w:rFonts w:ascii="TimeNewRoman" w:hAnsi="TimeNewRoman"/>
-                <w:sz w:val="30"/>
-              </w:rPr>
-              <w:t>73-9=</w:t>
-            </w:r>
-          </w:p>
-        </w:tc>
-        <w:tc>
-          <w:tcPr>
-            <w:tcW w:type="dxa" w:w="1987"/>
-          </w:tcPr>
-          <w:p>
-            <w:pPr>
-              <w:jc w:val="left"/>
-            </w:pPr>
-            <w:r>
-              <w:rPr>
-                <w:rFonts w:ascii="TimeNewRoman" w:hAnsi="TimeNewRoman"/>
-                <w:sz w:val="30"/>
-              </w:rPr>
-              <w:t>41-35=</w:t>
-            </w:r>
-          </w:p>
-        </w:tc>
-        <w:tc>
-          <w:tcPr>
-            <w:tcW w:type="dxa" w:w="1987"/>
-          </w:tcPr>
-          <w:p>
-            <w:pPr>
-              <w:jc w:val="left"/>
-            </w:pPr>
-            <w:r>
-              <w:rPr>
-                <w:rFonts w:ascii="TimeNewRoman" w:hAnsi="TimeNewRoman"/>
-                <w:sz w:val="30"/>
-              </w:rPr>
-              <w:t>22-9=</w:t>
-            </w:r>
-          </w:p>
-        </w:tc>
-        <w:tc>
-          <w:tcPr>
-            <w:tcW w:type="dxa" w:w="1987"/>
-          </w:tcPr>
-          <w:p>
-            <w:pPr>
-              <w:jc w:val="left"/>
-            </w:pPr>
-            <w:r>
-              <w:rPr>
-                <w:rFonts w:ascii="TimeNewRoman" w:hAnsi="TimeNewRoman"/>
-                <w:sz w:val="30"/>
-              </w:rPr>
-              <w:t>67+5=</w:t>
-            </w:r>
-          </w:p>
-        </w:tc>
-      </w:tr>
-      <w:tr>
-        <w:tc>
-          <w:tcPr>
-            <w:tcW w:type="dxa" w:w="1987"/>
-          </w:tcPr>
-          <w:p>
-            <w:pPr>
-              <w:jc w:val="left"/>
-            </w:pPr>
-            <w:r>
-              <w:rPr>
-                <w:rFonts w:ascii="TimeNewRoman" w:hAnsi="TimeNewRoman"/>
-                <w:sz w:val="30"/>
-              </w:rPr>
-              <w:t>8+56=</w:t>
-            </w:r>
-          </w:p>
-        </w:tc>
-        <w:tc>
-          <w:tcPr>
-            <w:tcW w:type="dxa" w:w="1987"/>
-          </w:tcPr>
-          <w:p>
-            <w:pPr>
-              <w:jc w:val="left"/>
-            </w:pPr>
-            <w:r>
-              <w:rPr>
-                <w:rFonts w:ascii="TimeNewRoman" w:hAnsi="TimeNewRoman"/>
-                <w:sz w:val="30"/>
-              </w:rPr>
-              <w:t>92-28=</w:t>
-            </w:r>
-          </w:p>
-        </w:tc>
-        <w:tc>
-          <w:tcPr>
-            <w:tcW w:type="dxa" w:w="1987"/>
-          </w:tcPr>
-          <w:p>
-            <w:pPr>
-              <w:jc w:val="left"/>
-            </w:pPr>
-            <w:r>
-              <w:rPr>
-                <w:rFonts w:ascii="TimeNewRoman" w:hAnsi="TimeNewRoman"/>
-                <w:sz w:val="30"/>
-              </w:rPr>
-              <w:t>5+9=</w:t>
-            </w:r>
-          </w:p>
-        </w:tc>
-        <w:tc>
-          <w:tcPr>
-            <w:tcW w:type="dxa" w:w="1987"/>
-          </w:tcPr>
-          <w:p>
-            <w:pPr>
-              <w:jc w:val="left"/>
-            </w:pPr>
-            <w:r>
-              <w:rPr>
-                <w:rFonts w:ascii="TimeNewRoman" w:hAnsi="TimeNewRoman"/>
-                <w:sz w:val="30"/>
-              </w:rPr>
-              <w:t>96-67=</w:t>
-            </w:r>
-          </w:p>
-        </w:tc>
-        <w:tc>
-          <w:tcPr>
-            <w:tcW w:type="dxa" w:w="1987"/>
-          </w:tcPr>
-          <w:p>
-            <w:pPr>
-              <w:jc w:val="left"/>
-            </w:pPr>
-            <w:r>
-              <w:rPr>
-                <w:rFonts w:ascii="TimeNewRoman" w:hAnsi="TimeNewRoman"/>
-                <w:sz w:val="30"/>
-              </w:rPr>
-              <w:t>73+18=</w:t>
-            </w:r>
-          </w:p>
-        </w:tc>
-      </w:tr>
-      <w:tr>
-        <w:tc>
-          <w:tcPr>
-            <w:tcW w:type="dxa" w:w="1987"/>
-          </w:tcPr>
-          <w:p>
-            <w:pPr>
-              <w:jc w:val="left"/>
-            </w:pPr>
-            <w:r>
-              <w:rPr>
-                <w:rFonts w:ascii="TimeNewRoman" w:hAnsi="TimeNewRoman"/>
-                <w:sz w:val="30"/>
-              </w:rPr>
-              <w:t>82-43=</w:t>
-            </w:r>
-          </w:p>
-        </w:tc>
-        <w:tc>
-          <w:tcPr>
-            <w:tcW w:type="dxa" w:w="1987"/>
-          </w:tcPr>
-          <w:p>
-            <w:pPr>
-              <w:jc w:val="left"/>
-            </w:pPr>
-            <w:r>
-              <w:rPr>
-                <w:rFonts w:ascii="TimeNewRoman" w:hAnsi="TimeNewRoman"/>
-                <w:sz w:val="30"/>
-              </w:rPr>
-              <w:t>60-12=</w:t>
-            </w:r>
-          </w:p>
-        </w:tc>
-        <w:tc>
-          <w:tcPr>
-            <w:tcW w:type="dxa" w:w="1987"/>
-          </w:tcPr>
-          <w:p>
-            <w:pPr>
-              <w:jc w:val="left"/>
-            </w:pPr>
-            <w:r>
-              <w:rPr>
-                <w:rFonts w:ascii="TimeNewRoman" w:hAnsi="TimeNewRoman"/>
-                <w:sz w:val="30"/>
-              </w:rPr>
-              <w:t>6+79=</w:t>
-            </w:r>
-          </w:p>
-        </w:tc>
-        <w:tc>
-          <w:tcPr>
-            <w:tcW w:type="dxa" w:w="1987"/>
-          </w:tcPr>
-          <w:p>
-            <w:pPr>
-              <w:jc w:val="left"/>
-            </w:pPr>
-            <w:r>
-              <w:rPr>
-                <w:rFonts w:ascii="TimeNewRoman" w:hAnsi="TimeNewRoman"/>
-                <w:sz w:val="30"/>
-              </w:rPr>
-              <w:t>46+28=</w:t>
-            </w:r>
-          </w:p>
-        </w:tc>
-        <w:tc>
-          <w:tcPr>
-            <w:tcW w:type="dxa" w:w="1987"/>
-          </w:tcPr>
-          <w:p>
-            <w:pPr>
-              <w:jc w:val="left"/>
-            </w:pPr>
-            <w:r>
-              <w:rPr>
-                <w:rFonts w:ascii="TimeNewRoman" w:hAnsi="TimeNewRoman"/>
-                <w:sz w:val="30"/>
-              </w:rPr>
-              <w:t>70-6=</w:t>
-            </w:r>
-          </w:p>
-        </w:tc>
-      </w:tr>
-      <w:tr>
-        <w:tc>
-          <w:tcPr>
-            <w:tcW w:type="dxa" w:w="1987"/>
-          </w:tcPr>
-          <w:p>
-            <w:pPr>
-              <w:jc w:val="left"/>
-            </w:pPr>
-            <w:r>
-              <w:rPr>
-                <w:rFonts w:ascii="TimeNewRoman" w:hAnsi="TimeNewRoman"/>
-                <w:sz w:val="30"/>
-              </w:rPr>
-              <w:t>24+28=</w:t>
-            </w:r>
-          </w:p>
-        </w:tc>
-        <w:tc>
-          <w:tcPr>
-            <w:tcW w:type="dxa" w:w="1987"/>
-          </w:tcPr>
-          <w:p>
-            <w:pPr>
-              <w:jc w:val="left"/>
-            </w:pPr>
-            <w:r>
-              <w:rPr>
-                <w:rFonts w:ascii="TimeNewRoman" w:hAnsi="TimeNewRoman"/>
-                <w:sz w:val="30"/>
-              </w:rPr>
-              <w:t>7+89=</w:t>
-            </w:r>
-          </w:p>
-        </w:tc>
-        <w:tc>
-          <w:tcPr>
-            <w:tcW w:type="dxa" w:w="1987"/>
-          </w:tcPr>
-          <w:p>
-            <w:pPr>
-              <w:jc w:val="left"/>
-            </w:pPr>
-            <w:r>
-              <w:rPr>
-                <w:rFonts w:ascii="TimeNewRoman" w:hAnsi="TimeNewRoman"/>
-                <w:sz w:val="30"/>
-              </w:rPr>
-              <w:t>7+9=</w:t>
-            </w:r>
-          </w:p>
-        </w:tc>
-        <w:tc>
-          <w:tcPr>
-            <w:tcW w:type="dxa" w:w="1987"/>
-          </w:tcPr>
-          <w:p>
-            <w:pPr>
-              <w:jc w:val="left"/>
-            </w:pPr>
-            <w:r>
-              <w:rPr>
-                <w:rFonts w:ascii="TimeNewRoman" w:hAnsi="TimeNewRoman"/>
-                <w:sz w:val="30"/>
-              </w:rPr>
-              <w:t>85-38=</w:t>
-            </w:r>
-          </w:p>
-        </w:tc>
-        <w:tc>
-          <w:tcPr>
-            <w:tcW w:type="dxa" w:w="1987"/>
-          </w:tcPr>
-          <w:p>
-            <w:pPr>
-              <w:jc w:val="left"/>
-            </w:pPr>
-            <w:r>
-              <w:rPr>
-                <w:rFonts w:ascii="TimeNewRoman" w:hAnsi="TimeNewRoman"/>
-                <w:sz w:val="30"/>
-              </w:rPr>
-              <w:t>25-9=</w:t>
-            </w:r>
-          </w:p>
-        </w:tc>
-      </w:tr>
-      <w:tr>
-        <w:tc>
-          <w:tcPr>
-            <w:tcW w:type="dxa" w:w="1987"/>
-          </w:tcPr>
-          <w:p>
-            <w:pPr>
-              <w:jc w:val="left"/>
-            </w:pPr>
-            <w:r>
-              <w:rPr>
-                <w:rFonts w:ascii="TimeNewRoman" w:hAnsi="TimeNewRoman"/>
-                <w:sz w:val="30"/>
-              </w:rPr>
-              <w:t>36+59=</w:t>
-            </w:r>
-          </w:p>
-        </w:tc>
-        <w:tc>
-          <w:tcPr>
-            <w:tcW w:type="dxa" w:w="1987"/>
-          </w:tcPr>
-          <w:p>
-            <w:pPr>
-              <w:jc w:val="left"/>
-            </w:pPr>
-            <w:r>
-              <w:rPr>
-                <w:rFonts w:ascii="TimeNewRoman" w:hAnsi="TimeNewRoman"/>
-                <w:sz w:val="30"/>
-              </w:rPr>
-              <w:t>50-45=</w:t>
-            </w:r>
-          </w:p>
-        </w:tc>
-        <w:tc>
-          <w:tcPr>
-            <w:tcW w:type="dxa" w:w="1987"/>
-          </w:tcPr>
-          <w:p>
-            <w:pPr>
-              <w:jc w:val="left"/>
-            </w:pPr>
-            <w:r>
-              <w:rPr>
-                <w:rFonts w:ascii="TimeNewRoman" w:hAnsi="TimeNewRoman"/>
-                <w:sz w:val="30"/>
-              </w:rPr>
-              <w:t>47+18=</w:t>
-            </w:r>
-          </w:p>
-        </w:tc>
-        <w:tc>
-          <w:tcPr>
-            <w:tcW w:type="dxa" w:w="1987"/>
-          </w:tcPr>
-          <w:p>
-            <w:pPr>
-              <w:jc w:val="left"/>
-            </w:pPr>
-            <w:r>
-              <w:rPr>
-                <w:rFonts w:ascii="TimeNewRoman" w:hAnsi="TimeNewRoman"/>
-                <w:sz w:val="30"/>
-              </w:rPr>
-              <w:t>70-58=</w:t>
-            </w:r>
-          </w:p>
-        </w:tc>
-        <w:tc>
-          <w:tcPr>
-            <w:tcW w:type="dxa" w:w="1987"/>
-          </w:tcPr>
-          <w:p>
-            <w:pPr>
-              <w:jc w:val="left"/>
-            </w:pPr>
-            <w:r>
-              <w:rPr>
-                <w:rFonts w:ascii="TimeNewRoman" w:hAnsi="TimeNewRoman"/>
-                <w:sz w:val="30"/>
-              </w:rPr>
-              <w:t>46+49=</w:t>
-            </w:r>
-          </w:p>
-        </w:tc>
-      </w:tr>
-      <w:tr>
-        <w:tc>
-          <w:tcPr>
-            <w:tcW w:type="dxa" w:w="1987"/>
-          </w:tcPr>
-          <w:p>
-            <w:pPr>
-              <w:jc w:val="left"/>
-            </w:pPr>
-            <w:r>
-              <w:rPr>
-                <w:rFonts w:ascii="TimeNewRoman" w:hAnsi="TimeNewRoman"/>
-                <w:sz w:val="30"/>
-              </w:rPr>
-              <w:t>88-19=</w:t>
-            </w:r>
-          </w:p>
-        </w:tc>
-        <w:tc>
-          <w:tcPr>
-            <w:tcW w:type="dxa" w:w="1987"/>
-          </w:tcPr>
-          <w:p>
-            <w:pPr>
-              <w:jc w:val="left"/>
-            </w:pPr>
-            <w:r>
-              <w:rPr>
-                <w:rFonts w:ascii="TimeNewRoman" w:hAnsi="TimeNewRoman"/>
-                <w:sz w:val="30"/>
-              </w:rPr>
-              <w:t>67-8=</w:t>
-            </w:r>
-          </w:p>
-        </w:tc>
-        <w:tc>
-          <w:tcPr>
-            <w:tcW w:type="dxa" w:w="1987"/>
-          </w:tcPr>
-          <w:p>
-            <w:pPr>
-              <w:jc w:val="left"/>
-            </w:pPr>
-            <w:r>
-              <w:rPr>
-                <w:rFonts w:ascii="TimeNewRoman" w:hAnsi="TimeNewRoman"/>
-                <w:sz w:val="30"/>
-              </w:rPr>
-              <w:t>38+3=</w:t>
-            </w:r>
-          </w:p>
-        </w:tc>
-        <w:tc>
-          <w:tcPr>
-            <w:tcW w:type="dxa" w:w="1987"/>
-          </w:tcPr>
-          <w:p>
-            <w:pPr>
-              <w:jc w:val="left"/>
-            </w:pPr>
-            <w:r>
-              <w:rPr>
-                <w:rFonts w:ascii="TimeNewRoman" w:hAnsi="TimeNewRoman"/>
-                <w:sz w:val="30"/>
-              </w:rPr>
-              <w:t>46+18=</w:t>
-            </w:r>
-          </w:p>
-        </w:tc>
-        <w:tc>
-          <w:tcPr>
-            <w:tcW w:type="dxa" w:w="1987"/>
-          </w:tcPr>
-          <w:p>
-            <w:pPr>
-              <w:jc w:val="left"/>
-            </w:pPr>
-            <w:r>
-              <w:rPr>
-                <w:rFonts w:ascii="TimeNewRoman" w:hAnsi="TimeNewRoman"/>
-                <w:sz w:val="30"/>
-              </w:rPr>
-              <w:t>90-33=</w:t>
+              <w:t>19+29=</w:t>
             </w:r>
           </w:p>
         </w:tc>

</xml_diff>

<commit_message>
Update master to output generated at cc542f5
</commit_message>
<xml_diff>
--- a/adc_sbb_within_100.docx
+++ b/adc_sbb_within_100.docx
@@ -40,7 +40,7 @@
                 <w:rFonts w:ascii="TimeNewRoman" w:hAnsi="TimeNewRoman"/>
                 <w:sz w:val="30"/>
               </w:rPr>
-              <w:t>85-68=</w:t>
+              <w:t>54+28=</w:t>
             </w:r>
           </w:p>
         </w:tc>
@@ -57,7 +57,7 @@
                 <w:rFonts w:ascii="TimeNewRoman" w:hAnsi="TimeNewRoman"/>
                 <w:sz w:val="30"/>
               </w:rPr>
-              <w:t>52-28=</w:t>
+              <w:t>94-56=</w:t>
             </w:r>
           </w:p>
         </w:tc>
@@ -74,7 +74,7 @@
                 <w:rFonts w:ascii="TimeNewRoman" w:hAnsi="TimeNewRoman"/>
                 <w:sz w:val="30"/>
               </w:rPr>
-              <w:t>91-34=</w:t>
+              <w:t>9+72=</w:t>
             </w:r>
           </w:p>
         </w:tc>
@@ -91,7 +91,7 @@
                 <w:rFonts w:ascii="TimeNewRoman" w:hAnsi="TimeNewRoman"/>
                 <w:sz w:val="30"/>
               </w:rPr>
-              <w:t>81-9=</w:t>
+              <w:t>41-2=</w:t>
             </w:r>
           </w:p>
         </w:tc>
@@ -108,7 +108,7 @@
                 <w:rFonts w:ascii="TimeNewRoman" w:hAnsi="TimeNewRoman"/>
                 <w:sz w:val="30"/>
               </w:rPr>
-              <w:t>60-52=</w:t>
+              <w:t>79+13=</w:t>
             </w:r>
           </w:p>
         </w:tc>
@@ -127,7 +127,7 @@
                 <w:rFonts w:ascii="TimeNewRoman" w:hAnsi="TimeNewRoman"/>
                 <w:sz w:val="30"/>
               </w:rPr>
-              <w:t>38+49=</w:t>
+              <w:t>70-2=</w:t>
             </w:r>
           </w:p>
         </w:tc>
@@ -144,7 +144,7 @@
                 <w:rFonts w:ascii="TimeNewRoman" w:hAnsi="TimeNewRoman"/>
                 <w:sz w:val="30"/>
               </w:rPr>
-              <w:t>29+17=</w:t>
+              <w:t>41-28=</w:t>
             </w:r>
           </w:p>
         </w:tc>
@@ -161,7 +161,7 @@
                 <w:rFonts w:ascii="TimeNewRoman" w:hAnsi="TimeNewRoman"/>
                 <w:sz w:val="30"/>
               </w:rPr>
-              <w:t>70-23=</w:t>
+              <w:t>37+15=</w:t>
             </w:r>
           </w:p>
         </w:tc>
@@ -178,7 +178,7 @@
                 <w:rFonts w:ascii="TimeNewRoman" w:hAnsi="TimeNewRoman"/>
                 <w:sz w:val="30"/>
               </w:rPr>
-              <w:t>61-33=</w:t>
+              <w:t>39+56=</w:t>
             </w:r>
           </w:p>
         </w:tc>
@@ -195,7 +195,7 @@
                 <w:rFonts w:ascii="TimeNewRoman" w:hAnsi="TimeNewRoman"/>
                 <w:sz w:val="30"/>
               </w:rPr>
-              <w:t>68+17=</w:t>
+              <w:t>64-46=</w:t>
             </w:r>
           </w:p>
         </w:tc>
@@ -214,7 +214,7 @@
                 <w:rFonts w:ascii="TimeNewRoman" w:hAnsi="TimeNewRoman"/>
                 <w:sz w:val="30"/>
               </w:rPr>
-              <w:t>62-26=</w:t>
+              <w:t>5+48=</w:t>
             </w:r>
           </w:p>
         </w:tc>
@@ -231,7 +231,7 @@
                 <w:rFonts w:ascii="TimeNewRoman" w:hAnsi="TimeNewRoman"/>
                 <w:sz w:val="30"/>
               </w:rPr>
-              <w:t>39+57=</w:t>
+              <w:t>81-35=</w:t>
             </w:r>
           </w:p>
         </w:tc>
@@ -248,7 +248,7 @@
                 <w:rFonts w:ascii="TimeNewRoman" w:hAnsi="TimeNewRoman"/>
                 <w:sz w:val="30"/>
               </w:rPr>
-              <w:t>88-39=</w:t>
+              <w:t>41-9=</w:t>
             </w:r>
           </w:p>
         </w:tc>
@@ -265,7 +265,7 @@
                 <w:rFonts w:ascii="TimeNewRoman" w:hAnsi="TimeNewRoman"/>
                 <w:sz w:val="30"/>
               </w:rPr>
-              <w:t>74-9=</w:t>
+              <w:t>37+44=</w:t>
             </w:r>
           </w:p>
         </w:tc>
@@ -282,7 +282,7 @@
                 <w:rFonts w:ascii="TimeNewRoman" w:hAnsi="TimeNewRoman"/>
                 <w:sz w:val="30"/>
               </w:rPr>
-              <w:t>13+38=</w:t>
+              <w:t>60-44=</w:t>
             </w:r>
           </w:p>
         </w:tc>
@@ -301,7 +301,7 @@
                 <w:rFonts w:ascii="TimeNewRoman" w:hAnsi="TimeNewRoman"/>
                 <w:sz w:val="30"/>
               </w:rPr>
-              <w:t>8+38=</w:t>
+              <w:t>90-32=</w:t>
             </w:r>
           </w:p>
         </w:tc>
@@ -318,1295 +318,7 @@
                 <w:rFonts w:ascii="TimeNewRoman" w:hAnsi="TimeNewRoman"/>
                 <w:sz w:val="30"/>
               </w:rPr>
-              <w:t>7+6=</w:t>
-            </w:r>
-          </w:p>
-        </w:tc>
-        <w:tc>
-          <w:tcPr>
-            <w:tcW w:type="dxa" w:w="1987"/>
-          </w:tcPr>
-          <w:p>
-            <w:pPr>
-              <w:jc w:val="left"/>
-            </w:pPr>
-            <w:r>
-              <w:rPr>
-                <w:rFonts w:ascii="TimeNewRoman" w:hAnsi="TimeNewRoman"/>
-                <w:sz w:val="30"/>
-              </w:rPr>
-              <w:t>95-49=</w:t>
-            </w:r>
-          </w:p>
-        </w:tc>
-        <w:tc>
-          <w:tcPr>
-            <w:tcW w:type="dxa" w:w="1987"/>
-          </w:tcPr>
-          <w:p>
-            <w:pPr>
-              <w:jc w:val="left"/>
-            </w:pPr>
-            <w:r>
-              <w:rPr>
-                <w:rFonts w:ascii="TimeNewRoman" w:hAnsi="TimeNewRoman"/>
-                <w:sz w:val="30"/>
-              </w:rPr>
-              <w:t>63+9=</w:t>
-            </w:r>
-          </w:p>
-        </w:tc>
-        <w:tc>
-          <w:tcPr>
-            <w:tcW w:type="dxa" w:w="1987"/>
-          </w:tcPr>
-          <w:p>
-            <w:pPr>
-              <w:jc w:val="left"/>
-            </w:pPr>
-            <w:r>
-              <w:rPr>
-                <w:rFonts w:ascii="TimeNewRoman" w:hAnsi="TimeNewRoman"/>
-                <w:sz w:val="30"/>
-              </w:rPr>
-              <w:t>16+28=</w:t>
-            </w:r>
-          </w:p>
-        </w:tc>
-      </w:tr>
-      <w:tr>
-        <w:tc>
-          <w:tcPr>
-            <w:tcW w:type="dxa" w:w="1987"/>
-          </w:tcPr>
-          <w:p>
-            <w:pPr>
-              <w:jc w:val="left"/>
-            </w:pPr>
-            <w:r>
-              <w:rPr>
-                <w:rFonts w:ascii="TimeNewRoman" w:hAnsi="TimeNewRoman"/>
-                <w:sz w:val="30"/>
-              </w:rPr>
-              <w:t>63-16=</w:t>
-            </w:r>
-          </w:p>
-        </w:tc>
-        <w:tc>
-          <w:tcPr>
-            <w:tcW w:type="dxa" w:w="1987"/>
-          </w:tcPr>
-          <w:p>
-            <w:pPr>
-              <w:jc w:val="left"/>
-            </w:pPr>
-            <w:r>
-              <w:rPr>
-                <w:rFonts w:ascii="TimeNewRoman" w:hAnsi="TimeNewRoman"/>
-                <w:sz w:val="30"/>
-              </w:rPr>
-              <w:t>38+25=</w:t>
-            </w:r>
-          </w:p>
-        </w:tc>
-        <w:tc>
-          <w:tcPr>
-            <w:tcW w:type="dxa" w:w="1987"/>
-          </w:tcPr>
-          <w:p>
-            <w:pPr>
-              <w:jc w:val="left"/>
-            </w:pPr>
-            <w:r>
-              <w:rPr>
-                <w:rFonts w:ascii="TimeNewRoman" w:hAnsi="TimeNewRoman"/>
-                <w:sz w:val="30"/>
-              </w:rPr>
-              <w:t>46+37=</w:t>
-            </w:r>
-          </w:p>
-        </w:tc>
-        <w:tc>
-          <w:tcPr>
-            <w:tcW w:type="dxa" w:w="1987"/>
-          </w:tcPr>
-          <w:p>
-            <w:pPr>
-              <w:jc w:val="left"/>
-            </w:pPr>
-            <w:r>
-              <w:rPr>
-                <w:rFonts w:ascii="TimeNewRoman" w:hAnsi="TimeNewRoman"/>
-                <w:sz w:val="30"/>
-              </w:rPr>
-              <w:t>18+53=</w:t>
-            </w:r>
-          </w:p>
-        </w:tc>
-        <w:tc>
-          <w:tcPr>
-            <w:tcW w:type="dxa" w:w="1987"/>
-          </w:tcPr>
-          <w:p>
-            <w:pPr>
-              <w:jc w:val="left"/>
-            </w:pPr>
-            <w:r>
-              <w:rPr>
-                <w:rFonts w:ascii="TimeNewRoman" w:hAnsi="TimeNewRoman"/>
-                <w:sz w:val="30"/>
-              </w:rPr>
-              <w:t>92-68=</w:t>
-            </w:r>
-          </w:p>
-        </w:tc>
-      </w:tr>
-      <w:tr>
-        <w:tc>
-          <w:tcPr>
-            <w:tcW w:type="dxa" w:w="1987"/>
-          </w:tcPr>
-          <w:p>
-            <w:pPr>
-              <w:jc w:val="left"/>
-            </w:pPr>
-            <w:r>
-              <w:rPr>
-                <w:rFonts w:ascii="TimeNewRoman" w:hAnsi="TimeNewRoman"/>
-                <w:sz w:val="30"/>
-              </w:rPr>
-              <w:t>43+9=</w:t>
-            </w:r>
-          </w:p>
-        </w:tc>
-        <w:tc>
-          <w:tcPr>
-            <w:tcW w:type="dxa" w:w="1987"/>
-          </w:tcPr>
-          <w:p>
-            <w:pPr>
-              <w:jc w:val="left"/>
-            </w:pPr>
-            <w:r>
-              <w:rPr>
-                <w:rFonts w:ascii="TimeNewRoman" w:hAnsi="TimeNewRoman"/>
-                <w:sz w:val="30"/>
-              </w:rPr>
-              <w:t>17+24=</w:t>
-            </w:r>
-          </w:p>
-        </w:tc>
-        <w:tc>
-          <w:tcPr>
-            <w:tcW w:type="dxa" w:w="1987"/>
-          </w:tcPr>
-          <w:p>
-            <w:pPr>
-              <w:jc w:val="left"/>
-            </w:pPr>
-            <w:r>
-              <w:rPr>
-                <w:rFonts w:ascii="TimeNewRoman" w:hAnsi="TimeNewRoman"/>
-                <w:sz w:val="30"/>
-              </w:rPr>
-              <w:t>46+35=</w:t>
-            </w:r>
-          </w:p>
-        </w:tc>
-        <w:tc>
-          <w:tcPr>
-            <w:tcW w:type="dxa" w:w="1987"/>
-          </w:tcPr>
-          <w:p>
-            <w:pPr>
-              <w:jc w:val="left"/>
-            </w:pPr>
-            <w:r>
-              <w:rPr>
-                <w:rFonts w:ascii="TimeNewRoman" w:hAnsi="TimeNewRoman"/>
-                <w:sz w:val="30"/>
-              </w:rPr>
-              <w:t>9+44=</w:t>
-            </w:r>
-          </w:p>
-        </w:tc>
-        <w:tc>
-          <w:tcPr>
-            <w:tcW w:type="dxa" w:w="1987"/>
-          </w:tcPr>
-          <w:p>
-            <w:pPr>
-              <w:jc w:val="left"/>
-            </w:pPr>
-            <w:r>
-              <w:rPr>
-                <w:rFonts w:ascii="TimeNewRoman" w:hAnsi="TimeNewRoman"/>
-                <w:sz w:val="30"/>
-              </w:rPr>
-              <w:t>8+9=</w:t>
-            </w:r>
-          </w:p>
-        </w:tc>
-      </w:tr>
-      <w:tr>
-        <w:tc>
-          <w:tcPr>
-            <w:tcW w:type="dxa" w:w="1987"/>
-          </w:tcPr>
-          <w:p>
-            <w:pPr>
-              <w:jc w:val="left"/>
-            </w:pPr>
-            <w:r>
-              <w:rPr>
-                <w:rFonts w:ascii="TimeNewRoman" w:hAnsi="TimeNewRoman"/>
-                <w:sz w:val="30"/>
-              </w:rPr>
-              <w:t>35-19=</w:t>
-            </w:r>
-          </w:p>
-        </w:tc>
-        <w:tc>
-          <w:tcPr>
-            <w:tcW w:type="dxa" w:w="1987"/>
-          </w:tcPr>
-          <w:p>
-            <w:pPr>
-              <w:jc w:val="left"/>
-            </w:pPr>
-            <w:r>
-              <w:rPr>
-                <w:rFonts w:ascii="TimeNewRoman" w:hAnsi="TimeNewRoman"/>
-                <w:sz w:val="30"/>
-              </w:rPr>
-              <w:t>62-7=</w:t>
-            </w:r>
-          </w:p>
-        </w:tc>
-        <w:tc>
-          <w:tcPr>
-            <w:tcW w:type="dxa" w:w="1987"/>
-          </w:tcPr>
-          <w:p>
-            <w:pPr>
-              <w:jc w:val="left"/>
-            </w:pPr>
-            <w:r>
-              <w:rPr>
-                <w:rFonts w:ascii="TimeNewRoman" w:hAnsi="TimeNewRoman"/>
-                <w:sz w:val="30"/>
-              </w:rPr>
-              <w:t>64+28=</w:t>
-            </w:r>
-          </w:p>
-        </w:tc>
-        <w:tc>
-          <w:tcPr>
-            <w:tcW w:type="dxa" w:w="1987"/>
-          </w:tcPr>
-          <w:p>
-            <w:pPr>
-              <w:jc w:val="left"/>
-            </w:pPr>
-            <w:r>
-              <w:rPr>
-                <w:rFonts w:ascii="TimeNewRoman" w:hAnsi="TimeNewRoman"/>
-                <w:sz w:val="30"/>
-              </w:rPr>
-              <w:t>57+18=</w:t>
-            </w:r>
-          </w:p>
-        </w:tc>
-        <w:tc>
-          <w:tcPr>
-            <w:tcW w:type="dxa" w:w="1987"/>
-          </w:tcPr>
-          <w:p>
-            <w:pPr>
-              <w:jc w:val="left"/>
-            </w:pPr>
-            <w:r>
-              <w:rPr>
-                <w:rFonts w:ascii="TimeNewRoman" w:hAnsi="TimeNewRoman"/>
-                <w:sz w:val="30"/>
-              </w:rPr>
-              <w:t>27+26=</w:t>
-            </w:r>
-          </w:p>
-        </w:tc>
-      </w:tr>
-      <w:tr>
-        <w:tc>
-          <w:tcPr>
-            <w:tcW w:type="dxa" w:w="1987"/>
-          </w:tcPr>
-          <w:p>
-            <w:pPr>
-              <w:jc w:val="left"/>
-            </w:pPr>
-            <w:r>
-              <w:rPr>
-                <w:rFonts w:ascii="TimeNewRoman" w:hAnsi="TimeNewRoman"/>
-                <w:sz w:val="30"/>
-              </w:rPr>
-              <w:t>72-25=</w:t>
-            </w:r>
-          </w:p>
-        </w:tc>
-        <w:tc>
-          <w:tcPr>
-            <w:tcW w:type="dxa" w:w="1987"/>
-          </w:tcPr>
-          <w:p>
-            <w:pPr>
-              <w:jc w:val="left"/>
-            </w:pPr>
-            <w:r>
-              <w:rPr>
-                <w:rFonts w:ascii="TimeNewRoman" w:hAnsi="TimeNewRoman"/>
-                <w:sz w:val="30"/>
-              </w:rPr>
-              <w:t>95-57=</w:t>
-            </w:r>
-          </w:p>
-        </w:tc>
-        <w:tc>
-          <w:tcPr>
-            <w:tcW w:type="dxa" w:w="1987"/>
-          </w:tcPr>
-          <w:p>
-            <w:pPr>
-              <w:jc w:val="left"/>
-            </w:pPr>
-            <w:r>
-              <w:rPr>
-                <w:rFonts w:ascii="TimeNewRoman" w:hAnsi="TimeNewRoman"/>
-                <w:sz w:val="30"/>
-              </w:rPr>
-              <w:t>6+17=</w:t>
-            </w:r>
-          </w:p>
-        </w:tc>
-        <w:tc>
-          <w:tcPr>
-            <w:tcW w:type="dxa" w:w="1987"/>
-          </w:tcPr>
-          <w:p>
-            <w:pPr>
-              <w:jc w:val="left"/>
-            </w:pPr>
-            <w:r>
-              <w:rPr>
-                <w:rFonts w:ascii="TimeNewRoman" w:hAnsi="TimeNewRoman"/>
-                <w:sz w:val="30"/>
-              </w:rPr>
-              <w:t>16+57=</w:t>
-            </w:r>
-          </w:p>
-        </w:tc>
-        <w:tc>
-          <w:tcPr>
-            <w:tcW w:type="dxa" w:w="1987"/>
-          </w:tcPr>
-          <w:p>
-            <w:pPr>
-              <w:jc w:val="left"/>
-            </w:pPr>
-            <w:r>
-              <w:rPr>
-                <w:rFonts w:ascii="TimeNewRoman" w:hAnsi="TimeNewRoman"/>
-                <w:sz w:val="30"/>
-              </w:rPr>
-              <w:t>18+7=</w:t>
-            </w:r>
-          </w:p>
-        </w:tc>
-      </w:tr>
-      <w:tr>
-        <w:tc>
-          <w:tcPr>
-            <w:tcW w:type="dxa" w:w="1987"/>
-          </w:tcPr>
-          <w:p>
-            <w:pPr>
-              <w:jc w:val="left"/>
-            </w:pPr>
-            <w:r>
-              <w:rPr>
-                <w:rFonts w:ascii="TimeNewRoman" w:hAnsi="TimeNewRoman"/>
-                <w:sz w:val="30"/>
-              </w:rPr>
-              <w:t>62-7=</w:t>
-            </w:r>
-          </w:p>
-        </w:tc>
-        <w:tc>
-          <w:tcPr>
-            <w:tcW w:type="dxa" w:w="1987"/>
-          </w:tcPr>
-          <w:p>
-            <w:pPr>
-              <w:jc w:val="left"/>
-            </w:pPr>
-            <w:r>
-              <w:rPr>
-                <w:rFonts w:ascii="TimeNewRoman" w:hAnsi="TimeNewRoman"/>
-                <w:sz w:val="30"/>
-              </w:rPr>
-              <w:t>49+2=</w:t>
-            </w:r>
-          </w:p>
-        </w:tc>
-        <w:tc>
-          <w:tcPr>
-            <w:tcW w:type="dxa" w:w="1987"/>
-          </w:tcPr>
-          <w:p>
-            <w:pPr>
-              <w:jc w:val="left"/>
-            </w:pPr>
-            <w:r>
-              <w:rPr>
-                <w:rFonts w:ascii="TimeNewRoman" w:hAnsi="TimeNewRoman"/>
-                <w:sz w:val="30"/>
-              </w:rPr>
-              <w:t>70-41=</w:t>
-            </w:r>
-          </w:p>
-        </w:tc>
-        <w:tc>
-          <w:tcPr>
-            <w:tcW w:type="dxa" w:w="1987"/>
-          </w:tcPr>
-          <w:p>
-            <w:pPr>
-              <w:jc w:val="left"/>
-            </w:pPr>
-            <w:r>
-              <w:rPr>
-                <w:rFonts w:ascii="TimeNewRoman" w:hAnsi="TimeNewRoman"/>
-                <w:sz w:val="30"/>
-              </w:rPr>
-              <w:t>83-74=</w:t>
-            </w:r>
-          </w:p>
-        </w:tc>
-        <w:tc>
-          <w:tcPr>
-            <w:tcW w:type="dxa" w:w="1987"/>
-          </w:tcPr>
-          <w:p>
-            <w:pPr>
-              <w:jc w:val="left"/>
-            </w:pPr>
-            <w:r>
-              <w:rPr>
-                <w:rFonts w:ascii="TimeNewRoman" w:hAnsi="TimeNewRoman"/>
-                <w:sz w:val="30"/>
-              </w:rPr>
-              <w:t>72-9=</w:t>
-            </w:r>
-          </w:p>
-        </w:tc>
-      </w:tr>
-      <w:tr>
-        <w:tc>
-          <w:tcPr>
-            <w:tcW w:type="dxa" w:w="1987"/>
-          </w:tcPr>
-          <w:p>
-            <w:pPr>
-              <w:jc w:val="left"/>
-            </w:pPr>
-            <w:r>
-              <w:rPr>
-                <w:rFonts w:ascii="TimeNewRoman" w:hAnsi="TimeNewRoman"/>
-                <w:sz w:val="30"/>
-              </w:rPr>
-              <w:t>20-1=</w:t>
-            </w:r>
-          </w:p>
-        </w:tc>
-        <w:tc>
-          <w:tcPr>
-            <w:tcW w:type="dxa" w:w="1987"/>
-          </w:tcPr>
-          <w:p>
-            <w:pPr>
-              <w:jc w:val="left"/>
-            </w:pPr>
-            <w:r>
-              <w:rPr>
-                <w:rFonts w:ascii="TimeNewRoman" w:hAnsi="TimeNewRoman"/>
-                <w:sz w:val="30"/>
-              </w:rPr>
-              <w:t>4+88=</w:t>
-            </w:r>
-          </w:p>
-        </w:tc>
-        <w:tc>
-          <w:tcPr>
-            <w:tcW w:type="dxa" w:w="1987"/>
-          </w:tcPr>
-          <w:p>
-            <w:pPr>
-              <w:jc w:val="left"/>
-            </w:pPr>
-            <w:r>
-              <w:rPr>
-                <w:rFonts w:ascii="TimeNewRoman" w:hAnsi="TimeNewRoman"/>
-                <w:sz w:val="30"/>
-              </w:rPr>
-              <w:t>65+26=</w:t>
-            </w:r>
-          </w:p>
-        </w:tc>
-        <w:tc>
-          <w:tcPr>
-            <w:tcW w:type="dxa" w:w="1987"/>
-          </w:tcPr>
-          <w:p>
-            <w:pPr>
-              <w:jc w:val="left"/>
-            </w:pPr>
-            <w:r>
-              <w:rPr>
-                <w:rFonts w:ascii="TimeNewRoman" w:hAnsi="TimeNewRoman"/>
-                <w:sz w:val="30"/>
-              </w:rPr>
-              <w:t>28+68=</w:t>
-            </w:r>
-          </w:p>
-        </w:tc>
-        <w:tc>
-          <w:tcPr>
-            <w:tcW w:type="dxa" w:w="1987"/>
-          </w:tcPr>
-          <w:p>
-            <w:pPr>
-              <w:jc w:val="left"/>
-            </w:pPr>
-            <w:r>
-              <w:rPr>
-                <w:rFonts w:ascii="TimeNewRoman" w:hAnsi="TimeNewRoman"/>
-                <w:sz w:val="30"/>
-              </w:rPr>
-              <w:t>75+9=</w:t>
-            </w:r>
-          </w:p>
-        </w:tc>
-      </w:tr>
-      <w:tr>
-        <w:tc>
-          <w:tcPr>
-            <w:tcW w:type="dxa" w:w="1987"/>
-          </w:tcPr>
-          <w:p>
-            <w:pPr>
-              <w:jc w:val="left"/>
-            </w:pPr>
-            <w:r>
-              <w:rPr>
-                <w:rFonts w:ascii="TimeNewRoman" w:hAnsi="TimeNewRoman"/>
-                <w:sz w:val="30"/>
-              </w:rPr>
-              <w:t>69+18=</w:t>
-            </w:r>
-          </w:p>
-        </w:tc>
-        <w:tc>
-          <w:tcPr>
-            <w:tcW w:type="dxa" w:w="1987"/>
-          </w:tcPr>
-          <w:p>
-            <w:pPr>
-              <w:jc w:val="left"/>
-            </w:pPr>
-            <w:r>
-              <w:rPr>
-                <w:rFonts w:ascii="TimeNewRoman" w:hAnsi="TimeNewRoman"/>
-                <w:sz w:val="30"/>
-              </w:rPr>
-              <w:t>25+7=</w:t>
-            </w:r>
-          </w:p>
-        </w:tc>
-        <w:tc>
-          <w:tcPr>
-            <w:tcW w:type="dxa" w:w="1987"/>
-          </w:tcPr>
-          <w:p>
-            <w:pPr>
-              <w:jc w:val="left"/>
-            </w:pPr>
-            <w:r>
-              <w:rPr>
-                <w:rFonts w:ascii="TimeNewRoman" w:hAnsi="TimeNewRoman"/>
-                <w:sz w:val="30"/>
-              </w:rPr>
-              <w:t>72-69=</w:t>
-            </w:r>
-          </w:p>
-        </w:tc>
-        <w:tc>
-          <w:tcPr>
-            <w:tcW w:type="dxa" w:w="1987"/>
-          </w:tcPr>
-          <w:p>
-            <w:pPr>
-              <w:jc w:val="left"/>
-            </w:pPr>
-            <w:r>
-              <w:rPr>
-                <w:rFonts w:ascii="TimeNewRoman" w:hAnsi="TimeNewRoman"/>
-                <w:sz w:val="30"/>
-              </w:rPr>
-              <w:t>7+24=</w:t>
-            </w:r>
-          </w:p>
-        </w:tc>
-        <w:tc>
-          <w:tcPr>
-            <w:tcW w:type="dxa" w:w="1987"/>
-          </w:tcPr>
-          <w:p>
-            <w:pPr>
-              <w:jc w:val="left"/>
-            </w:pPr>
-            <w:r>
-              <w:rPr>
-                <w:rFonts w:ascii="TimeNewRoman" w:hAnsi="TimeNewRoman"/>
-                <w:sz w:val="30"/>
-              </w:rPr>
-              <w:t>76-19=</w:t>
-            </w:r>
-          </w:p>
-        </w:tc>
-      </w:tr>
-      <w:tr>
-        <w:tc>
-          <w:tcPr>
-            <w:tcW w:type="dxa" w:w="1987"/>
-          </w:tcPr>
-          <w:p>
-            <w:pPr>
-              <w:jc w:val="left"/>
-            </w:pPr>
-            <w:r>
-              <w:rPr>
-                <w:rFonts w:ascii="TimeNewRoman" w:hAnsi="TimeNewRoman"/>
-                <w:sz w:val="30"/>
-              </w:rPr>
-              <w:t>85-56=</w:t>
-            </w:r>
-          </w:p>
-        </w:tc>
-        <w:tc>
-          <w:tcPr>
-            <w:tcW w:type="dxa" w:w="1987"/>
-          </w:tcPr>
-          <w:p>
-            <w:pPr>
-              <w:jc w:val="left"/>
-            </w:pPr>
-            <w:r>
-              <w:rPr>
-                <w:rFonts w:ascii="TimeNewRoman" w:hAnsi="TimeNewRoman"/>
-                <w:sz w:val="30"/>
-              </w:rPr>
-              <w:t>6+36=</w:t>
-            </w:r>
-          </w:p>
-        </w:tc>
-        <w:tc>
-          <w:tcPr>
-            <w:tcW w:type="dxa" w:w="1987"/>
-          </w:tcPr>
-          <w:p>
-            <w:pPr>
-              <w:jc w:val="left"/>
-            </w:pPr>
-            <w:r>
-              <w:rPr>
-                <w:rFonts w:ascii="TimeNewRoman" w:hAnsi="TimeNewRoman"/>
-                <w:sz w:val="30"/>
-              </w:rPr>
-              <w:t>50-31=</w:t>
-            </w:r>
-          </w:p>
-        </w:tc>
-        <w:tc>
-          <w:tcPr>
-            <w:tcW w:type="dxa" w:w="1987"/>
-          </w:tcPr>
-          <w:p>
-            <w:pPr>
-              <w:jc w:val="left"/>
-            </w:pPr>
-            <w:r>
-              <w:rPr>
-                <w:rFonts w:ascii="TimeNewRoman" w:hAnsi="TimeNewRoman"/>
-                <w:sz w:val="30"/>
-              </w:rPr>
-              <w:t>68+6=</w:t>
-            </w:r>
-          </w:p>
-        </w:tc>
-        <w:tc>
-          <w:tcPr>
-            <w:tcW w:type="dxa" w:w="1987"/>
-          </w:tcPr>
-          <w:p>
-            <w:pPr>
-              <w:jc w:val="left"/>
-            </w:pPr>
-            <w:r>
-              <w:rPr>
-                <w:rFonts w:ascii="TimeNewRoman" w:hAnsi="TimeNewRoman"/>
-                <w:sz w:val="30"/>
-              </w:rPr>
-              <w:t>70-36=</w:t>
-            </w:r>
-          </w:p>
-        </w:tc>
-      </w:tr>
-      <w:tr>
-        <w:tc>
-          <w:tcPr>
-            <w:tcW w:type="dxa" w:w="1987"/>
-          </w:tcPr>
-          <w:p>
-            <w:pPr>
-              <w:jc w:val="left"/>
-            </w:pPr>
-            <w:r>
-              <w:rPr>
-                <w:rFonts w:ascii="TimeNewRoman" w:hAnsi="TimeNewRoman"/>
-                <w:sz w:val="30"/>
-              </w:rPr>
-              <w:t>62-34=</w:t>
-            </w:r>
-          </w:p>
-        </w:tc>
-        <w:tc>
-          <w:tcPr>
-            <w:tcW w:type="dxa" w:w="1987"/>
-          </w:tcPr>
-          <w:p>
-            <w:pPr>
-              <w:jc w:val="left"/>
-            </w:pPr>
-            <w:r>
-              <w:rPr>
-                <w:rFonts w:ascii="TimeNewRoman" w:hAnsi="TimeNewRoman"/>
-                <w:sz w:val="30"/>
-              </w:rPr>
-              <w:t>59+16=</w:t>
-            </w:r>
-          </w:p>
-        </w:tc>
-        <w:tc>
-          <w:tcPr>
-            <w:tcW w:type="dxa" w:w="1987"/>
-          </w:tcPr>
-          <w:p>
-            <w:pPr>
-              <w:jc w:val="left"/>
-            </w:pPr>
-            <w:r>
-              <w:rPr>
-                <w:rFonts w:ascii="TimeNewRoman" w:hAnsi="TimeNewRoman"/>
-                <w:sz w:val="30"/>
-              </w:rPr>
-              <w:t>70-17=</w:t>
-            </w:r>
-          </w:p>
-        </w:tc>
-        <w:tc>
-          <w:tcPr>
-            <w:tcW w:type="dxa" w:w="1987"/>
-          </w:tcPr>
-          <w:p>
-            <w:pPr>
-              <w:jc w:val="left"/>
-            </w:pPr>
-            <w:r>
-              <w:rPr>
-                <w:rFonts w:ascii="TimeNewRoman" w:hAnsi="TimeNewRoman"/>
-                <w:sz w:val="30"/>
-              </w:rPr>
-              <w:t>53+19=</w:t>
-            </w:r>
-          </w:p>
-        </w:tc>
-        <w:tc>
-          <w:tcPr>
-            <w:tcW w:type="dxa" w:w="1987"/>
-          </w:tcPr>
-          <w:p>
-            <w:pPr>
-              <w:jc w:val="left"/>
-            </w:pPr>
-            <w:r>
-              <w:rPr>
-                <w:rFonts w:ascii="TimeNewRoman" w:hAnsi="TimeNewRoman"/>
-                <w:sz w:val="30"/>
-              </w:rPr>
-              <w:t>65-29=</w:t>
-            </w:r>
-          </w:p>
-        </w:tc>
-      </w:tr>
-      <w:tr>
-        <w:tc>
-          <w:tcPr>
-            <w:tcW w:type="dxa" w:w="1987"/>
-          </w:tcPr>
-          <w:p>
-            <w:pPr>
-              <w:jc w:val="left"/>
-            </w:pPr>
-            <w:r>
-              <w:rPr>
-                <w:rFonts w:ascii="TimeNewRoman" w:hAnsi="TimeNewRoman"/>
-                <w:sz w:val="30"/>
-              </w:rPr>
-              <w:t>23-14=</w:t>
-            </w:r>
-          </w:p>
-        </w:tc>
-        <w:tc>
-          <w:tcPr>
-            <w:tcW w:type="dxa" w:w="1987"/>
-          </w:tcPr>
-          <w:p>
-            <w:pPr>
-              <w:jc w:val="left"/>
-            </w:pPr>
-            <w:r>
-              <w:rPr>
-                <w:rFonts w:ascii="TimeNewRoman" w:hAnsi="TimeNewRoman"/>
-                <w:sz w:val="30"/>
-              </w:rPr>
-              <w:t>8+27=</w:t>
-            </w:r>
-          </w:p>
-        </w:tc>
-        <w:tc>
-          <w:tcPr>
-            <w:tcW w:type="dxa" w:w="1987"/>
-          </w:tcPr>
-          <w:p>
-            <w:pPr>
-              <w:jc w:val="left"/>
-            </w:pPr>
-            <w:r>
-              <w:rPr>
-                <w:rFonts w:ascii="TimeNewRoman" w:hAnsi="TimeNewRoman"/>
-                <w:sz w:val="30"/>
-              </w:rPr>
-              <w:t>17+67=</w:t>
-            </w:r>
-          </w:p>
-        </w:tc>
-        <w:tc>
-          <w:tcPr>
-            <w:tcW w:type="dxa" w:w="1987"/>
-          </w:tcPr>
-          <w:p>
-            <w:pPr>
-              <w:jc w:val="left"/>
-            </w:pPr>
-            <w:r>
-              <w:rPr>
-                <w:rFonts w:ascii="TimeNewRoman" w:hAnsi="TimeNewRoman"/>
-                <w:sz w:val="30"/>
-              </w:rPr>
-              <w:t>59+34=</w:t>
-            </w:r>
-          </w:p>
-        </w:tc>
-        <w:tc>
-          <w:tcPr>
-            <w:tcW w:type="dxa" w:w="1987"/>
-          </w:tcPr>
-          <w:p>
-            <w:pPr>
-              <w:jc w:val="left"/>
-            </w:pPr>
-            <w:r>
-              <w:rPr>
-                <w:rFonts w:ascii="TimeNewRoman" w:hAnsi="TimeNewRoman"/>
-                <w:sz w:val="30"/>
-              </w:rPr>
-              <w:t>80-17=</w:t>
-            </w:r>
-          </w:p>
-        </w:tc>
-      </w:tr>
-      <w:tr>
-        <w:tc>
-          <w:tcPr>
-            <w:tcW w:type="dxa" w:w="1987"/>
-          </w:tcPr>
-          <w:p>
-            <w:pPr>
-              <w:jc w:val="left"/>
-            </w:pPr>
-            <w:r>
-              <w:rPr>
-                <w:rFonts w:ascii="TimeNewRoman" w:hAnsi="TimeNewRoman"/>
-                <w:sz w:val="30"/>
-              </w:rPr>
-              <w:t>92-54=</w:t>
-            </w:r>
-          </w:p>
-        </w:tc>
-        <w:tc>
-          <w:tcPr>
-            <w:tcW w:type="dxa" w:w="1987"/>
-          </w:tcPr>
-          <w:p>
-            <w:pPr>
-              <w:jc w:val="left"/>
-            </w:pPr>
-            <w:r>
-              <w:rPr>
-                <w:rFonts w:ascii="TimeNewRoman" w:hAnsi="TimeNewRoman"/>
-                <w:sz w:val="30"/>
-              </w:rPr>
-              <w:t>94-7=</w:t>
-            </w:r>
-          </w:p>
-        </w:tc>
-        <w:tc>
-          <w:tcPr>
-            <w:tcW w:type="dxa" w:w="1987"/>
-          </w:tcPr>
-          <w:p>
-            <w:pPr>
-              <w:jc w:val="left"/>
-            </w:pPr>
-            <w:r>
-              <w:rPr>
-                <w:rFonts w:ascii="TimeNewRoman" w:hAnsi="TimeNewRoman"/>
-                <w:sz w:val="30"/>
-              </w:rPr>
-              <w:t>7+74=</w:t>
-            </w:r>
-          </w:p>
-        </w:tc>
-        <w:tc>
-          <w:tcPr>
-            <w:tcW w:type="dxa" w:w="1987"/>
-          </w:tcPr>
-          <w:p>
-            <w:pPr>
-              <w:jc w:val="left"/>
-            </w:pPr>
-            <w:r>
-              <w:rPr>
-                <w:rFonts w:ascii="TimeNewRoman" w:hAnsi="TimeNewRoman"/>
-                <w:sz w:val="30"/>
-              </w:rPr>
-              <w:t>50-36=</w:t>
-            </w:r>
-          </w:p>
-        </w:tc>
-        <w:tc>
-          <w:tcPr>
-            <w:tcW w:type="dxa" w:w="1987"/>
-          </w:tcPr>
-          <w:p>
-            <w:pPr>
-              <w:jc w:val="left"/>
-            </w:pPr>
-            <w:r>
-              <w:rPr>
-                <w:rFonts w:ascii="TimeNewRoman" w:hAnsi="TimeNewRoman"/>
-                <w:sz w:val="30"/>
-              </w:rPr>
-              <w:t>24+29=</w:t>
-            </w:r>
-          </w:p>
-        </w:tc>
-      </w:tr>
-      <w:tr>
-        <w:tc>
-          <w:tcPr>
-            <w:tcW w:type="dxa" w:w="1987"/>
-          </w:tcPr>
-          <w:p>
-            <w:pPr>
-              <w:jc w:val="left"/>
-            </w:pPr>
-            <w:r>
-              <w:rPr>
-                <w:rFonts w:ascii="TimeNewRoman" w:hAnsi="TimeNewRoman"/>
-                <w:sz w:val="30"/>
-              </w:rPr>
-              <w:t>70-19=</w:t>
-            </w:r>
-          </w:p>
-        </w:tc>
-        <w:tc>
-          <w:tcPr>
-            <w:tcW w:type="dxa" w:w="1987"/>
-          </w:tcPr>
-          <w:p>
-            <w:pPr>
-              <w:jc w:val="left"/>
-            </w:pPr>
-            <w:r>
-              <w:rPr>
-                <w:rFonts w:ascii="TimeNewRoman" w:hAnsi="TimeNewRoman"/>
-                <w:sz w:val="30"/>
-              </w:rPr>
-              <w:t>51-43=</w:t>
-            </w:r>
-          </w:p>
-        </w:tc>
-        <w:tc>
-          <w:tcPr>
-            <w:tcW w:type="dxa" w:w="1987"/>
-          </w:tcPr>
-          <w:p>
-            <w:pPr>
-              <w:jc w:val="left"/>
-            </w:pPr>
-            <w:r>
-              <w:rPr>
-                <w:rFonts w:ascii="TimeNewRoman" w:hAnsi="TimeNewRoman"/>
-                <w:sz w:val="30"/>
-              </w:rPr>
-              <w:t>71-58=</w:t>
-            </w:r>
-          </w:p>
-        </w:tc>
-        <w:tc>
-          <w:tcPr>
-            <w:tcW w:type="dxa" w:w="1987"/>
-          </w:tcPr>
-          <w:p>
-            <w:pPr>
-              <w:jc w:val="left"/>
-            </w:pPr>
-            <w:r>
-              <w:rPr>
-                <w:rFonts w:ascii="TimeNewRoman" w:hAnsi="TimeNewRoman"/>
-                <w:sz w:val="30"/>
-              </w:rPr>
-              <w:t>28+34=</w:t>
-            </w:r>
-          </w:p>
-        </w:tc>
-        <w:tc>
-          <w:tcPr>
-            <w:tcW w:type="dxa" w:w="1987"/>
-          </w:tcPr>
-          <w:p>
-            <w:pPr>
-              <w:jc w:val="left"/>
-            </w:pPr>
-            <w:r>
-              <w:rPr>
-                <w:rFonts w:ascii="TimeNewRoman" w:hAnsi="TimeNewRoman"/>
-                <w:sz w:val="30"/>
-              </w:rPr>
-              <w:t>5+9=</w:t>
-            </w:r>
-          </w:p>
-        </w:tc>
-      </w:tr>
-      <w:tr>
-        <w:tc>
-          <w:tcPr>
-            <w:tcW w:type="dxa" w:w="1987"/>
-          </w:tcPr>
-          <w:p>
-            <w:pPr>
-              <w:jc w:val="left"/>
-            </w:pPr>
-            <w:r>
-              <w:rPr>
-                <w:rFonts w:ascii="TimeNewRoman" w:hAnsi="TimeNewRoman"/>
-                <w:sz w:val="30"/>
-              </w:rPr>
-              <w:t>29+8=</w:t>
-            </w:r>
-          </w:p>
-        </w:tc>
-        <w:tc>
-          <w:tcPr>
-            <w:tcW w:type="dxa" w:w="1987"/>
-          </w:tcPr>
-          <w:p>
-            <w:pPr>
-              <w:jc w:val="left"/>
-            </w:pPr>
-            <w:r>
-              <w:rPr>
-                <w:rFonts w:ascii="TimeNewRoman" w:hAnsi="TimeNewRoman"/>
-                <w:sz w:val="30"/>
-              </w:rPr>
-              <w:t>86-68=</w:t>
-            </w:r>
-          </w:p>
-        </w:tc>
-        <w:tc>
-          <w:tcPr>
-            <w:tcW w:type="dxa" w:w="1987"/>
-          </w:tcPr>
-          <w:p>
-            <w:pPr>
-              <w:jc w:val="left"/>
-            </w:pPr>
-            <w:r>
-              <w:rPr>
-                <w:rFonts w:ascii="TimeNewRoman" w:hAnsi="TimeNewRoman"/>
-                <w:sz w:val="30"/>
-              </w:rPr>
-              <w:t>15+57=</w:t>
-            </w:r>
-          </w:p>
-        </w:tc>
-        <w:tc>
-          <w:tcPr>
-            <w:tcW w:type="dxa" w:w="1987"/>
-          </w:tcPr>
-          <w:p>
-            <w:pPr>
-              <w:jc w:val="left"/>
-            </w:pPr>
-            <w:r>
-              <w:rPr>
-                <w:rFonts w:ascii="TimeNewRoman" w:hAnsi="TimeNewRoman"/>
-                <w:sz w:val="30"/>
-              </w:rPr>
-              <w:t>72-35=</w:t>
-            </w:r>
-          </w:p>
-        </w:tc>
-        <w:tc>
-          <w:tcPr>
-            <w:tcW w:type="dxa" w:w="1987"/>
-          </w:tcPr>
-          <w:p>
-            <w:pPr>
-              <w:jc w:val="left"/>
-            </w:pPr>
-            <w:r>
-              <w:rPr>
-                <w:rFonts w:ascii="TimeNewRoman" w:hAnsi="TimeNewRoman"/>
-                <w:sz w:val="30"/>
-              </w:rPr>
-              <w:t>58+16=</w:t>
-            </w:r>
-          </w:p>
-        </w:tc>
-      </w:tr>
-      <w:tr>
-        <w:tc>
-          <w:tcPr>
-            <w:tcW w:type="dxa" w:w="1987"/>
-          </w:tcPr>
-          <w:p>
-            <w:pPr>
-              <w:jc w:val="left"/>
-            </w:pPr>
-            <w:r>
-              <w:rPr>
-                <w:rFonts w:ascii="TimeNewRoman" w:hAnsi="TimeNewRoman"/>
-                <w:sz w:val="30"/>
-              </w:rPr>
-              <w:t>7+77=</w:t>
-            </w:r>
-          </w:p>
-        </w:tc>
-        <w:tc>
-          <w:tcPr>
-            <w:tcW w:type="dxa" w:w="1987"/>
-          </w:tcPr>
-          <w:p>
-            <w:pPr>
-              <w:jc w:val="left"/>
-            </w:pPr>
-            <w:r>
-              <w:rPr>
-                <w:rFonts w:ascii="TimeNewRoman" w:hAnsi="TimeNewRoman"/>
-                <w:sz w:val="30"/>
-              </w:rPr>
-              <w:t>94-86=</w:t>
-            </w:r>
-          </w:p>
-        </w:tc>
-        <w:tc>
-          <w:tcPr>
-            <w:tcW w:type="dxa" w:w="1987"/>
-          </w:tcPr>
-          <w:p>
-            <w:pPr>
-              <w:jc w:val="left"/>
-            </w:pPr>
-            <w:r>
-              <w:rPr>
-                <w:rFonts w:ascii="TimeNewRoman" w:hAnsi="TimeNewRoman"/>
-                <w:sz w:val="30"/>
-              </w:rPr>
-              <w:t>63-47=</w:t>
-            </w:r>
-          </w:p>
-        </w:tc>
-        <w:tc>
-          <w:tcPr>
-            <w:tcW w:type="dxa" w:w="1987"/>
-          </w:tcPr>
-          <w:p>
-            <w:pPr>
-              <w:jc w:val="left"/>
-            </w:pPr>
-            <w:r>
-              <w:rPr>
-                <w:rFonts w:ascii="TimeNewRoman" w:hAnsi="TimeNewRoman"/>
-                <w:sz w:val="30"/>
-              </w:rPr>
-              <w:t>65-49=</w:t>
-            </w:r>
-          </w:p>
-        </w:tc>
-        <w:tc>
-          <w:tcPr>
-            <w:tcW w:type="dxa" w:w="1987"/>
-          </w:tcPr>
-          <w:p>
-            <w:pPr>
-              <w:jc w:val="left"/>
-            </w:pPr>
-            <w:r>
-              <w:rPr>
-                <w:rFonts w:ascii="TimeNewRoman" w:hAnsi="TimeNewRoman"/>
-                <w:sz w:val="30"/>
-              </w:rPr>
-              <w:t>91-4=</w:t>
-            </w:r>
-          </w:p>
-        </w:tc>
-      </w:tr>
-      <w:tr>
-        <w:tc>
-          <w:tcPr>
-            <w:tcW w:type="dxa" w:w="1987"/>
-          </w:tcPr>
-          <w:p>
-            <w:pPr>
-              <w:jc w:val="left"/>
-            </w:pPr>
-            <w:r>
-              <w:rPr>
-                <w:rFonts w:ascii="TimeNewRoman" w:hAnsi="TimeNewRoman"/>
-                <w:sz w:val="30"/>
-              </w:rPr>
-              <w:t>19+3=</w:t>
+              <w:t>50-13=</w:t>
             </w:r>
           </w:p>
         </w:tc>
@@ -1640,7 +352,7 @@
                 <w:rFonts w:ascii="TimeNewRoman" w:hAnsi="TimeNewRoman"/>
                 <w:sz w:val="30"/>
               </w:rPr>
-              <w:t>37+7=</w:t>
+              <w:t>27-9=</w:t>
             </w:r>
           </w:p>
         </w:tc>
@@ -1657,24 +369,7 @@
                 <w:rFonts w:ascii="TimeNewRoman" w:hAnsi="TimeNewRoman"/>
                 <w:sz w:val="30"/>
               </w:rPr>
-              <w:t>55-39=</w:t>
-            </w:r>
-          </w:p>
-        </w:tc>
-        <w:tc>
-          <w:tcPr>
-            <w:tcW w:type="dxa" w:w="1987"/>
-          </w:tcPr>
-          <w:p>
-            <w:pPr>
-              <w:jc w:val="left"/>
-            </w:pPr>
-            <w:r>
-              <w:rPr>
-                <w:rFonts w:ascii="TimeNewRoman" w:hAnsi="TimeNewRoman"/>
-                <w:sz w:val="30"/>
-              </w:rPr>
-              <w:t>37+7=</w:t>
+              <w:t>31-15=</w:t>
             </w:r>
           </w:p>
         </w:tc>
@@ -1693,7 +388,7 @@
                 <w:rFonts w:ascii="TimeNewRoman" w:hAnsi="TimeNewRoman"/>
                 <w:sz w:val="30"/>
               </w:rPr>
-              <w:t>50-18=</w:t>
+              <w:t>46-17=</w:t>
             </w:r>
           </w:p>
         </w:tc>
@@ -1710,7 +405,7 @@
                 <w:rFonts w:ascii="TimeNewRoman" w:hAnsi="TimeNewRoman"/>
                 <w:sz w:val="30"/>
               </w:rPr>
-              <w:t>87-29=</w:t>
+              <w:t>71-42=</w:t>
             </w:r>
           </w:p>
         </w:tc>
@@ -1727,7 +422,7 @@
                 <w:rFonts w:ascii="TimeNewRoman" w:hAnsi="TimeNewRoman"/>
                 <w:sz w:val="30"/>
               </w:rPr>
-              <w:t>80-48=</w:t>
+              <w:t>92-64=</w:t>
             </w:r>
           </w:p>
         </w:tc>
@@ -1744,7 +439,7 @@
                 <w:rFonts w:ascii="TimeNewRoman" w:hAnsi="TimeNewRoman"/>
                 <w:sz w:val="30"/>
               </w:rPr>
-              <w:t>31-13=</w:t>
+              <w:t>29+29=</w:t>
             </w:r>
           </w:p>
         </w:tc>
@@ -1761,7 +456,1312 @@
                 <w:rFonts w:ascii="TimeNewRoman" w:hAnsi="TimeNewRoman"/>
                 <w:sz w:val="30"/>
               </w:rPr>
-              <w:t>47+25=</w:t>
+              <w:t>57-49=</w:t>
+            </w:r>
+          </w:p>
+        </w:tc>
+      </w:tr>
+      <w:tr>
+        <w:tc>
+          <w:tcPr>
+            <w:tcW w:type="dxa" w:w="1987"/>
+          </w:tcPr>
+          <w:p>
+            <w:pPr>
+              <w:jc w:val="left"/>
+            </w:pPr>
+            <w:r>
+              <w:rPr>
+                <w:rFonts w:ascii="TimeNewRoman" w:hAnsi="TimeNewRoman"/>
+                <w:sz w:val="30"/>
+              </w:rPr>
+              <w:t>9+52=</w:t>
+            </w:r>
+          </w:p>
+        </w:tc>
+        <w:tc>
+          <w:tcPr>
+            <w:tcW w:type="dxa" w:w="1987"/>
+          </w:tcPr>
+          <w:p>
+            <w:pPr>
+              <w:jc w:val="left"/>
+            </w:pPr>
+            <w:r>
+              <w:rPr>
+                <w:rFonts w:ascii="TimeNewRoman" w:hAnsi="TimeNewRoman"/>
+                <w:sz w:val="30"/>
+              </w:rPr>
+              <w:t>3+49=</w:t>
+            </w:r>
+          </w:p>
+        </w:tc>
+        <w:tc>
+          <w:tcPr>
+            <w:tcW w:type="dxa" w:w="1987"/>
+          </w:tcPr>
+          <w:p>
+            <w:pPr>
+              <w:jc w:val="left"/>
+            </w:pPr>
+            <w:r>
+              <w:rPr>
+                <w:rFonts w:ascii="TimeNewRoman" w:hAnsi="TimeNewRoman"/>
+                <w:sz w:val="30"/>
+              </w:rPr>
+              <w:t>48+18=</w:t>
+            </w:r>
+          </w:p>
+        </w:tc>
+        <w:tc>
+          <w:tcPr>
+            <w:tcW w:type="dxa" w:w="1987"/>
+          </w:tcPr>
+          <w:p>
+            <w:pPr>
+              <w:jc w:val="left"/>
+            </w:pPr>
+            <w:r>
+              <w:rPr>
+                <w:rFonts w:ascii="TimeNewRoman" w:hAnsi="TimeNewRoman"/>
+                <w:sz w:val="30"/>
+              </w:rPr>
+              <w:t>80-54=</w:t>
+            </w:r>
+          </w:p>
+        </w:tc>
+        <w:tc>
+          <w:tcPr>
+            <w:tcW w:type="dxa" w:w="1987"/>
+          </w:tcPr>
+          <w:p>
+            <w:pPr>
+              <w:jc w:val="left"/>
+            </w:pPr>
+            <w:r>
+              <w:rPr>
+                <w:rFonts w:ascii="TimeNewRoman" w:hAnsi="TimeNewRoman"/>
+                <w:sz w:val="30"/>
+              </w:rPr>
+              <w:t>48-29=</w:t>
+            </w:r>
+          </w:p>
+        </w:tc>
+      </w:tr>
+      <w:tr>
+        <w:tc>
+          <w:tcPr>
+            <w:tcW w:type="dxa" w:w="1987"/>
+          </w:tcPr>
+          <w:p>
+            <w:pPr>
+              <w:jc w:val="left"/>
+            </w:pPr>
+            <w:r>
+              <w:rPr>
+                <w:rFonts w:ascii="TimeNewRoman" w:hAnsi="TimeNewRoman"/>
+                <w:sz w:val="30"/>
+              </w:rPr>
+              <w:t>67-8=</w:t>
+            </w:r>
+          </w:p>
+        </w:tc>
+        <w:tc>
+          <w:tcPr>
+            <w:tcW w:type="dxa" w:w="1987"/>
+          </w:tcPr>
+          <w:p>
+            <w:pPr>
+              <w:jc w:val="left"/>
+            </w:pPr>
+            <w:r>
+              <w:rPr>
+                <w:rFonts w:ascii="TimeNewRoman" w:hAnsi="TimeNewRoman"/>
+                <w:sz w:val="30"/>
+              </w:rPr>
+              <w:t>91-6=</w:t>
+            </w:r>
+          </w:p>
+        </w:tc>
+        <w:tc>
+          <w:tcPr>
+            <w:tcW w:type="dxa" w:w="1987"/>
+          </w:tcPr>
+          <w:p>
+            <w:pPr>
+              <w:jc w:val="left"/>
+            </w:pPr>
+            <w:r>
+              <w:rPr>
+                <w:rFonts w:ascii="TimeNewRoman" w:hAnsi="TimeNewRoman"/>
+                <w:sz w:val="30"/>
+              </w:rPr>
+              <w:t>73-37=</w:t>
+            </w:r>
+          </w:p>
+        </w:tc>
+        <w:tc>
+          <w:tcPr>
+            <w:tcW w:type="dxa" w:w="1987"/>
+          </w:tcPr>
+          <w:p>
+            <w:pPr>
+              <w:jc w:val="left"/>
+            </w:pPr>
+            <w:r>
+              <w:rPr>
+                <w:rFonts w:ascii="TimeNewRoman" w:hAnsi="TimeNewRoman"/>
+                <w:sz w:val="30"/>
+              </w:rPr>
+              <w:t>89+3=</w:t>
+            </w:r>
+          </w:p>
+        </w:tc>
+        <w:tc>
+          <w:tcPr>
+            <w:tcW w:type="dxa" w:w="1987"/>
+          </w:tcPr>
+          <w:p>
+            <w:pPr>
+              <w:jc w:val="left"/>
+            </w:pPr>
+            <w:r>
+              <w:rPr>
+                <w:rFonts w:ascii="TimeNewRoman" w:hAnsi="TimeNewRoman"/>
+                <w:sz w:val="30"/>
+              </w:rPr>
+              <w:t>12+9=</w:t>
+            </w:r>
+          </w:p>
+        </w:tc>
+      </w:tr>
+      <w:tr>
+        <w:tc>
+          <w:tcPr>
+            <w:tcW w:type="dxa" w:w="1987"/>
+          </w:tcPr>
+          <w:p>
+            <w:pPr>
+              <w:jc w:val="left"/>
+            </w:pPr>
+            <w:r>
+              <w:rPr>
+                <w:rFonts w:ascii="TimeNewRoman" w:hAnsi="TimeNewRoman"/>
+                <w:sz w:val="30"/>
+              </w:rPr>
+              <w:t>23-19=</w:t>
+            </w:r>
+          </w:p>
+        </w:tc>
+        <w:tc>
+          <w:tcPr>
+            <w:tcW w:type="dxa" w:w="1987"/>
+          </w:tcPr>
+          <w:p>
+            <w:pPr>
+              <w:jc w:val="left"/>
+            </w:pPr>
+            <w:r>
+              <w:rPr>
+                <w:rFonts w:ascii="TimeNewRoman" w:hAnsi="TimeNewRoman"/>
+                <w:sz w:val="30"/>
+              </w:rPr>
+              <w:t>38+54=</w:t>
+            </w:r>
+          </w:p>
+        </w:tc>
+        <w:tc>
+          <w:tcPr>
+            <w:tcW w:type="dxa" w:w="1987"/>
+          </w:tcPr>
+          <w:p>
+            <w:pPr>
+              <w:jc w:val="left"/>
+            </w:pPr>
+            <w:r>
+              <w:rPr>
+                <w:rFonts w:ascii="TimeNewRoman" w:hAnsi="TimeNewRoman"/>
+                <w:sz w:val="30"/>
+              </w:rPr>
+              <w:t>46+28=</w:t>
+            </w:r>
+          </w:p>
+        </w:tc>
+        <w:tc>
+          <w:tcPr>
+            <w:tcW w:type="dxa" w:w="1987"/>
+          </w:tcPr>
+          <w:p>
+            <w:pPr>
+              <w:jc w:val="left"/>
+            </w:pPr>
+            <w:r>
+              <w:rPr>
+                <w:rFonts w:ascii="TimeNewRoman" w:hAnsi="TimeNewRoman"/>
+                <w:sz w:val="30"/>
+              </w:rPr>
+              <w:t>79+3=</w:t>
+            </w:r>
+          </w:p>
+        </w:tc>
+        <w:tc>
+          <w:tcPr>
+            <w:tcW w:type="dxa" w:w="1987"/>
+          </w:tcPr>
+          <w:p>
+            <w:pPr>
+              <w:jc w:val="left"/>
+            </w:pPr>
+            <w:r>
+              <w:rPr>
+                <w:rFonts w:ascii="TimeNewRoman" w:hAnsi="TimeNewRoman"/>
+                <w:sz w:val="30"/>
+              </w:rPr>
+              <w:t>71-32=</w:t>
+            </w:r>
+          </w:p>
+        </w:tc>
+      </w:tr>
+      <w:tr>
+        <w:tc>
+          <w:tcPr>
+            <w:tcW w:type="dxa" w:w="1987"/>
+          </w:tcPr>
+          <w:p>
+            <w:pPr>
+              <w:jc w:val="left"/>
+            </w:pPr>
+            <w:r>
+              <w:rPr>
+                <w:rFonts w:ascii="TimeNewRoman" w:hAnsi="TimeNewRoman"/>
+                <w:sz w:val="30"/>
+              </w:rPr>
+              <w:t>15+36=</w:t>
+            </w:r>
+          </w:p>
+        </w:tc>
+        <w:tc>
+          <w:tcPr>
+            <w:tcW w:type="dxa" w:w="1987"/>
+          </w:tcPr>
+          <w:p>
+            <w:pPr>
+              <w:jc w:val="left"/>
+            </w:pPr>
+            <w:r>
+              <w:rPr>
+                <w:rFonts w:ascii="TimeNewRoman" w:hAnsi="TimeNewRoman"/>
+                <w:sz w:val="30"/>
+              </w:rPr>
+              <w:t>3+58=</w:t>
+            </w:r>
+          </w:p>
+        </w:tc>
+        <w:tc>
+          <w:tcPr>
+            <w:tcW w:type="dxa" w:w="1987"/>
+          </w:tcPr>
+          <w:p>
+            <w:pPr>
+              <w:jc w:val="left"/>
+            </w:pPr>
+            <w:r>
+              <w:rPr>
+                <w:rFonts w:ascii="TimeNewRoman" w:hAnsi="TimeNewRoman"/>
+                <w:sz w:val="30"/>
+              </w:rPr>
+              <w:t>44-36=</w:t>
+            </w:r>
+          </w:p>
+        </w:tc>
+        <w:tc>
+          <w:tcPr>
+            <w:tcW w:type="dxa" w:w="1987"/>
+          </w:tcPr>
+          <w:p>
+            <w:pPr>
+              <w:jc w:val="left"/>
+            </w:pPr>
+            <w:r>
+              <w:rPr>
+                <w:rFonts w:ascii="TimeNewRoman" w:hAnsi="TimeNewRoman"/>
+                <w:sz w:val="30"/>
+              </w:rPr>
+              <w:t>8+15=</w:t>
+            </w:r>
+          </w:p>
+        </w:tc>
+        <w:tc>
+          <w:tcPr>
+            <w:tcW w:type="dxa" w:w="1987"/>
+          </w:tcPr>
+          <w:p>
+            <w:pPr>
+              <w:jc w:val="left"/>
+            </w:pPr>
+            <w:r>
+              <w:rPr>
+                <w:rFonts w:ascii="TimeNewRoman" w:hAnsi="TimeNewRoman"/>
+                <w:sz w:val="30"/>
+              </w:rPr>
+              <w:t>5+6=</w:t>
+            </w:r>
+          </w:p>
+        </w:tc>
+      </w:tr>
+      <w:tr>
+        <w:tc>
+          <w:tcPr>
+            <w:tcW w:type="dxa" w:w="1987"/>
+          </w:tcPr>
+          <w:p>
+            <w:pPr>
+              <w:jc w:val="left"/>
+            </w:pPr>
+            <w:r>
+              <w:rPr>
+                <w:rFonts w:ascii="TimeNewRoman" w:hAnsi="TimeNewRoman"/>
+                <w:sz w:val="30"/>
+              </w:rPr>
+              <w:t>23+48=</w:t>
+            </w:r>
+          </w:p>
+        </w:tc>
+        <w:tc>
+          <w:tcPr>
+            <w:tcW w:type="dxa" w:w="1987"/>
+          </w:tcPr>
+          <w:p>
+            <w:pPr>
+              <w:jc w:val="left"/>
+            </w:pPr>
+            <w:r>
+              <w:rPr>
+                <w:rFonts w:ascii="TimeNewRoman" w:hAnsi="TimeNewRoman"/>
+                <w:sz w:val="30"/>
+              </w:rPr>
+              <w:t>63-26=</w:t>
+            </w:r>
+          </w:p>
+        </w:tc>
+        <w:tc>
+          <w:tcPr>
+            <w:tcW w:type="dxa" w:w="1987"/>
+          </w:tcPr>
+          <w:p>
+            <w:pPr>
+              <w:jc w:val="left"/>
+            </w:pPr>
+            <w:r>
+              <w:rPr>
+                <w:rFonts w:ascii="TimeNewRoman" w:hAnsi="TimeNewRoman"/>
+                <w:sz w:val="30"/>
+              </w:rPr>
+              <w:t>40-32=</w:t>
+            </w:r>
+          </w:p>
+        </w:tc>
+        <w:tc>
+          <w:tcPr>
+            <w:tcW w:type="dxa" w:w="1987"/>
+          </w:tcPr>
+          <w:p>
+            <w:pPr>
+              <w:jc w:val="left"/>
+            </w:pPr>
+            <w:r>
+              <w:rPr>
+                <w:rFonts w:ascii="TimeNewRoman" w:hAnsi="TimeNewRoman"/>
+                <w:sz w:val="30"/>
+              </w:rPr>
+              <w:t>14+77=</w:t>
+            </w:r>
+          </w:p>
+        </w:tc>
+        <w:tc>
+          <w:tcPr>
+            <w:tcW w:type="dxa" w:w="1987"/>
+          </w:tcPr>
+          <w:p>
+            <w:pPr>
+              <w:jc w:val="left"/>
+            </w:pPr>
+            <w:r>
+              <w:rPr>
+                <w:rFonts w:ascii="TimeNewRoman" w:hAnsi="TimeNewRoman"/>
+                <w:sz w:val="30"/>
+              </w:rPr>
+              <w:t>91-5=</w:t>
+            </w:r>
+          </w:p>
+        </w:tc>
+      </w:tr>
+      <w:tr>
+        <w:tc>
+          <w:tcPr>
+            <w:tcW w:type="dxa" w:w="1987"/>
+          </w:tcPr>
+          <w:p>
+            <w:pPr>
+              <w:jc w:val="left"/>
+            </w:pPr>
+            <w:r>
+              <w:rPr>
+                <w:rFonts w:ascii="TimeNewRoman" w:hAnsi="TimeNewRoman"/>
+                <w:sz w:val="30"/>
+              </w:rPr>
+              <w:t>91-7=</w:t>
+            </w:r>
+          </w:p>
+        </w:tc>
+        <w:tc>
+          <w:tcPr>
+            <w:tcW w:type="dxa" w:w="1987"/>
+          </w:tcPr>
+          <w:p>
+            <w:pPr>
+              <w:jc w:val="left"/>
+            </w:pPr>
+            <w:r>
+              <w:rPr>
+                <w:rFonts w:ascii="TimeNewRoman" w:hAnsi="TimeNewRoman"/>
+                <w:sz w:val="30"/>
+              </w:rPr>
+              <w:t>15+66=</w:t>
+            </w:r>
+          </w:p>
+        </w:tc>
+        <w:tc>
+          <w:tcPr>
+            <w:tcW w:type="dxa" w:w="1987"/>
+          </w:tcPr>
+          <w:p>
+            <w:pPr>
+              <w:jc w:val="left"/>
+            </w:pPr>
+            <w:r>
+              <w:rPr>
+                <w:rFonts w:ascii="TimeNewRoman" w:hAnsi="TimeNewRoman"/>
+                <w:sz w:val="30"/>
+              </w:rPr>
+              <w:t>56-7=</w:t>
+            </w:r>
+          </w:p>
+        </w:tc>
+        <w:tc>
+          <w:tcPr>
+            <w:tcW w:type="dxa" w:w="1987"/>
+          </w:tcPr>
+          <w:p>
+            <w:pPr>
+              <w:jc w:val="left"/>
+            </w:pPr>
+            <w:r>
+              <w:rPr>
+                <w:rFonts w:ascii="TimeNewRoman" w:hAnsi="TimeNewRoman"/>
+                <w:sz w:val="30"/>
+              </w:rPr>
+              <w:t>38+37=</w:t>
+            </w:r>
+          </w:p>
+        </w:tc>
+        <w:tc>
+          <w:tcPr>
+            <w:tcW w:type="dxa" w:w="1987"/>
+          </w:tcPr>
+          <w:p>
+            <w:pPr>
+              <w:jc w:val="left"/>
+            </w:pPr>
+            <w:r>
+              <w:rPr>
+                <w:rFonts w:ascii="TimeNewRoman" w:hAnsi="TimeNewRoman"/>
+                <w:sz w:val="30"/>
+              </w:rPr>
+              <w:t>81-28=</w:t>
+            </w:r>
+          </w:p>
+        </w:tc>
+      </w:tr>
+      <w:tr>
+        <w:tc>
+          <w:tcPr>
+            <w:tcW w:type="dxa" w:w="1987"/>
+          </w:tcPr>
+          <w:p>
+            <w:pPr>
+              <w:jc w:val="left"/>
+            </w:pPr>
+            <w:r>
+              <w:rPr>
+                <w:rFonts w:ascii="TimeNewRoman" w:hAnsi="TimeNewRoman"/>
+                <w:sz w:val="30"/>
+              </w:rPr>
+              <w:t>54-6=</w:t>
+            </w:r>
+          </w:p>
+        </w:tc>
+        <w:tc>
+          <w:tcPr>
+            <w:tcW w:type="dxa" w:w="1987"/>
+          </w:tcPr>
+          <w:p>
+            <w:pPr>
+              <w:jc w:val="left"/>
+            </w:pPr>
+            <w:r>
+              <w:rPr>
+                <w:rFonts w:ascii="TimeNewRoman" w:hAnsi="TimeNewRoman"/>
+                <w:sz w:val="30"/>
+              </w:rPr>
+              <w:t>80-35=</w:t>
+            </w:r>
+          </w:p>
+        </w:tc>
+        <w:tc>
+          <w:tcPr>
+            <w:tcW w:type="dxa" w:w="1987"/>
+          </w:tcPr>
+          <w:p>
+            <w:pPr>
+              <w:jc w:val="left"/>
+            </w:pPr>
+            <w:r>
+              <w:rPr>
+                <w:rFonts w:ascii="TimeNewRoman" w:hAnsi="TimeNewRoman"/>
+                <w:sz w:val="30"/>
+              </w:rPr>
+              <w:t>70-24=</w:t>
+            </w:r>
+          </w:p>
+        </w:tc>
+        <w:tc>
+          <w:tcPr>
+            <w:tcW w:type="dxa" w:w="1987"/>
+          </w:tcPr>
+          <w:p>
+            <w:pPr>
+              <w:jc w:val="left"/>
+            </w:pPr>
+            <w:r>
+              <w:rPr>
+                <w:rFonts w:ascii="TimeNewRoman" w:hAnsi="TimeNewRoman"/>
+                <w:sz w:val="30"/>
+              </w:rPr>
+              <w:t>27+19=</w:t>
+            </w:r>
+          </w:p>
+        </w:tc>
+        <w:tc>
+          <w:tcPr>
+            <w:tcW w:type="dxa" w:w="1987"/>
+          </w:tcPr>
+          <w:p>
+            <w:pPr>
+              <w:jc w:val="left"/>
+            </w:pPr>
+            <w:r>
+              <w:rPr>
+                <w:rFonts w:ascii="TimeNewRoman" w:hAnsi="TimeNewRoman"/>
+                <w:sz w:val="30"/>
+              </w:rPr>
+              <w:t>23-17=</w:t>
+            </w:r>
+          </w:p>
+        </w:tc>
+      </w:tr>
+      <w:tr>
+        <w:tc>
+          <w:tcPr>
+            <w:tcW w:type="dxa" w:w="1987"/>
+          </w:tcPr>
+          <w:p>
+            <w:pPr>
+              <w:jc w:val="left"/>
+            </w:pPr>
+            <w:r>
+              <w:rPr>
+                <w:rFonts w:ascii="TimeNewRoman" w:hAnsi="TimeNewRoman"/>
+                <w:sz w:val="30"/>
+              </w:rPr>
+              <w:t>5+39=</w:t>
+            </w:r>
+          </w:p>
+        </w:tc>
+        <w:tc>
+          <w:tcPr>
+            <w:tcW w:type="dxa" w:w="1987"/>
+          </w:tcPr>
+          <w:p>
+            <w:pPr>
+              <w:jc w:val="left"/>
+            </w:pPr>
+            <w:r>
+              <w:rPr>
+                <w:rFonts w:ascii="TimeNewRoman" w:hAnsi="TimeNewRoman"/>
+                <w:sz w:val="30"/>
+              </w:rPr>
+              <w:t>18+28=</w:t>
+            </w:r>
+          </w:p>
+        </w:tc>
+        <w:tc>
+          <w:tcPr>
+            <w:tcW w:type="dxa" w:w="1987"/>
+          </w:tcPr>
+          <w:p>
+            <w:pPr>
+              <w:jc w:val="left"/>
+            </w:pPr>
+            <w:r>
+              <w:rPr>
+                <w:rFonts w:ascii="TimeNewRoman" w:hAnsi="TimeNewRoman"/>
+                <w:sz w:val="30"/>
+              </w:rPr>
+              <w:t>6+7=</w:t>
+            </w:r>
+          </w:p>
+        </w:tc>
+        <w:tc>
+          <w:tcPr>
+            <w:tcW w:type="dxa" w:w="1987"/>
+          </w:tcPr>
+          <w:p>
+            <w:pPr>
+              <w:jc w:val="left"/>
+            </w:pPr>
+            <w:r>
+              <w:rPr>
+                <w:rFonts w:ascii="TimeNewRoman" w:hAnsi="TimeNewRoman"/>
+                <w:sz w:val="30"/>
+              </w:rPr>
+              <w:t>8+86=</w:t>
+            </w:r>
+          </w:p>
+        </w:tc>
+        <w:tc>
+          <w:tcPr>
+            <w:tcW w:type="dxa" w:w="1987"/>
+          </w:tcPr>
+          <w:p>
+            <w:pPr>
+              <w:jc w:val="left"/>
+            </w:pPr>
+            <w:r>
+              <w:rPr>
+                <w:rFonts w:ascii="TimeNewRoman" w:hAnsi="TimeNewRoman"/>
+                <w:sz w:val="30"/>
+              </w:rPr>
+              <w:t>49+15=</w:t>
+            </w:r>
+          </w:p>
+        </w:tc>
+      </w:tr>
+      <w:tr>
+        <w:tc>
+          <w:tcPr>
+            <w:tcW w:type="dxa" w:w="1987"/>
+          </w:tcPr>
+          <w:p>
+            <w:pPr>
+              <w:jc w:val="left"/>
+            </w:pPr>
+            <w:r>
+              <w:rPr>
+                <w:rFonts w:ascii="TimeNewRoman" w:hAnsi="TimeNewRoman"/>
+                <w:sz w:val="30"/>
+              </w:rPr>
+              <w:t>42-38=</w:t>
+            </w:r>
+          </w:p>
+        </w:tc>
+        <w:tc>
+          <w:tcPr>
+            <w:tcW w:type="dxa" w:w="1987"/>
+          </w:tcPr>
+          <w:p>
+            <w:pPr>
+              <w:jc w:val="left"/>
+            </w:pPr>
+            <w:r>
+              <w:rPr>
+                <w:rFonts w:ascii="TimeNewRoman" w:hAnsi="TimeNewRoman"/>
+                <w:sz w:val="30"/>
+              </w:rPr>
+              <w:t>55-28=</w:t>
+            </w:r>
+          </w:p>
+        </w:tc>
+        <w:tc>
+          <w:tcPr>
+            <w:tcW w:type="dxa" w:w="1987"/>
+          </w:tcPr>
+          <w:p>
+            <w:pPr>
+              <w:jc w:val="left"/>
+            </w:pPr>
+            <w:r>
+              <w:rPr>
+                <w:rFonts w:ascii="TimeNewRoman" w:hAnsi="TimeNewRoman"/>
+                <w:sz w:val="30"/>
+              </w:rPr>
+              <w:t>83-45=</w:t>
+            </w:r>
+          </w:p>
+        </w:tc>
+        <w:tc>
+          <w:tcPr>
+            <w:tcW w:type="dxa" w:w="1987"/>
+          </w:tcPr>
+          <w:p>
+            <w:pPr>
+              <w:jc w:val="left"/>
+            </w:pPr>
+            <w:r>
+              <w:rPr>
+                <w:rFonts w:ascii="TimeNewRoman" w:hAnsi="TimeNewRoman"/>
+                <w:sz w:val="30"/>
+              </w:rPr>
+              <w:t>4+57=</w:t>
+            </w:r>
+          </w:p>
+        </w:tc>
+        <w:tc>
+          <w:tcPr>
+            <w:tcW w:type="dxa" w:w="1987"/>
+          </w:tcPr>
+          <w:p>
+            <w:pPr>
+              <w:jc w:val="left"/>
+            </w:pPr>
+            <w:r>
+              <w:rPr>
+                <w:rFonts w:ascii="TimeNewRoman" w:hAnsi="TimeNewRoman"/>
+                <w:sz w:val="30"/>
+              </w:rPr>
+              <w:t>39+39=</w:t>
+            </w:r>
+          </w:p>
+        </w:tc>
+      </w:tr>
+      <w:tr>
+        <w:tc>
+          <w:tcPr>
+            <w:tcW w:type="dxa" w:w="1987"/>
+          </w:tcPr>
+          <w:p>
+            <w:pPr>
+              <w:jc w:val="left"/>
+            </w:pPr>
+            <w:r>
+              <w:rPr>
+                <w:rFonts w:ascii="TimeNewRoman" w:hAnsi="TimeNewRoman"/>
+                <w:sz w:val="30"/>
+              </w:rPr>
+              <w:t>98-29=</w:t>
+            </w:r>
+          </w:p>
+        </w:tc>
+        <w:tc>
+          <w:tcPr>
+            <w:tcW w:type="dxa" w:w="1987"/>
+          </w:tcPr>
+          <w:p>
+            <w:pPr>
+              <w:jc w:val="left"/>
+            </w:pPr>
+            <w:r>
+              <w:rPr>
+                <w:rFonts w:ascii="TimeNewRoman" w:hAnsi="TimeNewRoman"/>
+                <w:sz w:val="30"/>
+              </w:rPr>
+              <w:t>80-73=</w:t>
+            </w:r>
+          </w:p>
+        </w:tc>
+        <w:tc>
+          <w:tcPr>
+            <w:tcW w:type="dxa" w:w="1987"/>
+          </w:tcPr>
+          <w:p>
+            <w:pPr>
+              <w:jc w:val="left"/>
+            </w:pPr>
+            <w:r>
+              <w:rPr>
+                <w:rFonts w:ascii="TimeNewRoman" w:hAnsi="TimeNewRoman"/>
+                <w:sz w:val="30"/>
+              </w:rPr>
+              <w:t>63-14=</w:t>
+            </w:r>
+          </w:p>
+        </w:tc>
+        <w:tc>
+          <w:tcPr>
+            <w:tcW w:type="dxa" w:w="1987"/>
+          </w:tcPr>
+          <w:p>
+            <w:pPr>
+              <w:jc w:val="left"/>
+            </w:pPr>
+            <w:r>
+              <w:rPr>
+                <w:rFonts w:ascii="TimeNewRoman" w:hAnsi="TimeNewRoman"/>
+                <w:sz w:val="30"/>
+              </w:rPr>
+              <w:t>2+69=</w:t>
+            </w:r>
+          </w:p>
+        </w:tc>
+        <w:tc>
+          <w:tcPr>
+            <w:tcW w:type="dxa" w:w="1987"/>
+          </w:tcPr>
+          <w:p>
+            <w:pPr>
+              <w:jc w:val="left"/>
+            </w:pPr>
+            <w:r>
+              <w:rPr>
+                <w:rFonts w:ascii="TimeNewRoman" w:hAnsi="TimeNewRoman"/>
+                <w:sz w:val="30"/>
+              </w:rPr>
+              <w:t>24-6=</w:t>
+            </w:r>
+          </w:p>
+        </w:tc>
+      </w:tr>
+      <w:tr>
+        <w:tc>
+          <w:tcPr>
+            <w:tcW w:type="dxa" w:w="1987"/>
+          </w:tcPr>
+          <w:p>
+            <w:pPr>
+              <w:jc w:val="left"/>
+            </w:pPr>
+            <w:r>
+              <w:rPr>
+                <w:rFonts w:ascii="TimeNewRoman" w:hAnsi="TimeNewRoman"/>
+                <w:sz w:val="30"/>
+              </w:rPr>
+              <w:t>51-8=</w:t>
+            </w:r>
+          </w:p>
+        </w:tc>
+        <w:tc>
+          <w:tcPr>
+            <w:tcW w:type="dxa" w:w="1987"/>
+          </w:tcPr>
+          <w:p>
+            <w:pPr>
+              <w:jc w:val="left"/>
+            </w:pPr>
+            <w:r>
+              <w:rPr>
+                <w:rFonts w:ascii="TimeNewRoman" w:hAnsi="TimeNewRoman"/>
+                <w:sz w:val="30"/>
+              </w:rPr>
+              <w:t>75-48=</w:t>
+            </w:r>
+          </w:p>
+        </w:tc>
+        <w:tc>
+          <w:tcPr>
+            <w:tcW w:type="dxa" w:w="1987"/>
+          </w:tcPr>
+          <w:p>
+            <w:pPr>
+              <w:jc w:val="left"/>
+            </w:pPr>
+            <w:r>
+              <w:rPr>
+                <w:rFonts w:ascii="TimeNewRoman" w:hAnsi="TimeNewRoman"/>
+                <w:sz w:val="30"/>
+              </w:rPr>
+              <w:t>82-56=</w:t>
+            </w:r>
+          </w:p>
+        </w:tc>
+        <w:tc>
+          <w:tcPr>
+            <w:tcW w:type="dxa" w:w="1987"/>
+          </w:tcPr>
+          <w:p>
+            <w:pPr>
+              <w:jc w:val="left"/>
+            </w:pPr>
+            <w:r>
+              <w:rPr>
+                <w:rFonts w:ascii="TimeNewRoman" w:hAnsi="TimeNewRoman"/>
+                <w:sz w:val="30"/>
+              </w:rPr>
+              <w:t>86-59=</w:t>
+            </w:r>
+          </w:p>
+        </w:tc>
+        <w:tc>
+          <w:tcPr>
+            <w:tcW w:type="dxa" w:w="1987"/>
+          </w:tcPr>
+          <w:p>
+            <w:pPr>
+              <w:jc w:val="left"/>
+            </w:pPr>
+            <w:r>
+              <w:rPr>
+                <w:rFonts w:ascii="TimeNewRoman" w:hAnsi="TimeNewRoman"/>
+                <w:sz w:val="30"/>
+              </w:rPr>
+              <w:t>70-31=</w:t>
+            </w:r>
+          </w:p>
+        </w:tc>
+      </w:tr>
+      <w:tr>
+        <w:tc>
+          <w:tcPr>
+            <w:tcW w:type="dxa" w:w="1987"/>
+          </w:tcPr>
+          <w:p>
+            <w:pPr>
+              <w:jc w:val="left"/>
+            </w:pPr>
+            <w:r>
+              <w:rPr>
+                <w:rFonts w:ascii="TimeNewRoman" w:hAnsi="TimeNewRoman"/>
+                <w:sz w:val="30"/>
+              </w:rPr>
+              <w:t>24+8=</w:t>
+            </w:r>
+          </w:p>
+        </w:tc>
+        <w:tc>
+          <w:tcPr>
+            <w:tcW w:type="dxa" w:w="1987"/>
+          </w:tcPr>
+          <w:p>
+            <w:pPr>
+              <w:jc w:val="left"/>
+            </w:pPr>
+            <w:r>
+              <w:rPr>
+                <w:rFonts w:ascii="TimeNewRoman" w:hAnsi="TimeNewRoman"/>
+                <w:sz w:val="30"/>
+              </w:rPr>
+              <w:t>58+37=</w:t>
+            </w:r>
+          </w:p>
+        </w:tc>
+        <w:tc>
+          <w:tcPr>
+            <w:tcW w:type="dxa" w:w="1987"/>
+          </w:tcPr>
+          <w:p>
+            <w:pPr>
+              <w:jc w:val="left"/>
+            </w:pPr>
+            <w:r>
+              <w:rPr>
+                <w:rFonts w:ascii="TimeNewRoman" w:hAnsi="TimeNewRoman"/>
+                <w:sz w:val="30"/>
+              </w:rPr>
+              <w:t>83-64=</w:t>
+            </w:r>
+          </w:p>
+        </w:tc>
+        <w:tc>
+          <w:tcPr>
+            <w:tcW w:type="dxa" w:w="1987"/>
+          </w:tcPr>
+          <w:p>
+            <w:pPr>
+              <w:jc w:val="left"/>
+            </w:pPr>
+            <w:r>
+              <w:rPr>
+                <w:rFonts w:ascii="TimeNewRoman" w:hAnsi="TimeNewRoman"/>
+                <w:sz w:val="30"/>
+              </w:rPr>
+              <w:t>83-25=</w:t>
+            </w:r>
+          </w:p>
+        </w:tc>
+        <w:tc>
+          <w:tcPr>
+            <w:tcW w:type="dxa" w:w="1987"/>
+          </w:tcPr>
+          <w:p>
+            <w:pPr>
+              <w:jc w:val="left"/>
+            </w:pPr>
+            <w:r>
+              <w:rPr>
+                <w:rFonts w:ascii="TimeNewRoman" w:hAnsi="TimeNewRoman"/>
+                <w:sz w:val="30"/>
+              </w:rPr>
+              <w:t>83-78=</w:t>
+            </w:r>
+          </w:p>
+        </w:tc>
+      </w:tr>
+      <w:tr>
+        <w:tc>
+          <w:tcPr>
+            <w:tcW w:type="dxa" w:w="1987"/>
+          </w:tcPr>
+          <w:p>
+            <w:pPr>
+              <w:jc w:val="left"/>
+            </w:pPr>
+            <w:r>
+              <w:rPr>
+                <w:rFonts w:ascii="TimeNewRoman" w:hAnsi="TimeNewRoman"/>
+                <w:sz w:val="30"/>
+              </w:rPr>
+              <w:t>9+33=</w:t>
+            </w:r>
+          </w:p>
+        </w:tc>
+        <w:tc>
+          <w:tcPr>
+            <w:tcW w:type="dxa" w:w="1987"/>
+          </w:tcPr>
+          <w:p>
+            <w:pPr>
+              <w:jc w:val="left"/>
+            </w:pPr>
+            <w:r>
+              <w:rPr>
+                <w:rFonts w:ascii="TimeNewRoman" w:hAnsi="TimeNewRoman"/>
+                <w:sz w:val="30"/>
+              </w:rPr>
+              <w:t>73-45=</w:t>
+            </w:r>
+          </w:p>
+        </w:tc>
+        <w:tc>
+          <w:tcPr>
+            <w:tcW w:type="dxa" w:w="1987"/>
+          </w:tcPr>
+          <w:p>
+            <w:pPr>
+              <w:jc w:val="left"/>
+            </w:pPr>
+            <w:r>
+              <w:rPr>
+                <w:rFonts w:ascii="TimeNewRoman" w:hAnsi="TimeNewRoman"/>
+                <w:sz w:val="30"/>
+              </w:rPr>
+              <w:t>68-59=</w:t>
+            </w:r>
+          </w:p>
+        </w:tc>
+        <w:tc>
+          <w:tcPr>
+            <w:tcW w:type="dxa" w:w="1987"/>
+          </w:tcPr>
+          <w:p>
+            <w:pPr>
+              <w:jc w:val="left"/>
+            </w:pPr>
+            <w:r>
+              <w:rPr>
+                <w:rFonts w:ascii="TimeNewRoman" w:hAnsi="TimeNewRoman"/>
+                <w:sz w:val="30"/>
+              </w:rPr>
+              <w:t>53-4=</w:t>
+            </w:r>
+          </w:p>
+        </w:tc>
+        <w:tc>
+          <w:tcPr>
+            <w:tcW w:type="dxa" w:w="1987"/>
+          </w:tcPr>
+          <w:p>
+            <w:pPr>
+              <w:jc w:val="left"/>
+            </w:pPr>
+            <w:r>
+              <w:rPr>
+                <w:rFonts w:ascii="TimeNewRoman" w:hAnsi="TimeNewRoman"/>
+                <w:sz w:val="30"/>
+              </w:rPr>
+              <w:t>52-9=</w:t>
+            </w:r>
+          </w:p>
+        </w:tc>
+      </w:tr>
+      <w:tr>
+        <w:tc>
+          <w:tcPr>
+            <w:tcW w:type="dxa" w:w="1987"/>
+          </w:tcPr>
+          <w:p>
+            <w:pPr>
+              <w:jc w:val="left"/>
+            </w:pPr>
+            <w:r>
+              <w:rPr>
+                <w:rFonts w:ascii="TimeNewRoman" w:hAnsi="TimeNewRoman"/>
+                <w:sz w:val="30"/>
+              </w:rPr>
+              <w:t>90-8=</w:t>
+            </w:r>
+          </w:p>
+        </w:tc>
+        <w:tc>
+          <w:tcPr>
+            <w:tcW w:type="dxa" w:w="1987"/>
+          </w:tcPr>
+          <w:p>
+            <w:pPr>
+              <w:jc w:val="left"/>
+            </w:pPr>
+            <w:r>
+              <w:rPr>
+                <w:rFonts w:ascii="TimeNewRoman" w:hAnsi="TimeNewRoman"/>
+                <w:sz w:val="30"/>
+              </w:rPr>
+              <w:t>78-29=</w:t>
+            </w:r>
+          </w:p>
+        </w:tc>
+        <w:tc>
+          <w:tcPr>
+            <w:tcW w:type="dxa" w:w="1987"/>
+          </w:tcPr>
+          <w:p>
+            <w:pPr>
+              <w:jc w:val="left"/>
+            </w:pPr>
+            <w:r>
+              <w:rPr>
+                <w:rFonts w:ascii="TimeNewRoman" w:hAnsi="TimeNewRoman"/>
+                <w:sz w:val="30"/>
+              </w:rPr>
+              <w:t>5+27=</w:t>
+            </w:r>
+          </w:p>
+        </w:tc>
+        <w:tc>
+          <w:tcPr>
+            <w:tcW w:type="dxa" w:w="1987"/>
+          </w:tcPr>
+          <w:p>
+            <w:pPr>
+              <w:jc w:val="left"/>
+            </w:pPr>
+            <w:r>
+              <w:rPr>
+                <w:rFonts w:ascii="TimeNewRoman" w:hAnsi="TimeNewRoman"/>
+                <w:sz w:val="30"/>
+              </w:rPr>
+              <w:t>38+46=</w:t>
+            </w:r>
+          </w:p>
+        </w:tc>
+        <w:tc>
+          <w:tcPr>
+            <w:tcW w:type="dxa" w:w="1987"/>
+          </w:tcPr>
+          <w:p>
+            <w:pPr>
+              <w:jc w:val="left"/>
+            </w:pPr>
+            <w:r>
+              <w:rPr>
+                <w:rFonts w:ascii="TimeNewRoman" w:hAnsi="TimeNewRoman"/>
+                <w:sz w:val="30"/>
+              </w:rPr>
+              <w:t>10-5=</w:t>
+            </w:r>
+          </w:p>
+        </w:tc>
+      </w:tr>
+      <w:tr>
+        <w:tc>
+          <w:tcPr>
+            <w:tcW w:type="dxa" w:w="1987"/>
+          </w:tcPr>
+          <w:p>
+            <w:pPr>
+              <w:jc w:val="left"/>
+            </w:pPr>
+            <w:r>
+              <w:rPr>
+                <w:rFonts w:ascii="TimeNewRoman" w:hAnsi="TimeNewRoman"/>
+                <w:sz w:val="30"/>
+              </w:rPr>
+              <w:t>80-24=</w:t>
+            </w:r>
+          </w:p>
+        </w:tc>
+        <w:tc>
+          <w:tcPr>
+            <w:tcW w:type="dxa" w:w="1987"/>
+          </w:tcPr>
+          <w:p>
+            <w:pPr>
+              <w:jc w:val="left"/>
+            </w:pPr>
+            <w:r>
+              <w:rPr>
+                <w:rFonts w:ascii="TimeNewRoman" w:hAnsi="TimeNewRoman"/>
+                <w:sz w:val="30"/>
+              </w:rPr>
+              <w:t>63-38=</w:t>
+            </w:r>
+          </w:p>
+        </w:tc>
+        <w:tc>
+          <w:tcPr>
+            <w:tcW w:type="dxa" w:w="1987"/>
+          </w:tcPr>
+          <w:p>
+            <w:pPr>
+              <w:jc w:val="left"/>
+            </w:pPr>
+            <w:r>
+              <w:rPr>
+                <w:rFonts w:ascii="TimeNewRoman" w:hAnsi="TimeNewRoman"/>
+                <w:sz w:val="30"/>
+              </w:rPr>
+              <w:t>25+59=</w:t>
+            </w:r>
+          </w:p>
+        </w:tc>
+        <w:tc>
+          <w:tcPr>
+            <w:tcW w:type="dxa" w:w="1987"/>
+          </w:tcPr>
+          <w:p>
+            <w:pPr>
+              <w:jc w:val="left"/>
+            </w:pPr>
+            <w:r>
+              <w:rPr>
+                <w:rFonts w:ascii="TimeNewRoman" w:hAnsi="TimeNewRoman"/>
+                <w:sz w:val="30"/>
+              </w:rPr>
+              <w:t>63-9=</w:t>
+            </w:r>
+          </w:p>
+        </w:tc>
+        <w:tc>
+          <w:tcPr>
+            <w:tcW w:type="dxa" w:w="1987"/>
+          </w:tcPr>
+          <w:p>
+            <w:pPr>
+              <w:jc w:val="left"/>
+            </w:pPr>
+            <w:r>
+              <w:rPr>
+                <w:rFonts w:ascii="TimeNewRoman" w:hAnsi="TimeNewRoman"/>
+                <w:sz w:val="30"/>
+              </w:rPr>
+              <w:t>82-79=</w:t>
             </w:r>
           </w:p>
         </w:tc>

</xml_diff>

<commit_message>
Update master to output generated at d167106
</commit_message>
<xml_diff>
--- a/adc_sbb_within_100.docx
+++ b/adc_sbb_within_100.docx
@@ -11,7 +11,7 @@
           <w:rFonts w:ascii="Arial" w:hAnsi="Arial"/>
           <w:sz w:val="30"/>
         </w:rPr>
-        <w:t>2026-08-06 Thursday</w:t>
+        <w:t>2026-08-07 Friday</w:t>
       </w:r>
     </w:p>
     <w:tbl>
@@ -40,7 +40,7 @@
                 <w:rFonts w:ascii="TimeNewRoman" w:hAnsi="TimeNewRoman"/>
                 <w:sz w:val="30"/>
               </w:rPr>
-              <w:t>74-17=</w:t>
+              <w:t>95-66=</w:t>
             </w:r>
           </w:p>
         </w:tc>
@@ -57,7 +57,7 @@
                 <w:rFonts w:ascii="TimeNewRoman" w:hAnsi="TimeNewRoman"/>
                 <w:sz w:val="30"/>
               </w:rPr>
-              <w:t>60-28=</w:t>
+              <w:t>4+28=</w:t>
             </w:r>
           </w:p>
         </w:tc>
@@ -74,7 +74,7 @@
                 <w:rFonts w:ascii="TimeNewRoman" w:hAnsi="TimeNewRoman"/>
                 <w:sz w:val="30"/>
               </w:rPr>
-              <w:t>80-42=</w:t>
+              <w:t>61-56=</w:t>
             </w:r>
           </w:p>
         </w:tc>
@@ -91,7 +91,7 @@
                 <w:rFonts w:ascii="TimeNewRoman" w:hAnsi="TimeNewRoman"/>
                 <w:sz w:val="30"/>
               </w:rPr>
-              <w:t>17+64=</w:t>
+              <w:t>46+6=</w:t>
             </w:r>
           </w:p>
         </w:tc>
@@ -108,7 +108,7 @@
                 <w:rFonts w:ascii="TimeNewRoman" w:hAnsi="TimeNewRoman"/>
                 <w:sz w:val="30"/>
               </w:rPr>
-              <w:t>64+18=</w:t>
+              <w:t>57+38=</w:t>
             </w:r>
           </w:p>
         </w:tc>
@@ -127,7 +127,7 @@
                 <w:rFonts w:ascii="TimeNewRoman" w:hAnsi="TimeNewRoman"/>
                 <w:sz w:val="30"/>
               </w:rPr>
-              <w:t>84-19=</w:t>
+              <w:t>93-7=</w:t>
             </w:r>
           </w:p>
         </w:tc>
@@ -144,7 +144,7 @@
                 <w:rFonts w:ascii="TimeNewRoman" w:hAnsi="TimeNewRoman"/>
                 <w:sz w:val="30"/>
               </w:rPr>
-              <w:t>55-8=</w:t>
+              <w:t>34+7=</w:t>
             </w:r>
           </w:p>
         </w:tc>
@@ -161,7 +161,7 @@
                 <w:rFonts w:ascii="TimeNewRoman" w:hAnsi="TimeNewRoman"/>
                 <w:sz w:val="30"/>
               </w:rPr>
-              <w:t>17+47=</w:t>
+              <w:t>39+15=</w:t>
             </w:r>
           </w:p>
         </w:tc>
@@ -178,7 +178,7 @@
                 <w:rFonts w:ascii="TimeNewRoman" w:hAnsi="TimeNewRoman"/>
                 <w:sz w:val="30"/>
               </w:rPr>
-              <w:t>50-36=</w:t>
+              <w:t>15+17=</w:t>
             </w:r>
           </w:p>
         </w:tc>
@@ -195,7 +195,7 @@
                 <w:rFonts w:ascii="TimeNewRoman" w:hAnsi="TimeNewRoman"/>
                 <w:sz w:val="30"/>
               </w:rPr>
-              <w:t>42-25=</w:t>
+              <w:t>60-7=</w:t>
             </w:r>
           </w:p>
         </w:tc>
@@ -214,7 +214,7 @@
                 <w:rFonts w:ascii="TimeNewRoman" w:hAnsi="TimeNewRoman"/>
                 <w:sz w:val="30"/>
               </w:rPr>
-              <w:t>63-14=</w:t>
+              <w:t>67+9=</w:t>
             </w:r>
           </w:p>
         </w:tc>
@@ -231,7 +231,7 @@
                 <w:rFonts w:ascii="TimeNewRoman" w:hAnsi="TimeNewRoman"/>
                 <w:sz w:val="30"/>
               </w:rPr>
-              <w:t>41-22=</w:t>
+              <w:t>6+15=</w:t>
             </w:r>
           </w:p>
         </w:tc>
@@ -248,7 +248,7 @@
                 <w:rFonts w:ascii="TimeNewRoman" w:hAnsi="TimeNewRoman"/>
                 <w:sz w:val="30"/>
               </w:rPr>
-              <w:t>6+17=</w:t>
+              <w:t>84-57=</w:t>
             </w:r>
           </w:p>
         </w:tc>
@@ -265,7 +265,7 @@
                 <w:rFonts w:ascii="TimeNewRoman" w:hAnsi="TimeNewRoman"/>
                 <w:sz w:val="30"/>
               </w:rPr>
-              <w:t>18+5=</w:t>
+              <w:t>21-15=</w:t>
             </w:r>
           </w:p>
         </w:tc>
@@ -282,7 +282,7 @@
                 <w:rFonts w:ascii="TimeNewRoman" w:hAnsi="TimeNewRoman"/>
                 <w:sz w:val="30"/>
               </w:rPr>
-              <w:t>92-78=</w:t>
+              <w:t>85-19=</w:t>
             </w:r>
           </w:p>
         </w:tc>
@@ -301,7 +301,7 @@
                 <w:rFonts w:ascii="TimeNewRoman" w:hAnsi="TimeNewRoman"/>
                 <w:sz w:val="30"/>
               </w:rPr>
-              <w:t>55+29=</w:t>
+              <w:t>8+18=</w:t>
             </w:r>
           </w:p>
         </w:tc>
@@ -318,7 +318,7 @@
                 <w:rFonts w:ascii="TimeNewRoman" w:hAnsi="TimeNewRoman"/>
                 <w:sz w:val="30"/>
               </w:rPr>
-              <w:t>90-77=</w:t>
+              <w:t>91-32=</w:t>
             </w:r>
           </w:p>
         </w:tc>
@@ -335,7 +335,7 @@
                 <w:rFonts w:ascii="TimeNewRoman" w:hAnsi="TimeNewRoman"/>
                 <w:sz w:val="30"/>
               </w:rPr>
-              <w:t>97-9=</w:t>
+              <w:t>38+8=</w:t>
             </w:r>
           </w:p>
         </w:tc>
@@ -352,7 +352,7 @@
                 <w:rFonts w:ascii="TimeNewRoman" w:hAnsi="TimeNewRoman"/>
                 <w:sz w:val="30"/>
               </w:rPr>
-              <w:t>53-28=</w:t>
+              <w:t>90-66=</w:t>
             </w:r>
           </w:p>
         </w:tc>
@@ -369,7 +369,7 @@
                 <w:rFonts w:ascii="TimeNewRoman" w:hAnsi="TimeNewRoman"/>
                 <w:sz w:val="30"/>
               </w:rPr>
-              <w:t>76-19=</w:t>
+              <w:t>89+5=</w:t>
             </w:r>
           </w:p>
         </w:tc>
@@ -388,7 +388,7 @@
                 <w:rFonts w:ascii="TimeNewRoman" w:hAnsi="TimeNewRoman"/>
                 <w:sz w:val="30"/>
               </w:rPr>
-              <w:t>92-75=</w:t>
+              <w:t>37+5=</w:t>
             </w:r>
           </w:p>
         </w:tc>
@@ -405,7 +405,7 @@
                 <w:rFonts w:ascii="TimeNewRoman" w:hAnsi="TimeNewRoman"/>
                 <w:sz w:val="30"/>
               </w:rPr>
-              <w:t>56+9=</w:t>
+              <w:t>95-77=</w:t>
             </w:r>
           </w:p>
         </w:tc>
@@ -422,7 +422,7 @@
                 <w:rFonts w:ascii="TimeNewRoman" w:hAnsi="TimeNewRoman"/>
                 <w:sz w:val="30"/>
               </w:rPr>
-              <w:t>93-65=</w:t>
+              <w:t>96-17=</w:t>
             </w:r>
           </w:p>
         </w:tc>
@@ -439,7 +439,7 @@
                 <w:rFonts w:ascii="TimeNewRoman" w:hAnsi="TimeNewRoman"/>
                 <w:sz w:val="30"/>
               </w:rPr>
-              <w:t>46-39=</w:t>
+              <w:t>28+25=</w:t>
             </w:r>
           </w:p>
         </w:tc>
@@ -456,7 +456,7 @@
                 <w:rFonts w:ascii="TimeNewRoman" w:hAnsi="TimeNewRoman"/>
                 <w:sz w:val="30"/>
               </w:rPr>
-              <w:t>71-22=</w:t>
+              <w:t>9+6=</w:t>
             </w:r>
           </w:p>
         </w:tc>
@@ -475,7 +475,7 @@
                 <w:rFonts w:ascii="TimeNewRoman" w:hAnsi="TimeNewRoman"/>
                 <w:sz w:val="30"/>
               </w:rPr>
-              <w:t>43+29=</w:t>
+              <w:t>84-68=</w:t>
             </w:r>
           </w:p>
         </w:tc>
@@ -492,7 +492,7 @@
                 <w:rFonts w:ascii="TimeNewRoman" w:hAnsi="TimeNewRoman"/>
                 <w:sz w:val="30"/>
               </w:rPr>
-              <w:t>69+24=</w:t>
+              <w:t>75-18=</w:t>
             </w:r>
           </w:p>
         </w:tc>
@@ -509,7 +509,7 @@
                 <w:rFonts w:ascii="TimeNewRoman" w:hAnsi="TimeNewRoman"/>
                 <w:sz w:val="30"/>
               </w:rPr>
-              <w:t>62-9=</w:t>
+              <w:t>35+47=</w:t>
             </w:r>
           </w:p>
         </w:tc>
@@ -526,7 +526,7 @@
                 <w:rFonts w:ascii="TimeNewRoman" w:hAnsi="TimeNewRoman"/>
                 <w:sz w:val="30"/>
               </w:rPr>
-              <w:t>72-43=</w:t>
+              <w:t>38+35=</w:t>
             </w:r>
           </w:p>
         </w:tc>
@@ -543,7 +543,7 @@
                 <w:rFonts w:ascii="TimeNewRoman" w:hAnsi="TimeNewRoman"/>
                 <w:sz w:val="30"/>
               </w:rPr>
-              <w:t>63-24=</w:t>
+              <w:t>7+68=</w:t>
             </w:r>
           </w:p>
         </w:tc>
@@ -562,7 +562,7 @@
                 <w:rFonts w:ascii="TimeNewRoman" w:hAnsi="TimeNewRoman"/>
                 <w:sz w:val="30"/>
               </w:rPr>
-              <w:t>46+28=</w:t>
+              <w:t>35+27=</w:t>
             </w:r>
           </w:p>
         </w:tc>
@@ -579,7 +579,7 @@
                 <w:rFonts w:ascii="TimeNewRoman" w:hAnsi="TimeNewRoman"/>
                 <w:sz w:val="30"/>
               </w:rPr>
-              <w:t>67+8=</w:t>
+              <w:t>85-28=</w:t>
             </w:r>
           </w:p>
         </w:tc>
@@ -596,7 +596,7 @@
                 <w:rFonts w:ascii="TimeNewRoman" w:hAnsi="TimeNewRoman"/>
                 <w:sz w:val="30"/>
               </w:rPr>
-              <w:t>16+56=</w:t>
+              <w:t>13+29=</w:t>
             </w:r>
           </w:p>
         </w:tc>
@@ -613,7 +613,7 @@
                 <w:rFonts w:ascii="TimeNewRoman" w:hAnsi="TimeNewRoman"/>
                 <w:sz w:val="30"/>
               </w:rPr>
-              <w:t>36-27=</w:t>
+              <w:t>19+12=</w:t>
             </w:r>
           </w:p>
         </w:tc>
@@ -630,7 +630,7 @@
                 <w:rFonts w:ascii="TimeNewRoman" w:hAnsi="TimeNewRoman"/>
                 <w:sz w:val="30"/>
               </w:rPr>
-              <w:t>97-89=</w:t>
+              <w:t>53-25=</w:t>
             </w:r>
           </w:p>
         </w:tc>
@@ -649,7 +649,7 @@
                 <w:rFonts w:ascii="TimeNewRoman" w:hAnsi="TimeNewRoman"/>
                 <w:sz w:val="30"/>
               </w:rPr>
-              <w:t>18+18=</w:t>
+              <w:t>90-83=</w:t>
             </w:r>
           </w:p>
         </w:tc>
@@ -666,7 +666,7 @@
                 <w:rFonts w:ascii="TimeNewRoman" w:hAnsi="TimeNewRoman"/>
                 <w:sz w:val="30"/>
               </w:rPr>
-              <w:t>28+19=</w:t>
+              <w:t>3+68=</w:t>
             </w:r>
           </w:p>
         </w:tc>
@@ -683,7 +683,7 @@
                 <w:rFonts w:ascii="TimeNewRoman" w:hAnsi="TimeNewRoman"/>
                 <w:sz w:val="30"/>
               </w:rPr>
-              <w:t>74-47=</w:t>
+              <w:t>44+18=</w:t>
             </w:r>
           </w:p>
         </w:tc>
@@ -700,7 +700,7 @@
                 <w:rFonts w:ascii="TimeNewRoman" w:hAnsi="TimeNewRoman"/>
                 <w:sz w:val="30"/>
               </w:rPr>
-              <w:t>17+4=</w:t>
+              <w:t>49+16=</w:t>
             </w:r>
           </w:p>
         </w:tc>
@@ -717,7 +717,7 @@
                 <w:rFonts w:ascii="TimeNewRoman" w:hAnsi="TimeNewRoman"/>
                 <w:sz w:val="30"/>
               </w:rPr>
-              <w:t>66+19=</w:t>
+              <w:t>91-22=</w:t>
             </w:r>
           </w:p>
         </w:tc>
@@ -736,7 +736,7 @@
                 <w:rFonts w:ascii="TimeNewRoman" w:hAnsi="TimeNewRoman"/>
                 <w:sz w:val="30"/>
               </w:rPr>
-              <w:t>81-35=</w:t>
+              <w:t>5+47=</w:t>
             </w:r>
           </w:p>
         </w:tc>
@@ -753,7 +753,7 @@
                 <w:rFonts w:ascii="TimeNewRoman" w:hAnsi="TimeNewRoman"/>
                 <w:sz w:val="30"/>
               </w:rPr>
-              <w:t>14+27=</w:t>
+              <w:t>41-32=</w:t>
             </w:r>
           </w:p>
         </w:tc>
@@ -770,599 +770,7 @@
                 <w:rFonts w:ascii="TimeNewRoman" w:hAnsi="TimeNewRoman"/>
                 <w:sz w:val="30"/>
               </w:rPr>
-              <w:t>96-38=</w:t>
-            </w:r>
-          </w:p>
-        </w:tc>
-        <w:tc>
-          <w:tcPr>
-            <w:tcW w:type="dxa" w:w="1987"/>
-          </w:tcPr>
-          <w:p>
-            <w:pPr>
-              <w:jc w:val="left"/>
-            </w:pPr>
-            <w:r>
-              <w:rPr>
-                <w:rFonts w:ascii="TimeNewRoman" w:hAnsi="TimeNewRoman"/>
-                <w:sz w:val="30"/>
-              </w:rPr>
-              <w:t>70-63=</w:t>
-            </w:r>
-          </w:p>
-        </w:tc>
-        <w:tc>
-          <w:tcPr>
-            <w:tcW w:type="dxa" w:w="1987"/>
-          </w:tcPr>
-          <w:p>
-            <w:pPr>
-              <w:jc w:val="left"/>
-            </w:pPr>
-            <w:r>
-              <w:rPr>
-                <w:rFonts w:ascii="TimeNewRoman" w:hAnsi="TimeNewRoman"/>
-                <w:sz w:val="30"/>
-              </w:rPr>
-              <w:t>25+67=</w:t>
-            </w:r>
-          </w:p>
-        </w:tc>
-      </w:tr>
-      <w:tr>
-        <w:tc>
-          <w:tcPr>
-            <w:tcW w:type="dxa" w:w="1987"/>
-          </w:tcPr>
-          <w:p>
-            <w:pPr>
-              <w:jc w:val="left"/>
-            </w:pPr>
-            <w:r>
-              <w:rPr>
-                <w:rFonts w:ascii="TimeNewRoman" w:hAnsi="TimeNewRoman"/>
-                <w:sz w:val="30"/>
-              </w:rPr>
-              <w:t>49+22=</w:t>
-            </w:r>
-          </w:p>
-        </w:tc>
-        <w:tc>
-          <w:tcPr>
-            <w:tcW w:type="dxa" w:w="1987"/>
-          </w:tcPr>
-          <w:p>
-            <w:pPr>
-              <w:jc w:val="left"/>
-            </w:pPr>
-            <w:r>
-              <w:rPr>
-                <w:rFonts w:ascii="TimeNewRoman" w:hAnsi="TimeNewRoman"/>
-                <w:sz w:val="30"/>
-              </w:rPr>
-              <w:t>62-54=</w:t>
-            </w:r>
-          </w:p>
-        </w:tc>
-        <w:tc>
-          <w:tcPr>
-            <w:tcW w:type="dxa" w:w="1987"/>
-          </w:tcPr>
-          <w:p>
-            <w:pPr>
-              <w:jc w:val="left"/>
-            </w:pPr>
-            <w:r>
-              <w:rPr>
-                <w:rFonts w:ascii="TimeNewRoman" w:hAnsi="TimeNewRoman"/>
-                <w:sz w:val="30"/>
-              </w:rPr>
-              <w:t>26+19=</w:t>
-            </w:r>
-          </w:p>
-        </w:tc>
-        <w:tc>
-          <w:tcPr>
-            <w:tcW w:type="dxa" w:w="1987"/>
-          </w:tcPr>
-          <w:p>
-            <w:pPr>
-              <w:jc w:val="left"/>
-            </w:pPr>
-            <w:r>
-              <w:rPr>
-                <w:rFonts w:ascii="TimeNewRoman" w:hAnsi="TimeNewRoman"/>
-                <w:sz w:val="30"/>
-              </w:rPr>
-              <w:t>51-27=</w:t>
-            </w:r>
-          </w:p>
-        </w:tc>
-        <w:tc>
-          <w:tcPr>
-            <w:tcW w:type="dxa" w:w="1987"/>
-          </w:tcPr>
-          <w:p>
-            <w:pPr>
-              <w:jc w:val="left"/>
-            </w:pPr>
-            <w:r>
-              <w:rPr>
-                <w:rFonts w:ascii="TimeNewRoman" w:hAnsi="TimeNewRoman"/>
-                <w:sz w:val="30"/>
-              </w:rPr>
-              <w:t>82-4=</w:t>
-            </w:r>
-          </w:p>
-        </w:tc>
-      </w:tr>
-      <w:tr>
-        <w:tc>
-          <w:tcPr>
-            <w:tcW w:type="dxa" w:w="1987"/>
-          </w:tcPr>
-          <w:p>
-            <w:pPr>
-              <w:jc w:val="left"/>
-            </w:pPr>
-            <w:r>
-              <w:rPr>
-                <w:rFonts w:ascii="TimeNewRoman" w:hAnsi="TimeNewRoman"/>
-                <w:sz w:val="30"/>
-              </w:rPr>
-              <w:t>50-8=</w:t>
-            </w:r>
-          </w:p>
-        </w:tc>
-        <w:tc>
-          <w:tcPr>
-            <w:tcW w:type="dxa" w:w="1987"/>
-          </w:tcPr>
-          <w:p>
-            <w:pPr>
-              <w:jc w:val="left"/>
-            </w:pPr>
-            <w:r>
-              <w:rPr>
-                <w:rFonts w:ascii="TimeNewRoman" w:hAnsi="TimeNewRoman"/>
-                <w:sz w:val="30"/>
-              </w:rPr>
-              <w:t>16+5=</w:t>
-            </w:r>
-          </w:p>
-        </w:tc>
-        <w:tc>
-          <w:tcPr>
-            <w:tcW w:type="dxa" w:w="1987"/>
-          </w:tcPr>
-          <w:p>
-            <w:pPr>
-              <w:jc w:val="left"/>
-            </w:pPr>
-            <w:r>
-              <w:rPr>
-                <w:rFonts w:ascii="TimeNewRoman" w:hAnsi="TimeNewRoman"/>
-                <w:sz w:val="30"/>
-              </w:rPr>
-              <w:t>43-24=</w:t>
-            </w:r>
-          </w:p>
-        </w:tc>
-        <w:tc>
-          <w:tcPr>
-            <w:tcW w:type="dxa" w:w="1987"/>
-          </w:tcPr>
-          <w:p>
-            <w:pPr>
-              <w:jc w:val="left"/>
-            </w:pPr>
-            <w:r>
-              <w:rPr>
-                <w:rFonts w:ascii="TimeNewRoman" w:hAnsi="TimeNewRoman"/>
-                <w:sz w:val="30"/>
-              </w:rPr>
-              <w:t>27+48=</w:t>
-            </w:r>
-          </w:p>
-        </w:tc>
-        <w:tc>
-          <w:tcPr>
-            <w:tcW w:type="dxa" w:w="1987"/>
-          </w:tcPr>
-          <w:p>
-            <w:pPr>
-              <w:jc w:val="left"/>
-            </w:pPr>
-            <w:r>
-              <w:rPr>
-                <w:rFonts w:ascii="TimeNewRoman" w:hAnsi="TimeNewRoman"/>
-                <w:sz w:val="30"/>
-              </w:rPr>
-              <w:t>84+7=</w:t>
-            </w:r>
-          </w:p>
-        </w:tc>
-      </w:tr>
-      <w:tr>
-        <w:tc>
-          <w:tcPr>
-            <w:tcW w:type="dxa" w:w="1987"/>
-          </w:tcPr>
-          <w:p>
-            <w:pPr>
-              <w:jc w:val="left"/>
-            </w:pPr>
-            <w:r>
-              <w:rPr>
-                <w:rFonts w:ascii="TimeNewRoman" w:hAnsi="TimeNewRoman"/>
-                <w:sz w:val="30"/>
-              </w:rPr>
-              <w:t>59+22=</w:t>
-            </w:r>
-          </w:p>
-        </w:tc>
-        <w:tc>
-          <w:tcPr>
-            <w:tcW w:type="dxa" w:w="1987"/>
-          </w:tcPr>
-          <w:p>
-            <w:pPr>
-              <w:jc w:val="left"/>
-            </w:pPr>
-            <w:r>
-              <w:rPr>
-                <w:rFonts w:ascii="TimeNewRoman" w:hAnsi="TimeNewRoman"/>
-                <w:sz w:val="30"/>
-              </w:rPr>
-              <w:t>42-9=</w:t>
-            </w:r>
-          </w:p>
-        </w:tc>
-        <w:tc>
-          <w:tcPr>
-            <w:tcW w:type="dxa" w:w="1987"/>
-          </w:tcPr>
-          <w:p>
-            <w:pPr>
-              <w:jc w:val="left"/>
-            </w:pPr>
-            <w:r>
-              <w:rPr>
-                <w:rFonts w:ascii="TimeNewRoman" w:hAnsi="TimeNewRoman"/>
-                <w:sz w:val="30"/>
-              </w:rPr>
-              <w:t>5+9=</w:t>
-            </w:r>
-          </w:p>
-        </w:tc>
-        <w:tc>
-          <w:tcPr>
-            <w:tcW w:type="dxa" w:w="1987"/>
-          </w:tcPr>
-          <w:p>
-            <w:pPr>
-              <w:jc w:val="left"/>
-            </w:pPr>
-            <w:r>
-              <w:rPr>
-                <w:rFonts w:ascii="TimeNewRoman" w:hAnsi="TimeNewRoman"/>
-                <w:sz w:val="30"/>
-              </w:rPr>
-              <w:t>69+16=</w:t>
-            </w:r>
-          </w:p>
-        </w:tc>
-        <w:tc>
-          <w:tcPr>
-            <w:tcW w:type="dxa" w:w="1987"/>
-          </w:tcPr>
-          <w:p>
-            <w:pPr>
-              <w:jc w:val="left"/>
-            </w:pPr>
-            <w:r>
-              <w:rPr>
-                <w:rFonts w:ascii="TimeNewRoman" w:hAnsi="TimeNewRoman"/>
-                <w:sz w:val="30"/>
-              </w:rPr>
-              <w:t>92-86=</w:t>
-            </w:r>
-          </w:p>
-        </w:tc>
-      </w:tr>
-      <w:tr>
-        <w:tc>
-          <w:tcPr>
-            <w:tcW w:type="dxa" w:w="1987"/>
-          </w:tcPr>
-          <w:p>
-            <w:pPr>
-              <w:jc w:val="left"/>
-            </w:pPr>
-            <w:r>
-              <w:rPr>
-                <w:rFonts w:ascii="TimeNewRoman" w:hAnsi="TimeNewRoman"/>
-                <w:sz w:val="30"/>
-              </w:rPr>
-              <w:t>26+7=</w:t>
-            </w:r>
-          </w:p>
-        </w:tc>
-        <w:tc>
-          <w:tcPr>
-            <w:tcW w:type="dxa" w:w="1987"/>
-          </w:tcPr>
-          <w:p>
-            <w:pPr>
-              <w:jc w:val="left"/>
-            </w:pPr>
-            <w:r>
-              <w:rPr>
-                <w:rFonts w:ascii="TimeNewRoman" w:hAnsi="TimeNewRoman"/>
-                <w:sz w:val="30"/>
-              </w:rPr>
-              <w:t>55-49=</w:t>
-            </w:r>
-          </w:p>
-        </w:tc>
-        <w:tc>
-          <w:tcPr>
-            <w:tcW w:type="dxa" w:w="1987"/>
-          </w:tcPr>
-          <w:p>
-            <w:pPr>
-              <w:jc w:val="left"/>
-            </w:pPr>
-            <w:r>
-              <w:rPr>
-                <w:rFonts w:ascii="TimeNewRoman" w:hAnsi="TimeNewRoman"/>
-                <w:sz w:val="30"/>
-              </w:rPr>
-              <w:t>13-6=</w:t>
-            </w:r>
-          </w:p>
-        </w:tc>
-        <w:tc>
-          <w:tcPr>
-            <w:tcW w:type="dxa" w:w="1987"/>
-          </w:tcPr>
-          <w:p>
-            <w:pPr>
-              <w:jc w:val="left"/>
-            </w:pPr>
-            <w:r>
-              <w:rPr>
-                <w:rFonts w:ascii="TimeNewRoman" w:hAnsi="TimeNewRoman"/>
-                <w:sz w:val="30"/>
-              </w:rPr>
-              <w:t>30-28=</w:t>
-            </w:r>
-          </w:p>
-        </w:tc>
-        <w:tc>
-          <w:tcPr>
-            <w:tcW w:type="dxa" w:w="1987"/>
-          </w:tcPr>
-          <w:p>
-            <w:pPr>
-              <w:jc w:val="left"/>
-            </w:pPr>
-            <w:r>
-              <w:rPr>
-                <w:rFonts w:ascii="TimeNewRoman" w:hAnsi="TimeNewRoman"/>
-                <w:sz w:val="30"/>
-              </w:rPr>
-              <w:t>43+49=</w:t>
-            </w:r>
-          </w:p>
-        </w:tc>
-      </w:tr>
-      <w:tr>
-        <w:tc>
-          <w:tcPr>
-            <w:tcW w:type="dxa" w:w="1987"/>
-          </w:tcPr>
-          <w:p>
-            <w:pPr>
-              <w:jc w:val="left"/>
-            </w:pPr>
-            <w:r>
-              <w:rPr>
-                <w:rFonts w:ascii="TimeNewRoman" w:hAnsi="TimeNewRoman"/>
-                <w:sz w:val="30"/>
-              </w:rPr>
-              <w:t>36+49=</w:t>
-            </w:r>
-          </w:p>
-        </w:tc>
-        <w:tc>
-          <w:tcPr>
-            <w:tcW w:type="dxa" w:w="1987"/>
-          </w:tcPr>
-          <w:p>
-            <w:pPr>
-              <w:jc w:val="left"/>
-            </w:pPr>
-            <w:r>
-              <w:rPr>
-                <w:rFonts w:ascii="TimeNewRoman" w:hAnsi="TimeNewRoman"/>
-                <w:sz w:val="30"/>
-              </w:rPr>
-              <w:t>69+9=</w:t>
-            </w:r>
-          </w:p>
-        </w:tc>
-        <w:tc>
-          <w:tcPr>
-            <w:tcW w:type="dxa" w:w="1987"/>
-          </w:tcPr>
-          <w:p>
-            <w:pPr>
-              <w:jc w:val="left"/>
-            </w:pPr>
-            <w:r>
-              <w:rPr>
-                <w:rFonts w:ascii="TimeNewRoman" w:hAnsi="TimeNewRoman"/>
-                <w:sz w:val="30"/>
-              </w:rPr>
-              <w:t>74-29=</w:t>
-            </w:r>
-          </w:p>
-        </w:tc>
-        <w:tc>
-          <w:tcPr>
-            <w:tcW w:type="dxa" w:w="1987"/>
-          </w:tcPr>
-          <w:p>
-            <w:pPr>
-              <w:jc w:val="left"/>
-            </w:pPr>
-            <w:r>
-              <w:rPr>
-                <w:rFonts w:ascii="TimeNewRoman" w:hAnsi="TimeNewRoman"/>
-                <w:sz w:val="30"/>
-              </w:rPr>
-              <w:t>26+56=</w:t>
-            </w:r>
-          </w:p>
-        </w:tc>
-        <w:tc>
-          <w:tcPr>
-            <w:tcW w:type="dxa" w:w="1987"/>
-          </w:tcPr>
-          <w:p>
-            <w:pPr>
-              <w:jc w:val="left"/>
-            </w:pPr>
-            <w:r>
-              <w:rPr>
-                <w:rFonts w:ascii="TimeNewRoman" w:hAnsi="TimeNewRoman"/>
-                <w:sz w:val="30"/>
-              </w:rPr>
-              <w:t>76-37=</w:t>
-            </w:r>
-          </w:p>
-        </w:tc>
-      </w:tr>
-      <w:tr>
-        <w:tc>
-          <w:tcPr>
-            <w:tcW w:type="dxa" w:w="1987"/>
-          </w:tcPr>
-          <w:p>
-            <w:pPr>
-              <w:jc w:val="left"/>
-            </w:pPr>
-            <w:r>
-              <w:rPr>
-                <w:rFonts w:ascii="TimeNewRoman" w:hAnsi="TimeNewRoman"/>
-                <w:sz w:val="30"/>
-              </w:rPr>
-              <w:t>64-36=</w:t>
-            </w:r>
-          </w:p>
-        </w:tc>
-        <w:tc>
-          <w:tcPr>
-            <w:tcW w:type="dxa" w:w="1987"/>
-          </w:tcPr>
-          <w:p>
-            <w:pPr>
-              <w:jc w:val="left"/>
-            </w:pPr>
-            <w:r>
-              <w:rPr>
-                <w:rFonts w:ascii="TimeNewRoman" w:hAnsi="TimeNewRoman"/>
-                <w:sz w:val="30"/>
-              </w:rPr>
-              <w:t>80-39=</w:t>
-            </w:r>
-          </w:p>
-        </w:tc>
-        <w:tc>
-          <w:tcPr>
-            <w:tcW w:type="dxa" w:w="1987"/>
-          </w:tcPr>
-          <w:p>
-            <w:pPr>
-              <w:jc w:val="left"/>
-            </w:pPr>
-            <w:r>
-              <w:rPr>
-                <w:rFonts w:ascii="TimeNewRoman" w:hAnsi="TimeNewRoman"/>
-                <w:sz w:val="30"/>
-              </w:rPr>
-              <w:t>3+38=</w:t>
-            </w:r>
-          </w:p>
-        </w:tc>
-        <w:tc>
-          <w:tcPr>
-            <w:tcW w:type="dxa" w:w="1987"/>
-          </w:tcPr>
-          <w:p>
-            <w:pPr>
-              <w:jc w:val="left"/>
-            </w:pPr>
-            <w:r>
-              <w:rPr>
-                <w:rFonts w:ascii="TimeNewRoman" w:hAnsi="TimeNewRoman"/>
-                <w:sz w:val="30"/>
-              </w:rPr>
-              <w:t>43-8=</w:t>
-            </w:r>
-          </w:p>
-        </w:tc>
-        <w:tc>
-          <w:tcPr>
-            <w:tcW w:type="dxa" w:w="1987"/>
-          </w:tcPr>
-          <w:p>
-            <w:pPr>
-              <w:jc w:val="left"/>
-            </w:pPr>
-            <w:r>
-              <w:rPr>
-                <w:rFonts w:ascii="TimeNewRoman" w:hAnsi="TimeNewRoman"/>
-                <w:sz w:val="30"/>
-              </w:rPr>
-              <w:t>15+27=</w:t>
-            </w:r>
-          </w:p>
-        </w:tc>
-      </w:tr>
-      <w:tr>
-        <w:tc>
-          <w:tcPr>
-            <w:tcW w:type="dxa" w:w="1987"/>
-          </w:tcPr>
-          <w:p>
-            <w:pPr>
-              <w:jc w:val="left"/>
-            </w:pPr>
-            <w:r>
-              <w:rPr>
-                <w:rFonts w:ascii="TimeNewRoman" w:hAnsi="TimeNewRoman"/>
-                <w:sz w:val="30"/>
-              </w:rPr>
-              <w:t>62-27=</w:t>
-            </w:r>
-          </w:p>
-        </w:tc>
-        <w:tc>
-          <w:tcPr>
-            <w:tcW w:type="dxa" w:w="1987"/>
-          </w:tcPr>
-          <w:p>
-            <w:pPr>
-              <w:jc w:val="left"/>
-            </w:pPr>
-            <w:r>
-              <w:rPr>
-                <w:rFonts w:ascii="TimeNewRoman" w:hAnsi="TimeNewRoman"/>
-                <w:sz w:val="30"/>
-              </w:rPr>
-              <w:t>92-83=</w:t>
+              <w:t>47+24=</w:t>
             </w:r>
           </w:p>
         </w:tc>
@@ -1396,24 +804,7 @@
                 <w:rFonts w:ascii="TimeNewRoman" w:hAnsi="TimeNewRoman"/>
                 <w:sz w:val="30"/>
               </w:rPr>
-              <w:t>24-17=</w:t>
-            </w:r>
-          </w:p>
-        </w:tc>
-        <w:tc>
-          <w:tcPr>
-            <w:tcW w:type="dxa" w:w="1987"/>
-          </w:tcPr>
-          <w:p>
-            <w:pPr>
-              <w:jc w:val="left"/>
-            </w:pPr>
-            <w:r>
-              <w:rPr>
-                <w:rFonts w:ascii="TimeNewRoman" w:hAnsi="TimeNewRoman"/>
-                <w:sz w:val="30"/>
-              </w:rPr>
-              <w:t>28+46=</w:t>
+              <w:t>19+46=</w:t>
             </w:r>
           </w:p>
         </w:tc>
@@ -1432,7 +823,7 @@
                 <w:rFonts w:ascii="TimeNewRoman" w:hAnsi="TimeNewRoman"/>
                 <w:sz w:val="30"/>
               </w:rPr>
-              <w:t>60-49=</w:t>
+              <w:t>19+73=</w:t>
             </w:r>
           </w:p>
         </w:tc>
@@ -1449,7 +840,7 @@
                 <w:rFonts w:ascii="TimeNewRoman" w:hAnsi="TimeNewRoman"/>
                 <w:sz w:val="30"/>
               </w:rPr>
-              <w:t>29+44=</w:t>
+              <w:t>27+19=</w:t>
             </w:r>
           </w:p>
         </w:tc>
@@ -1466,7 +857,7 @@
                 <w:rFonts w:ascii="TimeNewRoman" w:hAnsi="TimeNewRoman"/>
                 <w:sz w:val="30"/>
               </w:rPr>
-              <w:t>88+5=</w:t>
+              <w:t>78+17=</w:t>
             </w:r>
           </w:p>
         </w:tc>
@@ -1483,7 +874,7 @@
                 <w:rFonts w:ascii="TimeNewRoman" w:hAnsi="TimeNewRoman"/>
                 <w:sz w:val="30"/>
               </w:rPr>
-              <w:t>66-7=</w:t>
+              <w:t>28+17=</w:t>
             </w:r>
           </w:p>
         </w:tc>
@@ -1500,7 +891,7 @@
                 <w:rFonts w:ascii="TimeNewRoman" w:hAnsi="TimeNewRoman"/>
                 <w:sz w:val="30"/>
               </w:rPr>
-              <w:t>95-79=</w:t>
+              <w:t>3+78=</w:t>
             </w:r>
           </w:p>
         </w:tc>
@@ -1519,7 +910,7 @@
                 <w:rFonts w:ascii="TimeNewRoman" w:hAnsi="TimeNewRoman"/>
                 <w:sz w:val="30"/>
               </w:rPr>
-              <w:t>39+52=</w:t>
+              <w:t>63-38=</w:t>
             </w:r>
           </w:p>
         </w:tc>
@@ -1536,7 +927,7 @@
                 <w:rFonts w:ascii="TimeNewRoman" w:hAnsi="TimeNewRoman"/>
                 <w:sz w:val="30"/>
               </w:rPr>
-              <w:t>8+86=</w:t>
+              <w:t>51-32=</w:t>
             </w:r>
           </w:p>
         </w:tc>
@@ -1553,7 +944,7 @@
                 <w:rFonts w:ascii="TimeNewRoman" w:hAnsi="TimeNewRoman"/>
                 <w:sz w:val="30"/>
               </w:rPr>
-              <w:t>6+29=</w:t>
+              <w:t>7+34=</w:t>
             </w:r>
           </w:p>
         </w:tc>
@@ -1570,7 +961,7 @@
                 <w:rFonts w:ascii="TimeNewRoman" w:hAnsi="TimeNewRoman"/>
                 <w:sz w:val="30"/>
               </w:rPr>
-              <w:t>91-5=</w:t>
+              <w:t>54-18=</w:t>
             </w:r>
           </w:p>
         </w:tc>
@@ -1587,7 +978,7 @@
                 <w:rFonts w:ascii="TimeNewRoman" w:hAnsi="TimeNewRoman"/>
                 <w:sz w:val="30"/>
               </w:rPr>
-              <w:t>93-24=</w:t>
+              <w:t>41-2=</w:t>
             </w:r>
           </w:p>
         </w:tc>
@@ -1606,7 +997,7 @@
                 <w:rFonts w:ascii="TimeNewRoman" w:hAnsi="TimeNewRoman"/>
                 <w:sz w:val="30"/>
               </w:rPr>
-              <w:t>56+38=</w:t>
+              <w:t>43-27=</w:t>
             </w:r>
           </w:p>
         </w:tc>
@@ -1623,7 +1014,7 @@
                 <w:rFonts w:ascii="TimeNewRoman" w:hAnsi="TimeNewRoman"/>
                 <w:sz w:val="30"/>
               </w:rPr>
-              <w:t>19+4=</w:t>
+              <w:t>56+15=</w:t>
             </w:r>
           </w:p>
         </w:tc>
@@ -1640,10 +1031,307 @@
                 <w:rFonts w:ascii="TimeNewRoman" w:hAnsi="TimeNewRoman"/>
                 <w:sz w:val="30"/>
               </w:rPr>
-              <w:t>49+25=</w:t>
+              <w:t>40-2=</w:t>
             </w:r>
           </w:p>
         </w:tc>
+        <w:tc>
+          <w:tcPr>
+            <w:tcW w:type="dxa" w:w="1987"/>
+          </w:tcPr>
+          <w:p>
+            <w:pPr>
+              <w:jc w:val="left"/>
+            </w:pPr>
+            <w:r>
+              <w:rPr>
+                <w:rFonts w:ascii="TimeNewRoman" w:hAnsi="TimeNewRoman"/>
+                <w:sz w:val="30"/>
+              </w:rPr>
+              <w:t>24+17=</w:t>
+            </w:r>
+          </w:p>
+        </w:tc>
+        <w:tc>
+          <w:tcPr>
+            <w:tcW w:type="dxa" w:w="1987"/>
+          </w:tcPr>
+          <w:p>
+            <w:pPr>
+              <w:jc w:val="left"/>
+            </w:pPr>
+            <w:r>
+              <w:rPr>
+                <w:rFonts w:ascii="TimeNewRoman" w:hAnsi="TimeNewRoman"/>
+                <w:sz w:val="30"/>
+              </w:rPr>
+              <w:t>29+53=</w:t>
+            </w:r>
+          </w:p>
+        </w:tc>
+      </w:tr>
+      <w:tr>
+        <w:tc>
+          <w:tcPr>
+            <w:tcW w:type="dxa" w:w="1987"/>
+          </w:tcPr>
+          <w:p>
+            <w:pPr>
+              <w:jc w:val="left"/>
+            </w:pPr>
+            <w:r>
+              <w:rPr>
+                <w:rFonts w:ascii="TimeNewRoman" w:hAnsi="TimeNewRoman"/>
+                <w:sz w:val="30"/>
+              </w:rPr>
+              <w:t>84+7=</w:t>
+            </w:r>
+          </w:p>
+        </w:tc>
+        <w:tc>
+          <w:tcPr>
+            <w:tcW w:type="dxa" w:w="1987"/>
+          </w:tcPr>
+          <w:p>
+            <w:pPr>
+              <w:jc w:val="left"/>
+            </w:pPr>
+            <w:r>
+              <w:rPr>
+                <w:rFonts w:ascii="TimeNewRoman" w:hAnsi="TimeNewRoman"/>
+                <w:sz w:val="30"/>
+              </w:rPr>
+              <w:t>42-37=</w:t>
+            </w:r>
+          </w:p>
+        </w:tc>
+        <w:tc>
+          <w:tcPr>
+            <w:tcW w:type="dxa" w:w="1987"/>
+          </w:tcPr>
+          <w:p>
+            <w:pPr>
+              <w:jc w:val="left"/>
+            </w:pPr>
+            <w:r>
+              <w:rPr>
+                <w:rFonts w:ascii="TimeNewRoman" w:hAnsi="TimeNewRoman"/>
+                <w:sz w:val="30"/>
+              </w:rPr>
+              <w:t>7+15=</w:t>
+            </w:r>
+          </w:p>
+        </w:tc>
+        <w:tc>
+          <w:tcPr>
+            <w:tcW w:type="dxa" w:w="1987"/>
+          </w:tcPr>
+          <w:p>
+            <w:pPr>
+              <w:jc w:val="left"/>
+            </w:pPr>
+            <w:r>
+              <w:rPr>
+                <w:rFonts w:ascii="TimeNewRoman" w:hAnsi="TimeNewRoman"/>
+                <w:sz w:val="30"/>
+              </w:rPr>
+              <w:t>25+16=</w:t>
+            </w:r>
+          </w:p>
+        </w:tc>
+        <w:tc>
+          <w:tcPr>
+            <w:tcW w:type="dxa" w:w="1987"/>
+          </w:tcPr>
+          <w:p>
+            <w:pPr>
+              <w:jc w:val="left"/>
+            </w:pPr>
+            <w:r>
+              <w:rPr>
+                <w:rFonts w:ascii="TimeNewRoman" w:hAnsi="TimeNewRoman"/>
+                <w:sz w:val="30"/>
+              </w:rPr>
+              <w:t>20-13=</w:t>
+            </w:r>
+          </w:p>
+        </w:tc>
+      </w:tr>
+      <w:tr>
+        <w:tc>
+          <w:tcPr>
+            <w:tcW w:type="dxa" w:w="1987"/>
+          </w:tcPr>
+          <w:p>
+            <w:pPr>
+              <w:jc w:val="left"/>
+            </w:pPr>
+            <w:r>
+              <w:rPr>
+                <w:rFonts w:ascii="TimeNewRoman" w:hAnsi="TimeNewRoman"/>
+                <w:sz w:val="30"/>
+              </w:rPr>
+              <w:t>60-56=</w:t>
+            </w:r>
+          </w:p>
+        </w:tc>
+        <w:tc>
+          <w:tcPr>
+            <w:tcW w:type="dxa" w:w="1987"/>
+          </w:tcPr>
+          <w:p>
+            <w:pPr>
+              <w:jc w:val="left"/>
+            </w:pPr>
+            <w:r>
+              <w:rPr>
+                <w:rFonts w:ascii="TimeNewRoman" w:hAnsi="TimeNewRoman"/>
+                <w:sz w:val="30"/>
+              </w:rPr>
+              <w:t>82-79=</w:t>
+            </w:r>
+          </w:p>
+        </w:tc>
+        <w:tc>
+          <w:tcPr>
+            <w:tcW w:type="dxa" w:w="1987"/>
+          </w:tcPr>
+          <w:p>
+            <w:pPr>
+              <w:jc w:val="left"/>
+            </w:pPr>
+            <w:r>
+              <w:rPr>
+                <w:rFonts w:ascii="TimeNewRoman" w:hAnsi="TimeNewRoman"/>
+                <w:sz w:val="30"/>
+              </w:rPr>
+              <w:t>81-56=</w:t>
+            </w:r>
+          </w:p>
+        </w:tc>
+        <w:tc>
+          <w:tcPr>
+            <w:tcW w:type="dxa" w:w="1987"/>
+          </w:tcPr>
+          <w:p>
+            <w:pPr>
+              <w:jc w:val="left"/>
+            </w:pPr>
+            <w:r>
+              <w:rPr>
+                <w:rFonts w:ascii="TimeNewRoman" w:hAnsi="TimeNewRoman"/>
+                <w:sz w:val="30"/>
+              </w:rPr>
+              <w:t>19+8=</w:t>
+            </w:r>
+          </w:p>
+        </w:tc>
+        <w:tc>
+          <w:tcPr>
+            <w:tcW w:type="dxa" w:w="1987"/>
+          </w:tcPr>
+          <w:p>
+            <w:pPr>
+              <w:jc w:val="left"/>
+            </w:pPr>
+            <w:r>
+              <w:rPr>
+                <w:rFonts w:ascii="TimeNewRoman" w:hAnsi="TimeNewRoman"/>
+                <w:sz w:val="30"/>
+              </w:rPr>
+              <w:t>52-18=</w:t>
+            </w:r>
+          </w:p>
+        </w:tc>
+      </w:tr>
+      <w:tr>
+        <w:tc>
+          <w:tcPr>
+            <w:tcW w:type="dxa" w:w="1987"/>
+          </w:tcPr>
+          <w:p>
+            <w:pPr>
+              <w:jc w:val="left"/>
+            </w:pPr>
+            <w:r>
+              <w:rPr>
+                <w:rFonts w:ascii="TimeNewRoman" w:hAnsi="TimeNewRoman"/>
+                <w:sz w:val="30"/>
+              </w:rPr>
+              <w:t>39+25=</w:t>
+            </w:r>
+          </w:p>
+        </w:tc>
+        <w:tc>
+          <w:tcPr>
+            <w:tcW w:type="dxa" w:w="1987"/>
+          </w:tcPr>
+          <w:p>
+            <w:pPr>
+              <w:jc w:val="left"/>
+            </w:pPr>
+            <w:r>
+              <w:rPr>
+                <w:rFonts w:ascii="TimeNewRoman" w:hAnsi="TimeNewRoman"/>
+                <w:sz w:val="30"/>
+              </w:rPr>
+              <w:t>48+18=</w:t>
+            </w:r>
+          </w:p>
+        </w:tc>
+        <w:tc>
+          <w:tcPr>
+            <w:tcW w:type="dxa" w:w="1987"/>
+          </w:tcPr>
+          <w:p>
+            <w:pPr>
+              <w:jc w:val="left"/>
+            </w:pPr>
+            <w:r>
+              <w:rPr>
+                <w:rFonts w:ascii="TimeNewRoman" w:hAnsi="TimeNewRoman"/>
+                <w:sz w:val="30"/>
+              </w:rPr>
+              <w:t>57+25=</w:t>
+            </w:r>
+          </w:p>
+        </w:tc>
+        <w:tc>
+          <w:tcPr>
+            <w:tcW w:type="dxa" w:w="1987"/>
+          </w:tcPr>
+          <w:p>
+            <w:pPr>
+              <w:jc w:val="left"/>
+            </w:pPr>
+            <w:r>
+              <w:rPr>
+                <w:rFonts w:ascii="TimeNewRoman" w:hAnsi="TimeNewRoman"/>
+                <w:sz w:val="30"/>
+              </w:rPr>
+              <w:t>98-9=</w:t>
+            </w:r>
+          </w:p>
+        </w:tc>
+        <w:tc>
+          <w:tcPr>
+            <w:tcW w:type="dxa" w:w="1987"/>
+          </w:tcPr>
+          <w:p>
+            <w:pPr>
+              <w:jc w:val="left"/>
+            </w:pPr>
+            <w:r>
+              <w:rPr>
+                <w:rFonts w:ascii="TimeNewRoman" w:hAnsi="TimeNewRoman"/>
+                <w:sz w:val="30"/>
+              </w:rPr>
+              <w:t>7+58=</w:t>
+            </w:r>
+          </w:p>
+        </w:tc>
+      </w:tr>
+      <w:tr>
         <w:tc>
           <w:tcPr>
             <w:tcW w:type="dxa" w:w="1987"/>
@@ -1674,7 +1362,58 @@
                 <w:rFonts w:ascii="TimeNewRoman" w:hAnsi="TimeNewRoman"/>
                 <w:sz w:val="30"/>
               </w:rPr>
-              <w:t>90-23=</w:t>
+              <w:t>31-7=</w:t>
+            </w:r>
+          </w:p>
+        </w:tc>
+        <w:tc>
+          <w:tcPr>
+            <w:tcW w:type="dxa" w:w="1987"/>
+          </w:tcPr>
+          <w:p>
+            <w:pPr>
+              <w:jc w:val="left"/>
+            </w:pPr>
+            <w:r>
+              <w:rPr>
+                <w:rFonts w:ascii="TimeNewRoman" w:hAnsi="TimeNewRoman"/>
+                <w:sz w:val="30"/>
+              </w:rPr>
+              <w:t>56+26=</w:t>
+            </w:r>
+          </w:p>
+        </w:tc>
+        <w:tc>
+          <w:tcPr>
+            <w:tcW w:type="dxa" w:w="1987"/>
+          </w:tcPr>
+          <w:p>
+            <w:pPr>
+              <w:jc w:val="left"/>
+            </w:pPr>
+            <w:r>
+              <w:rPr>
+                <w:rFonts w:ascii="TimeNewRoman" w:hAnsi="TimeNewRoman"/>
+                <w:sz w:val="30"/>
+              </w:rPr>
+              <w:t>78+14=</w:t>
+            </w:r>
+          </w:p>
+        </w:tc>
+        <w:tc>
+          <w:tcPr>
+            <w:tcW w:type="dxa" w:w="1987"/>
+          </w:tcPr>
+          <w:p>
+            <w:pPr>
+              <w:jc w:val="left"/>
+            </w:pPr>
+            <w:r>
+              <w:rPr>
+                <w:rFonts w:ascii="TimeNewRoman" w:hAnsi="TimeNewRoman"/>
+                <w:sz w:val="30"/>
+              </w:rPr>
+              <w:t>9+14=</w:t>
             </w:r>
           </w:p>
         </w:tc>
@@ -1693,7 +1432,7 @@
                 <w:rFonts w:ascii="TimeNewRoman" w:hAnsi="TimeNewRoman"/>
                 <w:sz w:val="30"/>
               </w:rPr>
-              <w:t>82-13=</w:t>
+              <w:t>6+69=</w:t>
             </w:r>
           </w:p>
         </w:tc>
@@ -1710,7 +1449,7 @@
                 <w:rFonts w:ascii="TimeNewRoman" w:hAnsi="TimeNewRoman"/>
                 <w:sz w:val="30"/>
               </w:rPr>
-              <w:t>53-15=</w:t>
+              <w:t>59+6=</w:t>
             </w:r>
           </w:p>
         </w:tc>
@@ -1727,7 +1466,7 @@
                 <w:rFonts w:ascii="TimeNewRoman" w:hAnsi="TimeNewRoman"/>
                 <w:sz w:val="30"/>
               </w:rPr>
-              <w:t>75-37=</w:t>
+              <w:t>12+9=</w:t>
             </w:r>
           </w:p>
         </w:tc>
@@ -1744,7 +1483,7 @@
                 <w:rFonts w:ascii="TimeNewRoman" w:hAnsi="TimeNewRoman"/>
                 <w:sz w:val="30"/>
               </w:rPr>
-              <w:t>29+44=</w:t>
+              <w:t>73-38=</w:t>
             </w:r>
           </w:p>
         </w:tc>
@@ -1761,7 +1500,268 @@
                 <w:rFonts w:ascii="TimeNewRoman" w:hAnsi="TimeNewRoman"/>
                 <w:sz w:val="30"/>
               </w:rPr>
-              <w:t>71-54=</w:t>
+              <w:t>47+14=</w:t>
+            </w:r>
+          </w:p>
+        </w:tc>
+      </w:tr>
+      <w:tr>
+        <w:tc>
+          <w:tcPr>
+            <w:tcW w:type="dxa" w:w="1987"/>
+          </w:tcPr>
+          <w:p>
+            <w:pPr>
+              <w:jc w:val="left"/>
+            </w:pPr>
+            <w:r>
+              <w:rPr>
+                <w:rFonts w:ascii="TimeNewRoman" w:hAnsi="TimeNewRoman"/>
+                <w:sz w:val="30"/>
+              </w:rPr>
+              <w:t>36+48=</w:t>
+            </w:r>
+          </w:p>
+        </w:tc>
+        <w:tc>
+          <w:tcPr>
+            <w:tcW w:type="dxa" w:w="1987"/>
+          </w:tcPr>
+          <w:p>
+            <w:pPr>
+              <w:jc w:val="left"/>
+            </w:pPr>
+            <w:r>
+              <w:rPr>
+                <w:rFonts w:ascii="TimeNewRoman" w:hAnsi="TimeNewRoman"/>
+                <w:sz w:val="30"/>
+              </w:rPr>
+              <w:t>28+18=</w:t>
+            </w:r>
+          </w:p>
+        </w:tc>
+        <w:tc>
+          <w:tcPr>
+            <w:tcW w:type="dxa" w:w="1987"/>
+          </w:tcPr>
+          <w:p>
+            <w:pPr>
+              <w:jc w:val="left"/>
+            </w:pPr>
+            <w:r>
+              <w:rPr>
+                <w:rFonts w:ascii="TimeNewRoman" w:hAnsi="TimeNewRoman"/>
+                <w:sz w:val="30"/>
+              </w:rPr>
+              <w:t>28+48=</w:t>
+            </w:r>
+          </w:p>
+        </w:tc>
+        <w:tc>
+          <w:tcPr>
+            <w:tcW w:type="dxa" w:w="1987"/>
+          </w:tcPr>
+          <w:p>
+            <w:pPr>
+              <w:jc w:val="left"/>
+            </w:pPr>
+            <w:r>
+              <w:rPr>
+                <w:rFonts w:ascii="TimeNewRoman" w:hAnsi="TimeNewRoman"/>
+                <w:sz w:val="30"/>
+              </w:rPr>
+              <w:t>60-53=</w:t>
+            </w:r>
+          </w:p>
+        </w:tc>
+        <w:tc>
+          <w:tcPr>
+            <w:tcW w:type="dxa" w:w="1987"/>
+          </w:tcPr>
+          <w:p>
+            <w:pPr>
+              <w:jc w:val="left"/>
+            </w:pPr>
+            <w:r>
+              <w:rPr>
+                <w:rFonts w:ascii="TimeNewRoman" w:hAnsi="TimeNewRoman"/>
+                <w:sz w:val="30"/>
+              </w:rPr>
+              <w:t>36+39=</w:t>
+            </w:r>
+          </w:p>
+        </w:tc>
+      </w:tr>
+      <w:tr>
+        <w:tc>
+          <w:tcPr>
+            <w:tcW w:type="dxa" w:w="1987"/>
+          </w:tcPr>
+          <w:p>
+            <w:pPr>
+              <w:jc w:val="left"/>
+            </w:pPr>
+            <w:r>
+              <w:rPr>
+                <w:rFonts w:ascii="TimeNewRoman" w:hAnsi="TimeNewRoman"/>
+                <w:sz w:val="30"/>
+              </w:rPr>
+              <w:t>6+26=</w:t>
+            </w:r>
+          </w:p>
+        </w:tc>
+        <w:tc>
+          <w:tcPr>
+            <w:tcW w:type="dxa" w:w="1987"/>
+          </w:tcPr>
+          <w:p>
+            <w:pPr>
+              <w:jc w:val="left"/>
+            </w:pPr>
+            <w:r>
+              <w:rPr>
+                <w:rFonts w:ascii="TimeNewRoman" w:hAnsi="TimeNewRoman"/>
+                <w:sz w:val="30"/>
+              </w:rPr>
+              <w:t>32-19=</w:t>
+            </w:r>
+          </w:p>
+        </w:tc>
+        <w:tc>
+          <w:tcPr>
+            <w:tcW w:type="dxa" w:w="1987"/>
+          </w:tcPr>
+          <w:p>
+            <w:pPr>
+              <w:jc w:val="left"/>
+            </w:pPr>
+            <w:r>
+              <w:rPr>
+                <w:rFonts w:ascii="TimeNewRoman" w:hAnsi="TimeNewRoman"/>
+                <w:sz w:val="30"/>
+              </w:rPr>
+              <w:t>48+8=</w:t>
+            </w:r>
+          </w:p>
+        </w:tc>
+        <w:tc>
+          <w:tcPr>
+            <w:tcW w:type="dxa" w:w="1987"/>
+          </w:tcPr>
+          <w:p>
+            <w:pPr>
+              <w:jc w:val="left"/>
+            </w:pPr>
+            <w:r>
+              <w:rPr>
+                <w:rFonts w:ascii="TimeNewRoman" w:hAnsi="TimeNewRoman"/>
+                <w:sz w:val="30"/>
+              </w:rPr>
+              <w:t>73-37=</w:t>
+            </w:r>
+          </w:p>
+        </w:tc>
+        <w:tc>
+          <w:tcPr>
+            <w:tcW w:type="dxa" w:w="1987"/>
+          </w:tcPr>
+          <w:p>
+            <w:pPr>
+              <w:jc w:val="left"/>
+            </w:pPr>
+            <w:r>
+              <w:rPr>
+                <w:rFonts w:ascii="TimeNewRoman" w:hAnsi="TimeNewRoman"/>
+                <w:sz w:val="30"/>
+              </w:rPr>
+              <w:t>26+47=</w:t>
+            </w:r>
+          </w:p>
+        </w:tc>
+      </w:tr>
+      <w:tr>
+        <w:tc>
+          <w:tcPr>
+            <w:tcW w:type="dxa" w:w="1987"/>
+          </w:tcPr>
+          <w:p>
+            <w:pPr>
+              <w:jc w:val="left"/>
+            </w:pPr>
+            <w:r>
+              <w:rPr>
+                <w:rFonts w:ascii="TimeNewRoman" w:hAnsi="TimeNewRoman"/>
+                <w:sz w:val="30"/>
+              </w:rPr>
+              <w:t>27-18=</w:t>
+            </w:r>
+          </w:p>
+        </w:tc>
+        <w:tc>
+          <w:tcPr>
+            <w:tcW w:type="dxa" w:w="1987"/>
+          </w:tcPr>
+          <w:p>
+            <w:pPr>
+              <w:jc w:val="left"/>
+            </w:pPr>
+            <w:r>
+              <w:rPr>
+                <w:rFonts w:ascii="TimeNewRoman" w:hAnsi="TimeNewRoman"/>
+                <w:sz w:val="30"/>
+              </w:rPr>
+              <w:t>82-74=</w:t>
+            </w:r>
+          </w:p>
+        </w:tc>
+        <w:tc>
+          <w:tcPr>
+            <w:tcW w:type="dxa" w:w="1987"/>
+          </w:tcPr>
+          <w:p>
+            <w:pPr>
+              <w:jc w:val="left"/>
+            </w:pPr>
+            <w:r>
+              <w:rPr>
+                <w:rFonts w:ascii="TimeNewRoman" w:hAnsi="TimeNewRoman"/>
+                <w:sz w:val="30"/>
+              </w:rPr>
+              <w:t>59+12=</w:t>
+            </w:r>
+          </w:p>
+        </w:tc>
+        <w:tc>
+          <w:tcPr>
+            <w:tcW w:type="dxa" w:w="1987"/>
+          </w:tcPr>
+          <w:p>
+            <w:pPr>
+              <w:jc w:val="left"/>
+            </w:pPr>
+            <w:r>
+              <w:rPr>
+                <w:rFonts w:ascii="TimeNewRoman" w:hAnsi="TimeNewRoman"/>
+                <w:sz w:val="30"/>
+              </w:rPr>
+              <w:t>90-71=</w:t>
+            </w:r>
+          </w:p>
+        </w:tc>
+        <w:tc>
+          <w:tcPr>
+            <w:tcW w:type="dxa" w:w="1987"/>
+          </w:tcPr>
+          <w:p>
+            <w:pPr>
+              <w:jc w:val="left"/>
+            </w:pPr>
+            <w:r>
+              <w:rPr>
+                <w:rFonts w:ascii="TimeNewRoman" w:hAnsi="TimeNewRoman"/>
+                <w:sz w:val="30"/>
+              </w:rPr>
+              <w:t>98-49=</w:t>
             </w:r>
           </w:p>
         </w:tc>

</xml_diff>